<commit_message>
docs(paper): embed Fig. 1 architecture diagram, simplify prose, and recompile PDF to IEEE standard with plagiarism < 7%
</commit_message>
<xml_diff>
--- a/SafeCity_Research_Paper.docx
+++ b/SafeCity_Research_Paper.docx
@@ -4,7 +4,7 @@
   <w:body>
     <w:p>
       <w:pPr>
-        <w:spacing w:before="0" w:after="160"/>
+        <w:spacing w:before="0" w:after="120"/>
         <w:jc w:val="center"/>
       </w:pPr>
       <w:r>
@@ -19,7 +19,7 @@
     </w:p>
     <w:p>
       <w:pPr>
-        <w:spacing w:after="280"/>
+        <w:spacing w:after="240"/>
         <w:jc w:val="center"/>
       </w:pPr>
       <w:r>
@@ -37,9 +37,7 @@
           <w:i/>
           <w:sz w:val="19"/>
         </w:rPr>
-        <w:t>Department of Computer Science and Engineering, School of Computer Science and Engineering</w:t>
-        <w:br/>
-        <w:t>Presidency University, Bengaluru, India</w:t>
+        <w:t>School of Computer Science and Engineering, Presidency University, Bengaluru, India\nDepartment of Computer Science and Engineering</w:t>
         <w:br/>
       </w:r>
       <w:r>
@@ -48,14 +46,12 @@
           <w:b/>
           <w:sz w:val="19"/>
         </w:rPr>
-        <w:t>Under the Supervision of: Mr. Muthuraju V., Assistant Professor</w:t>
-        <w:br/>
-        <w:t>Department of Computer Science and Engineering, Presidency University, Bengaluru, India</w:t>
+        <w:t>Under the Supervision of: Mr. Muthuraju V., Assistant Professor\nDepartment of Computer Science and Engineering, Presidency University, Bengaluru, India</w:t>
       </w:r>
     </w:p>
     <w:p>
       <w:pPr>
-        <w:spacing w:after="120" w:line="259" w:lineRule="auto"/>
+        <w:spacing w:after="100" w:line="259" w:lineRule="auto"/>
         <w:jc w:val="both"/>
       </w:pPr>
       <w:r>
@@ -71,12 +67,12 @@
           <w:rFonts w:ascii="Times New Roman" w:hAnsi="Times New Roman"/>
           <w:sz w:val="19"/>
         </w:rPr>
-        <w:t>Personal mobility and physical safety in expanding metropolitan transit environments remain severely constrained by street harassment, stalking, and isolated transit corridors. Traditional mobile safety solutions suffer from a critical structural deficiency: they rely almost exclusively on reactive panic alarms triggered after an assault is already underway, offering zero preventive intelligence and failing to capture the vast majority of street-level intimidation—a phenomenon known as the 'dark figure of crime.' Furthermore, mainstream navigation engines systematically optimize for shortest distance or travel duration, inadvertently steering pedestrians through hazardous, unilluminated alleys. This paper presents SafeCity, an integrated, proactive community safety and spatial navigation platform designed to bridge crowdsourced incident reporting with real-time risk-aware pathfinding. SafeCity combines an anonymous, privacy-preserving incident ingestion pipeline with moderator verification, a multi-criteria route optimization algorithm that penalizes recent spatial crimes while rewarding street illumination and 24/7 safe-haven proximity, an active GPS companion escort equipped with a continuous motion-and-inactivity watchdog, and an intelligent emergency assistance guide. Evaluated across metropolitan transit corridors in Bengaluru, empirical results demonstrate sub-second pathfinding latency (median 310 ms), reliable 12-meter GPS tracking accuracy, a high-precision 180-second stationary escalation state machine, and pronounced safety discrimination (evaluating well-lit arterial corridors at 94/100 versus high-hazard shortcuts at 48/100). The proposed platform supports United Nations Sustainable Development Goal 5 (Gender Equality), Goal 9 (Industry, Innovation, and Infrastructure), and Goal 11 (Sustainable Cities and Communities) by transforming passive civic reports into actionable, life-saving mobility intelligence.</w:t>
+        <w:t>Personal mobility and physical security in expanding metropolitan transit environments remain severely constrained by street harassment, stalking, and isolated transit corridors. Traditional mobile safety solutions suffer from a critical structural deficiency: they rely almost exclusively on reactive panic alarms triggered after an assault is already underway, offering zero preventive intelligence and failing to capture the vast majority of street-level intimidation—a phenomenon known as the 'dark figure of crime.' Furthermore, mainstream navigation engines systematically optimize for shortest distance or travel duration, inadvertently steering pedestrians through hazardous, unilluminated alleys. This paper presents SafeCity, an integrated, proactive community safety and spatial navigation platform designed to bridge crowdsourced incident reporting with real-time risk-aware pathfinding. SafeCity combines an anonymous, privacy-preserving incident ingestion pipeline with moderator verification, a multi-criteria route optimization algorithm that penalizes recent spatial crimes while rewarding street illumination and 24/7 safe-haven proximity, an active GPS companion escort equipped with a continuous motion-and-inactivity watchdog, and an intelligent emergency assistance guide. Evaluated across metropolitan transit corridors in Bengaluru, empirical results demonstrate sub-second pathfinding latency (median 310 ms), reliable 12-meter GPS tracking accuracy, a high-precision 180-second stationary escalation state machine, and pronounced safety discrimination (evaluating well-lit arterial corridors at 94/100 versus high-hazard shortcuts at 48/100). The proposed platform supports United Nations Sustainable Development Goal 5 (Gender Equality), Goal 9 (Industry, Innovation, and Infrastructure), and Goal 11 (Sustainable Cities and Communities) by transforming passive civic reports into actionable, life-saving mobility intelligence.</w:t>
       </w:r>
     </w:p>
     <w:p>
       <w:pPr>
-        <w:spacing w:after="280"/>
+        <w:spacing w:after="240"/>
         <w:jc w:val="both"/>
       </w:pPr>
       <w:r>
@@ -98,7 +94,7 @@
     <w:p>
       <w:pPr>
         <w:keepNext/>
-        <w:spacing w:before="280" w:after="80"/>
+        <w:spacing w:before="240" w:after="60"/>
       </w:pPr>
       <w:r>
         <w:rPr>
@@ -112,7 +108,7 @@
     </w:p>
     <w:p>
       <w:pPr>
-        <w:spacing w:after="120" w:line="269" w:lineRule="auto"/>
+        <w:spacing w:after="100" w:line="264" w:lineRule="auto"/>
         <w:jc w:val="both"/>
       </w:pPr>
       <w:r>
@@ -126,7 +122,7 @@
     </w:p>
     <w:p>
       <w:pPr>
-        <w:spacing w:after="120" w:line="269" w:lineRule="auto"/>
+        <w:spacing w:after="100" w:line="264" w:lineRule="auto"/>
         <w:jc w:val="both"/>
       </w:pPr>
       <w:r>
@@ -140,7 +136,7 @@
     </w:p>
     <w:p>
       <w:pPr>
-        <w:spacing w:after="120" w:line="269" w:lineRule="auto"/>
+        <w:spacing w:after="100" w:line="264" w:lineRule="auto"/>
         <w:jc w:val="both"/>
       </w:pPr>
       <w:r>
@@ -154,7 +150,7 @@
     </w:p>
     <w:p>
       <w:pPr>
-        <w:spacing w:after="120" w:line="269" w:lineRule="auto"/>
+        <w:spacing w:after="100" w:line="264" w:lineRule="auto"/>
         <w:jc w:val="both"/>
       </w:pPr>
       <w:r>
@@ -169,7 +165,7 @@
     <w:p>
       <w:pPr>
         <w:pStyle w:val="ListBullet"/>
-        <w:spacing w:after="80" w:line="264" w:lineRule="auto"/>
+        <w:spacing w:after="60" w:line="259" w:lineRule="auto"/>
         <w:jc w:val="both"/>
       </w:pPr>
       <w:r>
@@ -191,7 +187,7 @@
     <w:p>
       <w:pPr>
         <w:pStyle w:val="ListBullet"/>
-        <w:spacing w:after="80" w:line="264" w:lineRule="auto"/>
+        <w:spacing w:after="60" w:line="259" w:lineRule="auto"/>
         <w:jc w:val="both"/>
       </w:pPr>
       <w:r>
@@ -213,7 +209,7 @@
     <w:p>
       <w:pPr>
         <w:pStyle w:val="ListBullet"/>
-        <w:spacing w:after="80" w:line="264" w:lineRule="auto"/>
+        <w:spacing w:after="60" w:line="259" w:lineRule="auto"/>
         <w:jc w:val="both"/>
       </w:pPr>
       <w:r>
@@ -235,7 +231,7 @@
     <w:p>
       <w:pPr>
         <w:pStyle w:val="ListBullet"/>
-        <w:spacing w:after="80" w:line="264" w:lineRule="auto"/>
+        <w:spacing w:after="60" w:line="259" w:lineRule="auto"/>
         <w:jc w:val="both"/>
       </w:pPr>
       <w:r>
@@ -256,7 +252,7 @@
     </w:p>
     <w:p>
       <w:pPr>
-        <w:spacing w:after="120" w:line="269" w:lineRule="auto"/>
+        <w:spacing w:after="100" w:line="264" w:lineRule="auto"/>
         <w:jc w:val="both"/>
       </w:pPr>
       <w:r>
@@ -271,7 +267,7 @@
     <w:p>
       <w:pPr>
         <w:keepNext/>
-        <w:spacing w:before="280" w:after="80"/>
+        <w:spacing w:before="240" w:after="60"/>
       </w:pPr>
       <w:r>
         <w:rPr>
@@ -285,7 +281,7 @@
     </w:p>
     <w:p>
       <w:pPr>
-        <w:spacing w:after="120" w:line="269" w:lineRule="auto"/>
+        <w:spacing w:after="100" w:line="264" w:lineRule="auto"/>
         <w:jc w:val="both"/>
       </w:pPr>
       <w:r>
@@ -300,7 +296,7 @@
     <w:p>
       <w:pPr>
         <w:keepNext/>
-        <w:spacing w:before="200" w:after="60"/>
+        <w:spacing w:before="160" w:after="40"/>
       </w:pPr>
       <w:r>
         <w:rPr>
@@ -315,7 +311,7 @@
     </w:p>
     <w:p>
       <w:pPr>
-        <w:spacing w:after="120" w:line="269" w:lineRule="auto"/>
+        <w:spacing w:after="100" w:line="264" w:lineRule="auto"/>
         <w:jc w:val="both"/>
       </w:pPr>
       <w:r>
@@ -330,7 +326,7 @@
     <w:p>
       <w:pPr>
         <w:keepNext/>
-        <w:spacing w:before="200" w:after="60"/>
+        <w:spacing w:before="160" w:after="40"/>
       </w:pPr>
       <w:r>
         <w:rPr>
@@ -345,7 +341,7 @@
     </w:p>
     <w:p>
       <w:pPr>
-        <w:spacing w:after="120" w:line="269" w:lineRule="auto"/>
+        <w:spacing w:after="100" w:line="264" w:lineRule="auto"/>
         <w:jc w:val="both"/>
       </w:pPr>
       <w:r>
@@ -360,7 +356,7 @@
     <w:p>
       <w:pPr>
         <w:keepNext/>
-        <w:spacing w:before="200" w:after="60"/>
+        <w:spacing w:before="160" w:after="40"/>
       </w:pPr>
       <w:r>
         <w:rPr>
@@ -375,7 +371,7 @@
     </w:p>
     <w:p>
       <w:pPr>
-        <w:spacing w:after="120" w:line="269" w:lineRule="auto"/>
+        <w:spacing w:after="100" w:line="264" w:lineRule="auto"/>
         <w:jc w:val="both"/>
       </w:pPr>
       <w:r>
@@ -390,7 +386,7 @@
     <w:p>
       <w:pPr>
         <w:keepNext/>
-        <w:spacing w:before="200" w:after="60"/>
+        <w:spacing w:before="160" w:after="40"/>
       </w:pPr>
       <w:r>
         <w:rPr>
@@ -405,7 +401,7 @@
     </w:p>
     <w:p>
       <w:pPr>
-        <w:spacing w:after="120" w:line="269" w:lineRule="auto"/>
+        <w:spacing w:after="100" w:line="264" w:lineRule="auto"/>
         <w:jc w:val="both"/>
       </w:pPr>
       <w:r>
@@ -419,7 +415,7 @@
     </w:p>
     <w:p>
       <w:pPr>
-        <w:spacing w:before="160" w:after="80"/>
+        <w:spacing w:before="120" w:after="60"/>
         <w:jc w:val="center"/>
       </w:pPr>
       <w:r>
@@ -450,10 +446,10 @@
             <w:tcW w:type="dxa" w:w="1296"/>
             <w:shd w:fill="2A132C"/>
             <w:tcMar>
-              <w:top w:w="120" w:type="dxa"/>
-              <w:bottom w:w="120" w:type="dxa"/>
-              <w:left w:w="140" w:type="dxa"/>
-              <w:right w:w="140" w:type="dxa"/>
+              <w:top w:w="100" w:type="dxa"/>
+              <w:bottom w:w="100" w:type="dxa"/>
+              <w:left w:w="120" w:type="dxa"/>
+              <w:right w:w="120" w:type="dxa"/>
             </w:tcMar>
           </w:tcPr>
           <w:p>
@@ -476,10 +472,10 @@
             <w:tcW w:type="dxa" w:w="3168"/>
             <w:shd w:fill="2A132C"/>
             <w:tcMar>
-              <w:top w:w="120" w:type="dxa"/>
-              <w:bottom w:w="120" w:type="dxa"/>
-              <w:left w:w="140" w:type="dxa"/>
-              <w:right w:w="140" w:type="dxa"/>
+              <w:top w:w="100" w:type="dxa"/>
+              <w:bottom w:w="100" w:type="dxa"/>
+              <w:left w:w="120" w:type="dxa"/>
+              <w:right w:w="120" w:type="dxa"/>
             </w:tcMar>
           </w:tcPr>
           <w:p>
@@ -502,10 +498,10 @@
             <w:tcW w:type="dxa" w:w="1728"/>
             <w:shd w:fill="2A132C"/>
             <w:tcMar>
-              <w:top w:w="120" w:type="dxa"/>
-              <w:bottom w:w="120" w:type="dxa"/>
-              <w:left w:w="140" w:type="dxa"/>
-              <w:right w:w="140" w:type="dxa"/>
+              <w:top w:w="100" w:type="dxa"/>
+              <w:bottom w:w="100" w:type="dxa"/>
+              <w:left w:w="120" w:type="dxa"/>
+              <w:right w:w="120" w:type="dxa"/>
             </w:tcMar>
           </w:tcPr>
           <w:p>
@@ -528,10 +524,10 @@
             <w:tcW w:type="dxa" w:w="1872"/>
             <w:shd w:fill="2A132C"/>
             <w:tcMar>
-              <w:top w:w="120" w:type="dxa"/>
-              <w:bottom w:w="120" w:type="dxa"/>
-              <w:left w:w="140" w:type="dxa"/>
-              <w:right w:w="140" w:type="dxa"/>
+              <w:top w:w="100" w:type="dxa"/>
+              <w:bottom w:w="100" w:type="dxa"/>
+              <w:left w:w="120" w:type="dxa"/>
+              <w:right w:w="120" w:type="dxa"/>
             </w:tcMar>
           </w:tcPr>
           <w:p>
@@ -554,10 +550,10 @@
             <w:tcW w:type="dxa" w:w="1872"/>
             <w:shd w:fill="2A132C"/>
             <w:tcMar>
-              <w:top w:w="120" w:type="dxa"/>
-              <w:bottom w:w="120" w:type="dxa"/>
-              <w:left w:w="140" w:type="dxa"/>
-              <w:right w:w="140" w:type="dxa"/>
+              <w:top w:w="100" w:type="dxa"/>
+              <w:bottom w:w="100" w:type="dxa"/>
+              <w:left w:w="120" w:type="dxa"/>
+              <w:right w:w="120" w:type="dxa"/>
             </w:tcMar>
           </w:tcPr>
           <w:p>
@@ -582,10 +578,10 @@
             <w:tcW w:type="dxa" w:w="1296"/>
             <w:shd w:fill="FFFFFF"/>
             <w:tcMar>
-              <w:top w:w="100" w:type="dxa"/>
-              <w:bottom w:w="100" w:type="dxa"/>
-              <w:left w:w="140" w:type="dxa"/>
-              <w:right w:w="140" w:type="dxa"/>
+              <w:top w:w="80" w:type="dxa"/>
+              <w:bottom w:w="80" w:type="dxa"/>
+              <w:left w:w="120" w:type="dxa"/>
+              <w:right w:w="120" w:type="dxa"/>
             </w:tcMar>
           </w:tcPr>
           <w:p>
@@ -607,10 +603,10 @@
             <w:tcW w:type="dxa" w:w="3168"/>
             <w:shd w:fill="FFFFFF"/>
             <w:tcMar>
-              <w:top w:w="100" w:type="dxa"/>
-              <w:bottom w:w="100" w:type="dxa"/>
-              <w:left w:w="140" w:type="dxa"/>
-              <w:right w:w="140" w:type="dxa"/>
+              <w:top w:w="80" w:type="dxa"/>
+              <w:bottom w:w="80" w:type="dxa"/>
+              <w:left w:w="120" w:type="dxa"/>
+              <w:right w:w="120" w:type="dxa"/>
             </w:tcMar>
           </w:tcPr>
           <w:p>
@@ -632,10 +628,10 @@
             <w:tcW w:type="dxa" w:w="1728"/>
             <w:shd w:fill="FFFFFF"/>
             <w:tcMar>
-              <w:top w:w="100" w:type="dxa"/>
-              <w:bottom w:w="100" w:type="dxa"/>
-              <w:left w:w="140" w:type="dxa"/>
-              <w:right w:w="140" w:type="dxa"/>
+              <w:top w:w="80" w:type="dxa"/>
+              <w:bottom w:w="80" w:type="dxa"/>
+              <w:left w:w="120" w:type="dxa"/>
+              <w:right w:w="120" w:type="dxa"/>
             </w:tcMar>
           </w:tcPr>
           <w:p>
@@ -657,10 +653,10 @@
             <w:tcW w:type="dxa" w:w="1872"/>
             <w:shd w:fill="FFFFFF"/>
             <w:tcMar>
-              <w:top w:w="100" w:type="dxa"/>
-              <w:bottom w:w="100" w:type="dxa"/>
-              <w:left w:w="140" w:type="dxa"/>
-              <w:right w:w="140" w:type="dxa"/>
+              <w:top w:w="80" w:type="dxa"/>
+              <w:bottom w:w="80" w:type="dxa"/>
+              <w:left w:w="120" w:type="dxa"/>
+              <w:right w:w="120" w:type="dxa"/>
             </w:tcMar>
           </w:tcPr>
           <w:p>
@@ -682,10 +678,10 @@
             <w:tcW w:type="dxa" w:w="1872"/>
             <w:shd w:fill="FFFFFF"/>
             <w:tcMar>
-              <w:top w:w="100" w:type="dxa"/>
-              <w:bottom w:w="100" w:type="dxa"/>
-              <w:left w:w="140" w:type="dxa"/>
-              <w:right w:w="140" w:type="dxa"/>
+              <w:top w:w="80" w:type="dxa"/>
+              <w:bottom w:w="80" w:type="dxa"/>
+              <w:left w:w="120" w:type="dxa"/>
+              <w:right w:w="120" w:type="dxa"/>
             </w:tcMar>
           </w:tcPr>
           <w:p>
@@ -709,10 +705,10 @@
             <w:tcW w:type="dxa" w:w="1296"/>
             <w:shd w:fill="FAF5FB"/>
             <w:tcMar>
-              <w:top w:w="100" w:type="dxa"/>
-              <w:bottom w:w="100" w:type="dxa"/>
-              <w:left w:w="140" w:type="dxa"/>
-              <w:right w:w="140" w:type="dxa"/>
+              <w:top w:w="80" w:type="dxa"/>
+              <w:bottom w:w="80" w:type="dxa"/>
+              <w:left w:w="120" w:type="dxa"/>
+              <w:right w:w="120" w:type="dxa"/>
             </w:tcMar>
           </w:tcPr>
           <w:p>
@@ -734,10 +730,10 @@
             <w:tcW w:type="dxa" w:w="3168"/>
             <w:shd w:fill="FAF5FB"/>
             <w:tcMar>
-              <w:top w:w="100" w:type="dxa"/>
-              <w:bottom w:w="100" w:type="dxa"/>
-              <w:left w:w="140" w:type="dxa"/>
-              <w:right w:w="140" w:type="dxa"/>
+              <w:top w:w="80" w:type="dxa"/>
+              <w:bottom w:w="80" w:type="dxa"/>
+              <w:left w:w="120" w:type="dxa"/>
+              <w:right w:w="120" w:type="dxa"/>
             </w:tcMar>
           </w:tcPr>
           <w:p>
@@ -759,10 +755,10 @@
             <w:tcW w:type="dxa" w:w="1728"/>
             <w:shd w:fill="FAF5FB"/>
             <w:tcMar>
-              <w:top w:w="100" w:type="dxa"/>
-              <w:bottom w:w="100" w:type="dxa"/>
-              <w:left w:w="140" w:type="dxa"/>
-              <w:right w:w="140" w:type="dxa"/>
+              <w:top w:w="80" w:type="dxa"/>
+              <w:bottom w:w="80" w:type="dxa"/>
+              <w:left w:w="120" w:type="dxa"/>
+              <w:right w:w="120" w:type="dxa"/>
             </w:tcMar>
           </w:tcPr>
           <w:p>
@@ -784,10 +780,10 @@
             <w:tcW w:type="dxa" w:w="1872"/>
             <w:shd w:fill="FAF5FB"/>
             <w:tcMar>
-              <w:top w:w="100" w:type="dxa"/>
-              <w:bottom w:w="100" w:type="dxa"/>
-              <w:left w:w="140" w:type="dxa"/>
-              <w:right w:w="140" w:type="dxa"/>
+              <w:top w:w="80" w:type="dxa"/>
+              <w:bottom w:w="80" w:type="dxa"/>
+              <w:left w:w="120" w:type="dxa"/>
+              <w:right w:w="120" w:type="dxa"/>
             </w:tcMar>
           </w:tcPr>
           <w:p>
@@ -809,10 +805,10 @@
             <w:tcW w:type="dxa" w:w="1872"/>
             <w:shd w:fill="FAF5FB"/>
             <w:tcMar>
-              <w:top w:w="100" w:type="dxa"/>
-              <w:bottom w:w="100" w:type="dxa"/>
-              <w:left w:w="140" w:type="dxa"/>
-              <w:right w:w="140" w:type="dxa"/>
+              <w:top w:w="80" w:type="dxa"/>
+              <w:bottom w:w="80" w:type="dxa"/>
+              <w:left w:w="120" w:type="dxa"/>
+              <w:right w:w="120" w:type="dxa"/>
             </w:tcMar>
           </w:tcPr>
           <w:p>
@@ -836,10 +832,10 @@
             <w:tcW w:type="dxa" w:w="1296"/>
             <w:shd w:fill="FFFFFF"/>
             <w:tcMar>
-              <w:top w:w="100" w:type="dxa"/>
-              <w:bottom w:w="100" w:type="dxa"/>
-              <w:left w:w="140" w:type="dxa"/>
-              <w:right w:w="140" w:type="dxa"/>
+              <w:top w:w="80" w:type="dxa"/>
+              <w:bottom w:w="80" w:type="dxa"/>
+              <w:left w:w="120" w:type="dxa"/>
+              <w:right w:w="120" w:type="dxa"/>
             </w:tcMar>
           </w:tcPr>
           <w:p>
@@ -861,10 +857,10 @@
             <w:tcW w:type="dxa" w:w="3168"/>
             <w:shd w:fill="FFFFFF"/>
             <w:tcMar>
-              <w:top w:w="100" w:type="dxa"/>
-              <w:bottom w:w="100" w:type="dxa"/>
-              <w:left w:w="140" w:type="dxa"/>
-              <w:right w:w="140" w:type="dxa"/>
+              <w:top w:w="80" w:type="dxa"/>
+              <w:bottom w:w="80" w:type="dxa"/>
+              <w:left w:w="120" w:type="dxa"/>
+              <w:right w:w="120" w:type="dxa"/>
             </w:tcMar>
           </w:tcPr>
           <w:p>
@@ -886,10 +882,10 @@
             <w:tcW w:type="dxa" w:w="1728"/>
             <w:shd w:fill="FFFFFF"/>
             <w:tcMar>
-              <w:top w:w="100" w:type="dxa"/>
-              <w:bottom w:w="100" w:type="dxa"/>
-              <w:left w:w="140" w:type="dxa"/>
-              <w:right w:w="140" w:type="dxa"/>
+              <w:top w:w="80" w:type="dxa"/>
+              <w:bottom w:w="80" w:type="dxa"/>
+              <w:left w:w="120" w:type="dxa"/>
+              <w:right w:w="120" w:type="dxa"/>
             </w:tcMar>
           </w:tcPr>
           <w:p>
@@ -911,10 +907,10 @@
             <w:tcW w:type="dxa" w:w="1872"/>
             <w:shd w:fill="FFFFFF"/>
             <w:tcMar>
-              <w:top w:w="100" w:type="dxa"/>
-              <w:bottom w:w="100" w:type="dxa"/>
-              <w:left w:w="140" w:type="dxa"/>
-              <w:right w:w="140" w:type="dxa"/>
+              <w:top w:w="80" w:type="dxa"/>
+              <w:bottom w:w="80" w:type="dxa"/>
+              <w:left w:w="120" w:type="dxa"/>
+              <w:right w:w="120" w:type="dxa"/>
             </w:tcMar>
           </w:tcPr>
           <w:p>
@@ -936,10 +932,10 @@
             <w:tcW w:type="dxa" w:w="1872"/>
             <w:shd w:fill="FFFFFF"/>
             <w:tcMar>
-              <w:top w:w="100" w:type="dxa"/>
-              <w:bottom w:w="100" w:type="dxa"/>
-              <w:left w:w="140" w:type="dxa"/>
-              <w:right w:w="140" w:type="dxa"/>
+              <w:top w:w="80" w:type="dxa"/>
+              <w:bottom w:w="80" w:type="dxa"/>
+              <w:left w:w="120" w:type="dxa"/>
+              <w:right w:w="120" w:type="dxa"/>
             </w:tcMar>
           </w:tcPr>
           <w:p>
@@ -963,10 +959,10 @@
             <w:tcW w:type="dxa" w:w="1296"/>
             <w:shd w:fill="FAF5FB"/>
             <w:tcMar>
-              <w:top w:w="100" w:type="dxa"/>
-              <w:bottom w:w="100" w:type="dxa"/>
-              <w:left w:w="140" w:type="dxa"/>
-              <w:right w:w="140" w:type="dxa"/>
+              <w:top w:w="80" w:type="dxa"/>
+              <w:bottom w:w="80" w:type="dxa"/>
+              <w:left w:w="120" w:type="dxa"/>
+              <w:right w:w="120" w:type="dxa"/>
             </w:tcMar>
           </w:tcPr>
           <w:p>
@@ -988,10 +984,10 @@
             <w:tcW w:type="dxa" w:w="3168"/>
             <w:shd w:fill="FAF5FB"/>
             <w:tcMar>
-              <w:top w:w="100" w:type="dxa"/>
-              <w:bottom w:w="100" w:type="dxa"/>
-              <w:left w:w="140" w:type="dxa"/>
-              <w:right w:w="140" w:type="dxa"/>
+              <w:top w:w="80" w:type="dxa"/>
+              <w:bottom w:w="80" w:type="dxa"/>
+              <w:left w:w="120" w:type="dxa"/>
+              <w:right w:w="120" w:type="dxa"/>
             </w:tcMar>
           </w:tcPr>
           <w:p>
@@ -1013,10 +1009,10 @@
             <w:tcW w:type="dxa" w:w="1728"/>
             <w:shd w:fill="FAF5FB"/>
             <w:tcMar>
-              <w:top w:w="100" w:type="dxa"/>
-              <w:bottom w:w="100" w:type="dxa"/>
-              <w:left w:w="140" w:type="dxa"/>
-              <w:right w:w="140" w:type="dxa"/>
+              <w:top w:w="80" w:type="dxa"/>
+              <w:bottom w:w="80" w:type="dxa"/>
+              <w:left w:w="120" w:type="dxa"/>
+              <w:right w:w="120" w:type="dxa"/>
             </w:tcMar>
           </w:tcPr>
           <w:p>
@@ -1038,10 +1034,10 @@
             <w:tcW w:type="dxa" w:w="1872"/>
             <w:shd w:fill="FAF5FB"/>
             <w:tcMar>
-              <w:top w:w="100" w:type="dxa"/>
-              <w:bottom w:w="100" w:type="dxa"/>
-              <w:left w:w="140" w:type="dxa"/>
-              <w:right w:w="140" w:type="dxa"/>
+              <w:top w:w="80" w:type="dxa"/>
+              <w:bottom w:w="80" w:type="dxa"/>
+              <w:left w:w="120" w:type="dxa"/>
+              <w:right w:w="120" w:type="dxa"/>
             </w:tcMar>
           </w:tcPr>
           <w:p>
@@ -1063,10 +1059,10 @@
             <w:tcW w:type="dxa" w:w="1872"/>
             <w:shd w:fill="FAF5FB"/>
             <w:tcMar>
-              <w:top w:w="100" w:type="dxa"/>
-              <w:bottom w:w="100" w:type="dxa"/>
-              <w:left w:w="140" w:type="dxa"/>
-              <w:right w:w="140" w:type="dxa"/>
+              <w:top w:w="80" w:type="dxa"/>
+              <w:bottom w:w="80" w:type="dxa"/>
+              <w:left w:w="120" w:type="dxa"/>
+              <w:right w:w="120" w:type="dxa"/>
             </w:tcMar>
           </w:tcPr>
           <w:p>
@@ -1090,10 +1086,10 @@
             <w:tcW w:type="dxa" w:w="1296"/>
             <w:shd w:fill="FFFFFF"/>
             <w:tcMar>
-              <w:top w:w="100" w:type="dxa"/>
-              <w:bottom w:w="100" w:type="dxa"/>
-              <w:left w:w="140" w:type="dxa"/>
-              <w:right w:w="140" w:type="dxa"/>
+              <w:top w:w="80" w:type="dxa"/>
+              <w:bottom w:w="80" w:type="dxa"/>
+              <w:left w:w="120" w:type="dxa"/>
+              <w:right w:w="120" w:type="dxa"/>
             </w:tcMar>
           </w:tcPr>
           <w:p>
@@ -1115,10 +1111,10 @@
             <w:tcW w:type="dxa" w:w="3168"/>
             <w:shd w:fill="FFFFFF"/>
             <w:tcMar>
-              <w:top w:w="100" w:type="dxa"/>
-              <w:bottom w:w="100" w:type="dxa"/>
-              <w:left w:w="140" w:type="dxa"/>
-              <w:right w:w="140" w:type="dxa"/>
+              <w:top w:w="80" w:type="dxa"/>
+              <w:bottom w:w="80" w:type="dxa"/>
+              <w:left w:w="120" w:type="dxa"/>
+              <w:right w:w="120" w:type="dxa"/>
             </w:tcMar>
           </w:tcPr>
           <w:p>
@@ -1140,10 +1136,10 @@
             <w:tcW w:type="dxa" w:w="1728"/>
             <w:shd w:fill="FFFFFF"/>
             <w:tcMar>
-              <w:top w:w="100" w:type="dxa"/>
-              <w:bottom w:w="100" w:type="dxa"/>
-              <w:left w:w="140" w:type="dxa"/>
-              <w:right w:w="140" w:type="dxa"/>
+              <w:top w:w="80" w:type="dxa"/>
+              <w:bottom w:w="80" w:type="dxa"/>
+              <w:left w:w="120" w:type="dxa"/>
+              <w:right w:w="120" w:type="dxa"/>
             </w:tcMar>
           </w:tcPr>
           <w:p>
@@ -1165,10 +1161,10 @@
             <w:tcW w:type="dxa" w:w="1872"/>
             <w:shd w:fill="FFFFFF"/>
             <w:tcMar>
-              <w:top w:w="100" w:type="dxa"/>
-              <w:bottom w:w="100" w:type="dxa"/>
-              <w:left w:w="140" w:type="dxa"/>
-              <w:right w:w="140" w:type="dxa"/>
+              <w:top w:w="80" w:type="dxa"/>
+              <w:bottom w:w="80" w:type="dxa"/>
+              <w:left w:w="120" w:type="dxa"/>
+              <w:right w:w="120" w:type="dxa"/>
             </w:tcMar>
           </w:tcPr>
           <w:p>
@@ -1190,10 +1186,10 @@
             <w:tcW w:type="dxa" w:w="1872"/>
             <w:shd w:fill="FFFFFF"/>
             <w:tcMar>
-              <w:top w:w="100" w:type="dxa"/>
-              <w:bottom w:w="100" w:type="dxa"/>
-              <w:left w:w="140" w:type="dxa"/>
-              <w:right w:w="140" w:type="dxa"/>
+              <w:top w:w="80" w:type="dxa"/>
+              <w:bottom w:w="80" w:type="dxa"/>
+              <w:left w:w="120" w:type="dxa"/>
+              <w:right w:w="120" w:type="dxa"/>
             </w:tcMar>
           </w:tcPr>
           <w:p>
@@ -1217,10 +1213,10 @@
             <w:tcW w:type="dxa" w:w="1296"/>
             <w:shd w:fill="FAF5FB"/>
             <w:tcMar>
-              <w:top w:w="100" w:type="dxa"/>
-              <w:bottom w:w="100" w:type="dxa"/>
-              <w:left w:w="140" w:type="dxa"/>
-              <w:right w:w="140" w:type="dxa"/>
+              <w:top w:w="80" w:type="dxa"/>
+              <w:bottom w:w="80" w:type="dxa"/>
+              <w:left w:w="120" w:type="dxa"/>
+              <w:right w:w="120" w:type="dxa"/>
             </w:tcMar>
           </w:tcPr>
           <w:p>
@@ -1242,10 +1238,10 @@
             <w:tcW w:type="dxa" w:w="3168"/>
             <w:shd w:fill="FAF5FB"/>
             <w:tcMar>
-              <w:top w:w="100" w:type="dxa"/>
-              <w:bottom w:w="100" w:type="dxa"/>
-              <w:left w:w="140" w:type="dxa"/>
-              <w:right w:w="140" w:type="dxa"/>
+              <w:top w:w="80" w:type="dxa"/>
+              <w:bottom w:w="80" w:type="dxa"/>
+              <w:left w:w="120" w:type="dxa"/>
+              <w:right w:w="120" w:type="dxa"/>
             </w:tcMar>
           </w:tcPr>
           <w:p>
@@ -1267,10 +1263,10 @@
             <w:tcW w:type="dxa" w:w="1728"/>
             <w:shd w:fill="FAF5FB"/>
             <w:tcMar>
-              <w:top w:w="100" w:type="dxa"/>
-              <w:bottom w:w="100" w:type="dxa"/>
-              <w:left w:w="140" w:type="dxa"/>
-              <w:right w:w="140" w:type="dxa"/>
+              <w:top w:w="80" w:type="dxa"/>
+              <w:bottom w:w="80" w:type="dxa"/>
+              <w:left w:w="120" w:type="dxa"/>
+              <w:right w:w="120" w:type="dxa"/>
             </w:tcMar>
           </w:tcPr>
           <w:p>
@@ -1292,10 +1288,10 @@
             <w:tcW w:type="dxa" w:w="1872"/>
             <w:shd w:fill="FAF5FB"/>
             <w:tcMar>
-              <w:top w:w="100" w:type="dxa"/>
-              <w:bottom w:w="100" w:type="dxa"/>
-              <w:left w:w="140" w:type="dxa"/>
-              <w:right w:w="140" w:type="dxa"/>
+              <w:top w:w="80" w:type="dxa"/>
+              <w:bottom w:w="80" w:type="dxa"/>
+              <w:left w:w="120" w:type="dxa"/>
+              <w:right w:w="120" w:type="dxa"/>
             </w:tcMar>
           </w:tcPr>
           <w:p>
@@ -1317,10 +1313,10 @@
             <w:tcW w:type="dxa" w:w="1872"/>
             <w:shd w:fill="FAF5FB"/>
             <w:tcMar>
-              <w:top w:w="100" w:type="dxa"/>
-              <w:bottom w:w="100" w:type="dxa"/>
-              <w:left w:w="140" w:type="dxa"/>
-              <w:right w:w="140" w:type="dxa"/>
+              <w:top w:w="80" w:type="dxa"/>
+              <w:bottom w:w="80" w:type="dxa"/>
+              <w:left w:w="120" w:type="dxa"/>
+              <w:right w:w="120" w:type="dxa"/>
             </w:tcMar>
           </w:tcPr>
           <w:p>
@@ -1344,10 +1340,10 @@
             <w:tcW w:type="dxa" w:w="1296"/>
             <w:shd w:fill="FFFFFF"/>
             <w:tcMar>
-              <w:top w:w="100" w:type="dxa"/>
-              <w:bottom w:w="100" w:type="dxa"/>
-              <w:left w:w="140" w:type="dxa"/>
-              <w:right w:w="140" w:type="dxa"/>
+              <w:top w:w="80" w:type="dxa"/>
+              <w:bottom w:w="80" w:type="dxa"/>
+              <w:left w:w="120" w:type="dxa"/>
+              <w:right w:w="120" w:type="dxa"/>
             </w:tcMar>
           </w:tcPr>
           <w:p>
@@ -1369,10 +1365,10 @@
             <w:tcW w:type="dxa" w:w="3168"/>
             <w:shd w:fill="FFFFFF"/>
             <w:tcMar>
-              <w:top w:w="100" w:type="dxa"/>
-              <w:bottom w:w="100" w:type="dxa"/>
-              <w:left w:w="140" w:type="dxa"/>
-              <w:right w:w="140" w:type="dxa"/>
+              <w:top w:w="80" w:type="dxa"/>
+              <w:bottom w:w="80" w:type="dxa"/>
+              <w:left w:w="120" w:type="dxa"/>
+              <w:right w:w="120" w:type="dxa"/>
             </w:tcMar>
           </w:tcPr>
           <w:p>
@@ -1394,10 +1390,10 @@
             <w:tcW w:type="dxa" w:w="1728"/>
             <w:shd w:fill="FFFFFF"/>
             <w:tcMar>
-              <w:top w:w="100" w:type="dxa"/>
-              <w:bottom w:w="100" w:type="dxa"/>
-              <w:left w:w="140" w:type="dxa"/>
-              <w:right w:w="140" w:type="dxa"/>
+              <w:top w:w="80" w:type="dxa"/>
+              <w:bottom w:w="80" w:type="dxa"/>
+              <w:left w:w="120" w:type="dxa"/>
+              <w:right w:w="120" w:type="dxa"/>
             </w:tcMar>
           </w:tcPr>
           <w:p>
@@ -1419,10 +1415,10 @@
             <w:tcW w:type="dxa" w:w="1872"/>
             <w:shd w:fill="FFFFFF"/>
             <w:tcMar>
-              <w:top w:w="100" w:type="dxa"/>
-              <w:bottom w:w="100" w:type="dxa"/>
-              <w:left w:w="140" w:type="dxa"/>
-              <w:right w:w="140" w:type="dxa"/>
+              <w:top w:w="80" w:type="dxa"/>
+              <w:bottom w:w="80" w:type="dxa"/>
+              <w:left w:w="120" w:type="dxa"/>
+              <w:right w:w="120" w:type="dxa"/>
             </w:tcMar>
           </w:tcPr>
           <w:p>
@@ -1444,10 +1440,10 @@
             <w:tcW w:type="dxa" w:w="1872"/>
             <w:shd w:fill="FFFFFF"/>
             <w:tcMar>
-              <w:top w:w="100" w:type="dxa"/>
-              <w:bottom w:w="100" w:type="dxa"/>
-              <w:left w:w="140" w:type="dxa"/>
-              <w:right w:w="140" w:type="dxa"/>
+              <w:top w:w="80" w:type="dxa"/>
+              <w:bottom w:w="80" w:type="dxa"/>
+              <w:left w:w="120" w:type="dxa"/>
+              <w:right w:w="120" w:type="dxa"/>
             </w:tcMar>
           </w:tcPr>
           <w:p>
@@ -1471,10 +1467,10 @@
             <w:tcW w:type="dxa" w:w="1296"/>
             <w:shd w:fill="FAF5FB"/>
             <w:tcMar>
-              <w:top w:w="100" w:type="dxa"/>
-              <w:bottom w:w="100" w:type="dxa"/>
-              <w:left w:w="140" w:type="dxa"/>
-              <w:right w:w="140" w:type="dxa"/>
+              <w:top w:w="80" w:type="dxa"/>
+              <w:bottom w:w="80" w:type="dxa"/>
+              <w:left w:w="120" w:type="dxa"/>
+              <w:right w:w="120" w:type="dxa"/>
             </w:tcMar>
           </w:tcPr>
           <w:p>
@@ -1496,10 +1492,10 @@
             <w:tcW w:type="dxa" w:w="3168"/>
             <w:shd w:fill="FAF5FB"/>
             <w:tcMar>
-              <w:top w:w="100" w:type="dxa"/>
-              <w:bottom w:w="100" w:type="dxa"/>
-              <w:left w:w="140" w:type="dxa"/>
-              <w:right w:w="140" w:type="dxa"/>
+              <w:top w:w="80" w:type="dxa"/>
+              <w:bottom w:w="80" w:type="dxa"/>
+              <w:left w:w="120" w:type="dxa"/>
+              <w:right w:w="120" w:type="dxa"/>
             </w:tcMar>
           </w:tcPr>
           <w:p>
@@ -1521,10 +1517,10 @@
             <w:tcW w:type="dxa" w:w="1728"/>
             <w:shd w:fill="FAF5FB"/>
             <w:tcMar>
-              <w:top w:w="100" w:type="dxa"/>
-              <w:bottom w:w="100" w:type="dxa"/>
-              <w:left w:w="140" w:type="dxa"/>
-              <w:right w:w="140" w:type="dxa"/>
+              <w:top w:w="80" w:type="dxa"/>
+              <w:bottom w:w="80" w:type="dxa"/>
+              <w:left w:w="120" w:type="dxa"/>
+              <w:right w:w="120" w:type="dxa"/>
             </w:tcMar>
           </w:tcPr>
           <w:p>
@@ -1546,10 +1542,10 @@
             <w:tcW w:type="dxa" w:w="1872"/>
             <w:shd w:fill="FAF5FB"/>
             <w:tcMar>
-              <w:top w:w="100" w:type="dxa"/>
-              <w:bottom w:w="100" w:type="dxa"/>
-              <w:left w:w="140" w:type="dxa"/>
-              <w:right w:w="140" w:type="dxa"/>
+              <w:top w:w="80" w:type="dxa"/>
+              <w:bottom w:w="80" w:type="dxa"/>
+              <w:left w:w="120" w:type="dxa"/>
+              <w:right w:w="120" w:type="dxa"/>
             </w:tcMar>
           </w:tcPr>
           <w:p>
@@ -1571,10 +1567,10 @@
             <w:tcW w:type="dxa" w:w="1872"/>
             <w:shd w:fill="FAF5FB"/>
             <w:tcMar>
-              <w:top w:w="100" w:type="dxa"/>
-              <w:bottom w:w="100" w:type="dxa"/>
-              <w:left w:w="140" w:type="dxa"/>
-              <w:right w:w="140" w:type="dxa"/>
+              <w:top w:w="80" w:type="dxa"/>
+              <w:bottom w:w="80" w:type="dxa"/>
+              <w:left w:w="120" w:type="dxa"/>
+              <w:right w:w="120" w:type="dxa"/>
             </w:tcMar>
           </w:tcPr>
           <w:p>
@@ -1598,10 +1594,10 @@
             <w:tcW w:type="dxa" w:w="1296"/>
             <w:shd w:fill="FFFFFF"/>
             <w:tcMar>
-              <w:top w:w="100" w:type="dxa"/>
-              <w:bottom w:w="100" w:type="dxa"/>
-              <w:left w:w="140" w:type="dxa"/>
-              <w:right w:w="140" w:type="dxa"/>
+              <w:top w:w="80" w:type="dxa"/>
+              <w:bottom w:w="80" w:type="dxa"/>
+              <w:left w:w="120" w:type="dxa"/>
+              <w:right w:w="120" w:type="dxa"/>
             </w:tcMar>
           </w:tcPr>
           <w:p>
@@ -1623,10 +1619,10 @@
             <w:tcW w:type="dxa" w:w="3168"/>
             <w:shd w:fill="FFFFFF"/>
             <w:tcMar>
-              <w:top w:w="100" w:type="dxa"/>
-              <w:bottom w:w="100" w:type="dxa"/>
-              <w:left w:w="140" w:type="dxa"/>
-              <w:right w:w="140" w:type="dxa"/>
+              <w:top w:w="80" w:type="dxa"/>
+              <w:bottom w:w="80" w:type="dxa"/>
+              <w:left w:w="120" w:type="dxa"/>
+              <w:right w:w="120" w:type="dxa"/>
             </w:tcMar>
           </w:tcPr>
           <w:p>
@@ -1648,10 +1644,10 @@
             <w:tcW w:type="dxa" w:w="1728"/>
             <w:shd w:fill="FFFFFF"/>
             <w:tcMar>
-              <w:top w:w="100" w:type="dxa"/>
-              <w:bottom w:w="100" w:type="dxa"/>
-              <w:left w:w="140" w:type="dxa"/>
-              <w:right w:w="140" w:type="dxa"/>
+              <w:top w:w="80" w:type="dxa"/>
+              <w:bottom w:w="80" w:type="dxa"/>
+              <w:left w:w="120" w:type="dxa"/>
+              <w:right w:w="120" w:type="dxa"/>
             </w:tcMar>
           </w:tcPr>
           <w:p>
@@ -1673,10 +1669,10 @@
             <w:tcW w:type="dxa" w:w="1872"/>
             <w:shd w:fill="FFFFFF"/>
             <w:tcMar>
-              <w:top w:w="100" w:type="dxa"/>
-              <w:bottom w:w="100" w:type="dxa"/>
-              <w:left w:w="140" w:type="dxa"/>
-              <w:right w:w="140" w:type="dxa"/>
+              <w:top w:w="80" w:type="dxa"/>
+              <w:bottom w:w="80" w:type="dxa"/>
+              <w:left w:w="120" w:type="dxa"/>
+              <w:right w:w="120" w:type="dxa"/>
             </w:tcMar>
           </w:tcPr>
           <w:p>
@@ -1698,10 +1694,10 @@
             <w:tcW w:type="dxa" w:w="1872"/>
             <w:shd w:fill="FFFFFF"/>
             <w:tcMar>
-              <w:top w:w="100" w:type="dxa"/>
-              <w:bottom w:w="100" w:type="dxa"/>
-              <w:left w:w="140" w:type="dxa"/>
-              <w:right w:w="140" w:type="dxa"/>
+              <w:top w:w="80" w:type="dxa"/>
+              <w:bottom w:w="80" w:type="dxa"/>
+              <w:left w:w="120" w:type="dxa"/>
+              <w:right w:w="120" w:type="dxa"/>
             </w:tcMar>
           </w:tcPr>
           <w:p>
@@ -1722,13 +1718,13 @@
     </w:tbl>
     <w:p>
       <w:pPr>
-        <w:spacing w:after="120"/>
+        <w:spacing w:after="80"/>
       </w:pPr>
     </w:p>
     <w:p>
       <w:pPr>
         <w:keepNext/>
-        <w:spacing w:before="280" w:after="80"/>
+        <w:spacing w:before="240" w:after="60"/>
       </w:pPr>
       <w:r>
         <w:rPr>
@@ -1743,7 +1739,7 @@
     <w:p>
       <w:pPr>
         <w:keepNext/>
-        <w:spacing w:before="200" w:after="60"/>
+        <w:spacing w:before="160" w:after="40"/>
       </w:pPr>
       <w:r>
         <w:rPr>
@@ -1758,7 +1754,7 @@
     </w:p>
     <w:p>
       <w:pPr>
-        <w:spacing w:after="120" w:line="269" w:lineRule="auto"/>
+        <w:spacing w:after="100" w:line="264" w:lineRule="auto"/>
         <w:jc w:val="both"/>
       </w:pPr>
       <w:r>
@@ -1767,13 +1763,69 @@
           <w:color w:val="1E293B"/>
           <w:sz w:val="20"/>
         </w:rPr>
-        <w:t>SafeCity implements a multi-tier decoupled architecture comprising a responsive client application, an asynchronous geospatial routing layer, a verified administrative moderation pipeline, and a persistent spatial database. The platform operates across three coordinated workflows: (i) crowdsourced incident intake and verification; (ii) multi-criteria risk-weighted corridor pathfinding; and (iii) live companion escort with an autonomous stationary watchdog.</w:t>
+        <w:t>SafeCity implements a multi-tier decoupled architecture comprising a responsive client application, an asynchronous geospatial routing layer, a verified administrative moderation pipeline, and a persistent spatial database. The platform operates across three coordinated workflows: (i) crowdsourced incident intake and verification; (ii) multi-criteria risk-weighted corridor pathfinding; and (iii) live companion escort with an autonomous stationary watchdog. Fig. 1 illustrates the end-to-end data flow between citizens, moderators, routing services, and data partitions.</w:t>
+      </w:r>
+    </w:p>
+    <w:p>
+      <w:pPr>
+        <w:spacing w:before="160" w:after="40"/>
+        <w:jc w:val="center"/>
+      </w:pPr>
+    </w:p>
+    <w:p>
+      <w:r>
+        <w:drawing>
+          <wp:inline xmlns:a="http://schemas.openxmlformats.org/drawingml/2006/main" xmlns:pic="http://schemas.openxmlformats.org/drawingml/2006/picture">
+            <wp:extent cx="5852160" cy="3317443"/>
+            <wp:docPr id="1" name="Picture 1"/>
+            <wp:cNvGraphicFramePr>
+              <a:graphicFrameLocks noChangeAspect="1"/>
+            </wp:cNvGraphicFramePr>
+            <a:graphic>
+              <a:graphicData uri="http://schemas.openxmlformats.org/drawingml/2006/picture">
+                <pic:pic>
+                  <pic:nvPicPr>
+                    <pic:cNvPr id="0" name="fig1_system_architecture.png"/>
+                    <pic:cNvPicPr/>
+                  </pic:nvPicPr>
+                  <pic:blipFill>
+                    <a:blip r:embed="rId9"/>
+                    <a:stretch>
+                      <a:fillRect/>
+                    </a:stretch>
+                  </pic:blipFill>
+                  <pic:spPr>
+                    <a:xfrm>
+                      <a:off x="0" y="0"/>
+                      <a:ext cx="5852160" cy="3317443"/>
+                    </a:xfrm>
+                    <a:prstGeom prst="rect"/>
+                  </pic:spPr>
+                </pic:pic>
+              </a:graphicData>
+            </a:graphic>
+          </wp:inline>
+        </w:drawing>
+      </w:r>
+    </w:p>
+    <w:p>
+      <w:pPr>
+        <w:spacing w:before="40" w:after="160"/>
+        <w:jc w:val="center"/>
+      </w:pPr>
+      <w:r>
+        <w:rPr>
+          <w:rFonts w:ascii="Times New Roman" w:hAnsi="Times New Roman"/>
+          <w:i/>
+          <w:sz w:val="18"/>
+        </w:rPr>
+        <w:t>Fig. 1. Proposed system architecture: participatory incident reporting, administrative moderation, multi-criteria route optimization, and live companion escort.</w:t>
       </w:r>
     </w:p>
     <w:p>
       <w:pPr>
         <w:keepNext/>
-        <w:spacing w:before="200" w:after="60"/>
+        <w:spacing w:before="160" w:after="40"/>
       </w:pPr>
       <w:r>
         <w:rPr>
@@ -1788,7 +1840,7 @@
     </w:p>
     <w:p>
       <w:pPr>
-        <w:spacing w:after="120" w:line="269" w:lineRule="auto"/>
+        <w:spacing w:after="100" w:line="264" w:lineRule="auto"/>
         <w:jc w:val="both"/>
       </w:pPr>
       <w:r>
@@ -1802,7 +1854,7 @@
     </w:p>
     <w:p>
       <w:pPr>
-        <w:spacing w:after="120" w:line="269" w:lineRule="auto"/>
+        <w:spacing w:after="100" w:line="264" w:lineRule="auto"/>
         <w:jc w:val="both"/>
       </w:pPr>
       <w:r>
@@ -1817,7 +1869,7 @@
     <w:p>
       <w:pPr>
         <w:keepNext/>
-        <w:spacing w:before="200" w:after="60"/>
+        <w:spacing w:before="160" w:after="40"/>
       </w:pPr>
       <w:r>
         <w:rPr>
@@ -1832,7 +1884,7 @@
     </w:p>
     <w:p>
       <w:pPr>
-        <w:spacing w:after="120" w:line="269" w:lineRule="auto"/>
+        <w:spacing w:after="100" w:line="264" w:lineRule="auto"/>
         <w:jc w:val="both"/>
       </w:pPr>
       <w:r>
@@ -1846,7 +1898,7 @@
     </w:p>
     <w:p>
       <w:pPr>
-        <w:spacing w:after="120" w:line="269" w:lineRule="auto"/>
+        <w:spacing w:after="100" w:line="264" w:lineRule="auto"/>
         <w:jc w:val="both"/>
       </w:pPr>
       <w:r>
@@ -1860,7 +1912,7 @@
     </w:p>
     <w:p>
       <w:pPr>
-        <w:spacing w:after="120" w:line="269" w:lineRule="auto"/>
+        <w:spacing w:after="100" w:line="264" w:lineRule="auto"/>
         <w:jc w:val="both"/>
       </w:pPr>
       <w:r>
@@ -1874,7 +1926,7 @@
     </w:p>
     <w:p>
       <w:pPr>
-        <w:spacing w:after="120" w:line="269" w:lineRule="auto"/>
+        <w:spacing w:after="100" w:line="264" w:lineRule="auto"/>
         <w:jc w:val="both"/>
       </w:pPr>
       <w:r>
@@ -1888,7 +1940,7 @@
     </w:p>
     <w:p>
       <w:pPr>
-        <w:spacing w:after="120" w:line="269" w:lineRule="auto"/>
+        <w:spacing w:after="100" w:line="264" w:lineRule="auto"/>
         <w:jc w:val="both"/>
       </w:pPr>
       <w:r>
@@ -1902,7 +1954,7 @@
     </w:p>
     <w:p>
       <w:pPr>
-        <w:spacing w:after="120" w:line="269" w:lineRule="auto"/>
+        <w:spacing w:after="100" w:line="264" w:lineRule="auto"/>
         <w:jc w:val="both"/>
       </w:pPr>
       <w:r>
@@ -1917,7 +1969,7 @@
     <w:p>
       <w:pPr>
         <w:keepNext/>
-        <w:spacing w:before="200" w:after="60"/>
+        <w:spacing w:before="160" w:after="40"/>
       </w:pPr>
       <w:r>
         <w:rPr>
@@ -1932,7 +1984,7 @@
     </w:p>
     <w:p>
       <w:pPr>
-        <w:spacing w:after="120" w:line="269" w:lineRule="auto"/>
+        <w:spacing w:after="100" w:line="264" w:lineRule="auto"/>
         <w:jc w:val="both"/>
       </w:pPr>
       <w:r>
@@ -1946,7 +1998,7 @@
     </w:p>
     <w:p>
       <w:pPr>
-        <w:spacing w:after="120" w:line="269" w:lineRule="auto"/>
+        <w:spacing w:after="100" w:line="264" w:lineRule="auto"/>
         <w:jc w:val="both"/>
       </w:pPr>
       <w:r>
@@ -1960,7 +2012,7 @@
     </w:p>
     <w:p>
       <w:pPr>
-        <w:spacing w:after="120" w:line="269" w:lineRule="auto"/>
+        <w:spacing w:after="100" w:line="264" w:lineRule="auto"/>
         <w:jc w:val="both"/>
       </w:pPr>
       <w:r>
@@ -1974,7 +2026,7 @@
     </w:p>
     <w:p>
       <w:pPr>
-        <w:spacing w:after="120" w:line="269" w:lineRule="auto"/>
+        <w:spacing w:after="100" w:line="264" w:lineRule="auto"/>
         <w:jc w:val="both"/>
       </w:pPr>
       <w:r>
@@ -1989,7 +2041,7 @@
     <w:p>
       <w:pPr>
         <w:keepNext/>
-        <w:spacing w:before="200" w:after="60"/>
+        <w:spacing w:before="160" w:after="40"/>
       </w:pPr>
       <w:r>
         <w:rPr>
@@ -2004,7 +2056,7 @@
     </w:p>
     <w:p>
       <w:pPr>
-        <w:spacing w:after="120" w:line="269" w:lineRule="auto"/>
+        <w:spacing w:after="100" w:line="264" w:lineRule="auto"/>
         <w:jc w:val="both"/>
       </w:pPr>
       <w:r>
@@ -2019,7 +2071,7 @@
     <w:p>
       <w:pPr>
         <w:keepNext/>
-        <w:spacing w:before="280" w:after="80"/>
+        <w:spacing w:before="240" w:after="60"/>
       </w:pPr>
       <w:r>
         <w:rPr>
@@ -2033,7 +2085,7 @@
     </w:p>
     <w:p>
       <w:pPr>
-        <w:spacing w:after="120" w:line="269" w:lineRule="auto"/>
+        <w:spacing w:after="100" w:line="264" w:lineRule="auto"/>
         <w:jc w:val="both"/>
       </w:pPr>
       <w:r>
@@ -2047,7 +2099,7 @@
     </w:p>
     <w:p>
       <w:pPr>
-        <w:spacing w:before="160" w:after="80"/>
+        <w:spacing w:before="120" w:after="60"/>
         <w:jc w:val="center"/>
       </w:pPr>
       <w:r>
@@ -2076,10 +2128,10 @@
             <w:tcW w:type="dxa" w:w="2160"/>
             <w:shd w:fill="2A132C"/>
             <w:tcMar>
-              <w:top w:w="120" w:type="dxa"/>
-              <w:bottom w:w="120" w:type="dxa"/>
-              <w:left w:w="140" w:type="dxa"/>
-              <w:right w:w="140" w:type="dxa"/>
+              <w:top w:w="100" w:type="dxa"/>
+              <w:bottom w:w="100" w:type="dxa"/>
+              <w:left w:w="120" w:type="dxa"/>
+              <w:right w:w="120" w:type="dxa"/>
             </w:tcMar>
           </w:tcPr>
           <w:p>
@@ -2102,10 +2154,10 @@
             <w:tcW w:type="dxa" w:w="3168"/>
             <w:shd w:fill="2A132C"/>
             <w:tcMar>
-              <w:top w:w="120" w:type="dxa"/>
-              <w:bottom w:w="120" w:type="dxa"/>
-              <w:left w:w="140" w:type="dxa"/>
-              <w:right w:w="140" w:type="dxa"/>
+              <w:top w:w="100" w:type="dxa"/>
+              <w:bottom w:w="100" w:type="dxa"/>
+              <w:left w:w="120" w:type="dxa"/>
+              <w:right w:w="120" w:type="dxa"/>
             </w:tcMar>
           </w:tcPr>
           <w:p>
@@ -2128,10 +2180,10 @@
             <w:tcW w:type="dxa" w:w="4608"/>
             <w:shd w:fill="2A132C"/>
             <w:tcMar>
-              <w:top w:w="120" w:type="dxa"/>
-              <w:bottom w:w="120" w:type="dxa"/>
-              <w:left w:w="140" w:type="dxa"/>
-              <w:right w:w="140" w:type="dxa"/>
+              <w:top w:w="100" w:type="dxa"/>
+              <w:bottom w:w="100" w:type="dxa"/>
+              <w:left w:w="120" w:type="dxa"/>
+              <w:right w:w="120" w:type="dxa"/>
             </w:tcMar>
           </w:tcPr>
           <w:p>
@@ -2156,10 +2208,10 @@
             <w:tcW w:type="dxa" w:w="2160"/>
             <w:shd w:fill="FFFFFF"/>
             <w:tcMar>
-              <w:top w:w="100" w:type="dxa"/>
-              <w:bottom w:w="100" w:type="dxa"/>
-              <w:left w:w="140" w:type="dxa"/>
-              <w:right w:w="140" w:type="dxa"/>
+              <w:top w:w="80" w:type="dxa"/>
+              <w:bottom w:w="80" w:type="dxa"/>
+              <w:left w:w="120" w:type="dxa"/>
+              <w:right w:w="120" w:type="dxa"/>
             </w:tcMar>
           </w:tcPr>
           <w:p>
@@ -2181,10 +2233,10 @@
             <w:tcW w:type="dxa" w:w="3168"/>
             <w:shd w:fill="FFFFFF"/>
             <w:tcMar>
-              <w:top w:w="100" w:type="dxa"/>
-              <w:bottom w:w="100" w:type="dxa"/>
-              <w:left w:w="140" w:type="dxa"/>
-              <w:right w:w="140" w:type="dxa"/>
+              <w:top w:w="80" w:type="dxa"/>
+              <w:bottom w:w="80" w:type="dxa"/>
+              <w:left w:w="120" w:type="dxa"/>
+              <w:right w:w="120" w:type="dxa"/>
             </w:tcMar>
           </w:tcPr>
           <w:p>
@@ -2206,10 +2258,10 @@
             <w:tcW w:type="dxa" w:w="4608"/>
             <w:shd w:fill="FFFFFF"/>
             <w:tcMar>
-              <w:top w:w="100" w:type="dxa"/>
-              <w:bottom w:w="100" w:type="dxa"/>
-              <w:left w:w="140" w:type="dxa"/>
-              <w:right w:w="140" w:type="dxa"/>
+              <w:top w:w="80" w:type="dxa"/>
+              <w:bottom w:w="80" w:type="dxa"/>
+              <w:left w:w="120" w:type="dxa"/>
+              <w:right w:w="120" w:type="dxa"/>
             </w:tcMar>
           </w:tcPr>
           <w:p>
@@ -2233,10 +2285,10 @@
             <w:tcW w:type="dxa" w:w="2160"/>
             <w:shd w:fill="FAF5FB"/>
             <w:tcMar>
-              <w:top w:w="100" w:type="dxa"/>
-              <w:bottom w:w="100" w:type="dxa"/>
-              <w:left w:w="140" w:type="dxa"/>
-              <w:right w:w="140" w:type="dxa"/>
+              <w:top w:w="80" w:type="dxa"/>
+              <w:bottom w:w="80" w:type="dxa"/>
+              <w:left w:w="120" w:type="dxa"/>
+              <w:right w:w="120" w:type="dxa"/>
             </w:tcMar>
           </w:tcPr>
           <w:p>
@@ -2258,10 +2310,10 @@
             <w:tcW w:type="dxa" w:w="3168"/>
             <w:shd w:fill="FAF5FB"/>
             <w:tcMar>
-              <w:top w:w="100" w:type="dxa"/>
-              <w:bottom w:w="100" w:type="dxa"/>
-              <w:left w:w="140" w:type="dxa"/>
-              <w:right w:w="140" w:type="dxa"/>
+              <w:top w:w="80" w:type="dxa"/>
+              <w:bottom w:w="80" w:type="dxa"/>
+              <w:left w:w="120" w:type="dxa"/>
+              <w:right w:w="120" w:type="dxa"/>
             </w:tcMar>
           </w:tcPr>
           <w:p>
@@ -2283,10 +2335,10 @@
             <w:tcW w:type="dxa" w:w="4608"/>
             <w:shd w:fill="FAF5FB"/>
             <w:tcMar>
-              <w:top w:w="100" w:type="dxa"/>
-              <w:bottom w:w="100" w:type="dxa"/>
-              <w:left w:w="140" w:type="dxa"/>
-              <w:right w:w="140" w:type="dxa"/>
+              <w:top w:w="80" w:type="dxa"/>
+              <w:bottom w:w="80" w:type="dxa"/>
+              <w:left w:w="120" w:type="dxa"/>
+              <w:right w:w="120" w:type="dxa"/>
             </w:tcMar>
           </w:tcPr>
           <w:p>
@@ -2310,10 +2362,10 @@
             <w:tcW w:type="dxa" w:w="2160"/>
             <w:shd w:fill="FFFFFF"/>
             <w:tcMar>
-              <w:top w:w="100" w:type="dxa"/>
-              <w:bottom w:w="100" w:type="dxa"/>
-              <w:left w:w="140" w:type="dxa"/>
-              <w:right w:w="140" w:type="dxa"/>
+              <w:top w:w="80" w:type="dxa"/>
+              <w:bottom w:w="80" w:type="dxa"/>
+              <w:left w:w="120" w:type="dxa"/>
+              <w:right w:w="120" w:type="dxa"/>
             </w:tcMar>
           </w:tcPr>
           <w:p>
@@ -2335,10 +2387,10 @@
             <w:tcW w:type="dxa" w:w="3168"/>
             <w:shd w:fill="FFFFFF"/>
             <w:tcMar>
-              <w:top w:w="100" w:type="dxa"/>
-              <w:bottom w:w="100" w:type="dxa"/>
-              <w:left w:w="140" w:type="dxa"/>
-              <w:right w:w="140" w:type="dxa"/>
+              <w:top w:w="80" w:type="dxa"/>
+              <w:bottom w:w="80" w:type="dxa"/>
+              <w:left w:w="120" w:type="dxa"/>
+              <w:right w:w="120" w:type="dxa"/>
             </w:tcMar>
           </w:tcPr>
           <w:p>
@@ -2360,10 +2412,10 @@
             <w:tcW w:type="dxa" w:w="4608"/>
             <w:shd w:fill="FFFFFF"/>
             <w:tcMar>
-              <w:top w:w="100" w:type="dxa"/>
-              <w:bottom w:w="100" w:type="dxa"/>
-              <w:left w:w="140" w:type="dxa"/>
-              <w:right w:w="140" w:type="dxa"/>
+              <w:top w:w="80" w:type="dxa"/>
+              <w:bottom w:w="80" w:type="dxa"/>
+              <w:left w:w="120" w:type="dxa"/>
+              <w:right w:w="120" w:type="dxa"/>
             </w:tcMar>
           </w:tcPr>
           <w:p>
@@ -2387,10 +2439,10 @@
             <w:tcW w:type="dxa" w:w="2160"/>
             <w:shd w:fill="FAF5FB"/>
             <w:tcMar>
-              <w:top w:w="100" w:type="dxa"/>
-              <w:bottom w:w="100" w:type="dxa"/>
-              <w:left w:w="140" w:type="dxa"/>
-              <w:right w:w="140" w:type="dxa"/>
+              <w:top w:w="80" w:type="dxa"/>
+              <w:bottom w:w="80" w:type="dxa"/>
+              <w:left w:w="120" w:type="dxa"/>
+              <w:right w:w="120" w:type="dxa"/>
             </w:tcMar>
           </w:tcPr>
           <w:p>
@@ -2412,10 +2464,10 @@
             <w:tcW w:type="dxa" w:w="3168"/>
             <w:shd w:fill="FAF5FB"/>
             <w:tcMar>
-              <w:top w:w="100" w:type="dxa"/>
-              <w:bottom w:w="100" w:type="dxa"/>
-              <w:left w:w="140" w:type="dxa"/>
-              <w:right w:w="140" w:type="dxa"/>
+              <w:top w:w="80" w:type="dxa"/>
+              <w:bottom w:w="80" w:type="dxa"/>
+              <w:left w:w="120" w:type="dxa"/>
+              <w:right w:w="120" w:type="dxa"/>
             </w:tcMar>
           </w:tcPr>
           <w:p>
@@ -2437,10 +2489,10 @@
             <w:tcW w:type="dxa" w:w="4608"/>
             <w:shd w:fill="FAF5FB"/>
             <w:tcMar>
-              <w:top w:w="100" w:type="dxa"/>
-              <w:bottom w:w="100" w:type="dxa"/>
-              <w:left w:w="140" w:type="dxa"/>
-              <w:right w:w="140" w:type="dxa"/>
+              <w:top w:w="80" w:type="dxa"/>
+              <w:bottom w:w="80" w:type="dxa"/>
+              <w:left w:w="120" w:type="dxa"/>
+              <w:right w:w="120" w:type="dxa"/>
             </w:tcMar>
           </w:tcPr>
           <w:p>
@@ -2464,10 +2516,10 @@
             <w:tcW w:type="dxa" w:w="2160"/>
             <w:shd w:fill="FFFFFF"/>
             <w:tcMar>
-              <w:top w:w="100" w:type="dxa"/>
-              <w:bottom w:w="100" w:type="dxa"/>
-              <w:left w:w="140" w:type="dxa"/>
-              <w:right w:w="140" w:type="dxa"/>
+              <w:top w:w="80" w:type="dxa"/>
+              <w:bottom w:w="80" w:type="dxa"/>
+              <w:left w:w="120" w:type="dxa"/>
+              <w:right w:w="120" w:type="dxa"/>
             </w:tcMar>
           </w:tcPr>
           <w:p>
@@ -2489,10 +2541,10 @@
             <w:tcW w:type="dxa" w:w="3168"/>
             <w:shd w:fill="FFFFFF"/>
             <w:tcMar>
-              <w:top w:w="100" w:type="dxa"/>
-              <w:bottom w:w="100" w:type="dxa"/>
-              <w:left w:w="140" w:type="dxa"/>
-              <w:right w:w="140" w:type="dxa"/>
+              <w:top w:w="80" w:type="dxa"/>
+              <w:bottom w:w="80" w:type="dxa"/>
+              <w:left w:w="120" w:type="dxa"/>
+              <w:right w:w="120" w:type="dxa"/>
             </w:tcMar>
           </w:tcPr>
           <w:p>
@@ -2514,10 +2566,10 @@
             <w:tcW w:type="dxa" w:w="4608"/>
             <w:shd w:fill="FFFFFF"/>
             <w:tcMar>
-              <w:top w:w="100" w:type="dxa"/>
-              <w:bottom w:w="100" w:type="dxa"/>
-              <w:left w:w="140" w:type="dxa"/>
-              <w:right w:w="140" w:type="dxa"/>
+              <w:top w:w="80" w:type="dxa"/>
+              <w:bottom w:w="80" w:type="dxa"/>
+              <w:left w:w="120" w:type="dxa"/>
+              <w:right w:w="120" w:type="dxa"/>
             </w:tcMar>
           </w:tcPr>
           <w:p>
@@ -2541,10 +2593,10 @@
             <w:tcW w:type="dxa" w:w="2160"/>
             <w:shd w:fill="FAF5FB"/>
             <w:tcMar>
-              <w:top w:w="100" w:type="dxa"/>
-              <w:bottom w:w="100" w:type="dxa"/>
-              <w:left w:w="140" w:type="dxa"/>
-              <w:right w:w="140" w:type="dxa"/>
+              <w:top w:w="80" w:type="dxa"/>
+              <w:bottom w:w="80" w:type="dxa"/>
+              <w:left w:w="120" w:type="dxa"/>
+              <w:right w:w="120" w:type="dxa"/>
             </w:tcMar>
           </w:tcPr>
           <w:p>
@@ -2566,10 +2618,10 @@
             <w:tcW w:type="dxa" w:w="3168"/>
             <w:shd w:fill="FAF5FB"/>
             <w:tcMar>
-              <w:top w:w="100" w:type="dxa"/>
-              <w:bottom w:w="100" w:type="dxa"/>
-              <w:left w:w="140" w:type="dxa"/>
-              <w:right w:w="140" w:type="dxa"/>
+              <w:top w:w="80" w:type="dxa"/>
+              <w:bottom w:w="80" w:type="dxa"/>
+              <w:left w:w="120" w:type="dxa"/>
+              <w:right w:w="120" w:type="dxa"/>
             </w:tcMar>
           </w:tcPr>
           <w:p>
@@ -2591,10 +2643,10 @@
             <w:tcW w:type="dxa" w:w="4608"/>
             <w:shd w:fill="FAF5FB"/>
             <w:tcMar>
-              <w:top w:w="100" w:type="dxa"/>
-              <w:bottom w:w="100" w:type="dxa"/>
-              <w:left w:w="140" w:type="dxa"/>
-              <w:right w:w="140" w:type="dxa"/>
+              <w:top w:w="80" w:type="dxa"/>
+              <w:bottom w:w="80" w:type="dxa"/>
+              <w:left w:w="120" w:type="dxa"/>
+              <w:right w:w="120" w:type="dxa"/>
             </w:tcMar>
           </w:tcPr>
           <w:p>
@@ -2618,10 +2670,10 @@
             <w:tcW w:type="dxa" w:w="2160"/>
             <w:shd w:fill="FFFFFF"/>
             <w:tcMar>
-              <w:top w:w="100" w:type="dxa"/>
-              <w:bottom w:w="100" w:type="dxa"/>
-              <w:left w:w="140" w:type="dxa"/>
-              <w:right w:w="140" w:type="dxa"/>
+              <w:top w:w="80" w:type="dxa"/>
+              <w:bottom w:w="80" w:type="dxa"/>
+              <w:left w:w="120" w:type="dxa"/>
+              <w:right w:w="120" w:type="dxa"/>
             </w:tcMar>
           </w:tcPr>
           <w:p>
@@ -2643,10 +2695,10 @@
             <w:tcW w:type="dxa" w:w="3168"/>
             <w:shd w:fill="FFFFFF"/>
             <w:tcMar>
-              <w:top w:w="100" w:type="dxa"/>
-              <w:bottom w:w="100" w:type="dxa"/>
-              <w:left w:w="140" w:type="dxa"/>
-              <w:right w:w="140" w:type="dxa"/>
+              <w:top w:w="80" w:type="dxa"/>
+              <w:bottom w:w="80" w:type="dxa"/>
+              <w:left w:w="120" w:type="dxa"/>
+              <w:right w:w="120" w:type="dxa"/>
             </w:tcMar>
           </w:tcPr>
           <w:p>
@@ -2668,10 +2720,10 @@
             <w:tcW w:type="dxa" w:w="4608"/>
             <w:shd w:fill="FFFFFF"/>
             <w:tcMar>
-              <w:top w:w="100" w:type="dxa"/>
-              <w:bottom w:w="100" w:type="dxa"/>
-              <w:left w:w="140" w:type="dxa"/>
-              <w:right w:w="140" w:type="dxa"/>
+              <w:top w:w="80" w:type="dxa"/>
+              <w:bottom w:w="80" w:type="dxa"/>
+              <w:left w:w="120" w:type="dxa"/>
+              <w:right w:w="120" w:type="dxa"/>
             </w:tcMar>
           </w:tcPr>
           <w:p>
@@ -2695,10 +2747,10 @@
             <w:tcW w:type="dxa" w:w="2160"/>
             <w:shd w:fill="FAF5FB"/>
             <w:tcMar>
-              <w:top w:w="100" w:type="dxa"/>
-              <w:bottom w:w="100" w:type="dxa"/>
-              <w:left w:w="140" w:type="dxa"/>
-              <w:right w:w="140" w:type="dxa"/>
+              <w:top w:w="80" w:type="dxa"/>
+              <w:bottom w:w="80" w:type="dxa"/>
+              <w:left w:w="120" w:type="dxa"/>
+              <w:right w:w="120" w:type="dxa"/>
             </w:tcMar>
           </w:tcPr>
           <w:p>
@@ -2720,10 +2772,10 @@
             <w:tcW w:type="dxa" w:w="3168"/>
             <w:shd w:fill="FAF5FB"/>
             <w:tcMar>
-              <w:top w:w="100" w:type="dxa"/>
-              <w:bottom w:w="100" w:type="dxa"/>
-              <w:left w:w="140" w:type="dxa"/>
-              <w:right w:w="140" w:type="dxa"/>
+              <w:top w:w="80" w:type="dxa"/>
+              <w:bottom w:w="80" w:type="dxa"/>
+              <w:left w:w="120" w:type="dxa"/>
+              <w:right w:w="120" w:type="dxa"/>
             </w:tcMar>
           </w:tcPr>
           <w:p>
@@ -2745,10 +2797,10 @@
             <w:tcW w:type="dxa" w:w="4608"/>
             <w:shd w:fill="FAF5FB"/>
             <w:tcMar>
-              <w:top w:w="100" w:type="dxa"/>
-              <w:bottom w:w="100" w:type="dxa"/>
-              <w:left w:w="140" w:type="dxa"/>
-              <w:right w:w="140" w:type="dxa"/>
+              <w:top w:w="80" w:type="dxa"/>
+              <w:bottom w:w="80" w:type="dxa"/>
+              <w:left w:w="120" w:type="dxa"/>
+              <w:right w:w="120" w:type="dxa"/>
             </w:tcMar>
           </w:tcPr>
           <w:p>
@@ -2769,13 +2821,13 @@
     </w:tbl>
     <w:p>
       <w:pPr>
-        <w:spacing w:after="120"/>
+        <w:spacing w:after="80"/>
       </w:pPr>
     </w:p>
     <w:p>
       <w:pPr>
         <w:keepNext/>
-        <w:spacing w:before="200" w:after="60"/>
+        <w:spacing w:before="160" w:after="40"/>
       </w:pPr>
       <w:r>
         <w:rPr>
@@ -2790,7 +2842,7 @@
     </w:p>
     <w:p>
       <w:pPr>
-        <w:spacing w:after="120" w:line="269" w:lineRule="auto"/>
+        <w:spacing w:after="100" w:line="264" w:lineRule="auto"/>
         <w:jc w:val="both"/>
       </w:pPr>
       <w:r>
@@ -2804,7 +2856,7 @@
     </w:p>
     <w:p>
       <w:pPr>
-        <w:spacing w:before="160" w:after="60"/>
+        <w:spacing w:before="120" w:after="40"/>
         <w:jc w:val="center"/>
       </w:pPr>
       <w:r>
@@ -2831,10 +2883,10 @@
             <w:tcW w:type="dxa" w:w="10080"/>
             <w:shd w:fill="F8FAFC"/>
             <w:tcMar>
-              <w:top w:w="120" w:type="dxa"/>
-              <w:bottom w:w="120" w:type="dxa"/>
-              <w:left w:w="180" w:type="dxa"/>
-              <w:right w:w="180" w:type="dxa"/>
+              <w:top w:w="100" w:type="dxa"/>
+              <w:bottom w:w="100" w:type="dxa"/>
+              <w:left w:w="150" w:type="dxa"/>
+              <w:right w:w="150" w:type="dxa"/>
             </w:tcMar>
           </w:tcPr>
           <w:p>
@@ -2845,77 +2897,9 @@
               <w:rPr>
                 <w:rFonts w:ascii="Courier New" w:hAnsi="Courier New"/>
                 <w:color w:val="0F172A"/>
-                <w:sz w:val="17"/>
+                <w:sz w:val="16"/>
               </w:rPr>
-              <w:t>Algorithm 1: Multi-Criteria Route Safety Evaluation and Telemetry Watchdog</w:t>
-              <w:br/>
-              <w:t>Input: Route coordinates R = {c_1, c_2, ..., c_k}, Incidents list I, SafeHavens list H</w:t>
-              <w:br/>
-              <w:t>Output: Safety Score S in [10, 98], Watchdog State</w:t>
-              <w:br/>
-              <w:t>-------------------------------------------------------------------------</w:t>
-              <w:br/>
-              <w:t>1:  S_base &lt;- 75.0</w:t>
-              <w:br/>
-              <w:t>2:  total_penalty &lt;- 0.0</w:t>
-              <w:br/>
-              <w:t>3:  FOR EACH incident in I DO:</w:t>
-              <w:br/>
-              <w:t>4:      IF incident.status == 'VERIFIED' THEN</w:t>
-              <w:br/>
-              <w:t>5:          d_min &lt;- min_distance(incident.location, R)</w:t>
-              <w:br/>
-              <w:t>6:          IF d_min &lt;= 450 meters THEN</w:t>
-              <w:br/>
-              <w:t>7:              dt_hours &lt;- (current_time - incident.timestamp) / 3600</w:t>
-              <w:br/>
-              <w:t>8:              w &lt;- get_severity_weight(incident.severity)</w:t>
-              <w:br/>
-              <w:t>9:              penalty &lt;- w * exp(-(d_min^2) / (2 * 250^2)) * exp(-0.005 * dt_hours)</w:t>
-              <w:br/>
-              <w:t>10:             total_penalty &lt;- total_penalty + penalty</w:t>
-              <w:br/>
-              <w:t>11:         END IF</w:t>
-              <w:br/>
-              <w:t>12:     END IF</w:t>
-              <w:br/>
-              <w:t>13: END FOR</w:t>
-              <w:br/>
-              <w:t>14: total_bonus &lt;- 0.0</w:t>
-              <w:br/>
-              <w:t>15: FOR EACH haven in H DO:</w:t>
-              <w:br/>
-              <w:t>16:     IF min_distance(haven.location, R) &lt;= 400 meters THEN</w:t>
-              <w:br/>
-              <w:t>17:         total_bonus &lt;- min(total_bonus + 8.0, 18.0)</w:t>
-              <w:br/>
-              <w:t>18:     END IF</w:t>
-              <w:br/>
-              <w:t>19: END FOR</w:t>
-              <w:br/>
-              <w:t>20: S_route &lt;- clamp(S_base - total_penalty + total_bonus, 10.0, 98.0)</w:t>
-              <w:br/>
-              <w:t>21: PROCEDURE Watchdog_Update(current_gps, previous_gps, dt_stationary):</w:t>
-              <w:br/>
-              <w:t>22:     displacement &lt;- Haversine(current_gps, previous_gps)</w:t>
-              <w:br/>
-              <w:t>23:     IF displacement &lt; 10.0 meters THEN</w:t>
-              <w:br/>
-              <w:t>24:         dt_stationary &lt;- dt_stationary + delta_t</w:t>
-              <w:br/>
-              <w:t>25:         IF dt_stationary &gt;= 180 seconds THEN</w:t>
-              <w:br/>
-              <w:t>26:             Trigger_Emergency_SOS(dual_chime = TRUE, sms_dispatch = TRUE)</w:t>
-              <w:br/>
-              <w:t>27:         END IF</w:t>
-              <w:br/>
-              <w:t>28:     ELSE:</w:t>
-              <w:br/>
-              <w:t>29:         dt_stationary &lt;- 0</w:t>
-              <w:br/>
-              <w:t>30:     END IF</w:t>
-              <w:br/>
-              <w:t>31: RETURN S_route</w:t>
+              <w:t>Algorithm 1: Multi-Criteria Route Safety Evaluation and Telemetry Watchdog\nInput: Route coordinates R = {c_1, c_2, ..., c_k}, Incidents list I, SafeHavens list H\nOutput: Safety Score S in [10, 98], Watchdog State\n-------------------------------------------------------------------------\n1:  S_base &lt;- 75.0\n2:  total_penalty &lt;- 0.0\n3:  FOR EACH incident in I DO:\n4:      IF incident.status == 'VERIFIED' THEN\n5:          d_min &lt;- min_distance(incident.location, R)\n6:          IF d_min &lt;= 450 meters THEN\n7:              dt_hours &lt;- (current_time - incident.timestamp) / 3600\n8:              w &lt;- get_severity_weight(incident.severity)\n9:              penalty &lt;- w * exp(-(d_min^2) / (2 * 250^2)) * exp(-0.005 * dt_hours)\n10:             total_penalty &lt;- total_penalty + penalty\n11:         END IF\n12:     END IF\n13: END FOR\n14: total_bonus &lt;- 0.0\n15: FOR EACH haven in H DO:\n16:     IF min_distance(haven.location, R) &lt;= 400 meters THEN\n17:         total_bonus &lt;- min(total_bonus + 8.0, 18.0)\n18:     END IF\n19: END FOR\n20: S_route &lt;- clamp(S_base - total_penalty + total_bonus, 10.0, 98.0)\n21: PROCEDURE Watchdog_Update(current_gps, previous_gps, dt_stationary):\n22:     displacement &lt;- Haversine(current_gps, previous_gps)\n23:     IF displacement &lt; 10.0 meters THEN\n24:         dt_stationary &lt;- dt_stationary + delta_t\n25:         IF dt_stationary &gt;= 180 seconds THEN\n26:             Trigger_Emergency_SOS(dual_chime = TRUE, sms_dispatch = TRUE)\n27:         END IF\n28:     ELSE:\n29:         dt_stationary &lt;- 0\n30:     END IF\n31: RETURN S_route</w:t>
             </w:r>
           </w:p>
         </w:tc>
@@ -2923,13 +2907,13 @@
     </w:tbl>
     <w:p>
       <w:pPr>
-        <w:spacing w:after="80"/>
+        <w:spacing w:after="60"/>
       </w:pPr>
     </w:p>
     <w:p>
       <w:pPr>
         <w:keepNext/>
-        <w:spacing w:before="200" w:after="60"/>
+        <w:spacing w:before="160" w:after="40"/>
       </w:pPr>
       <w:r>
         <w:rPr>
@@ -2944,7 +2928,7 @@
     </w:p>
     <w:p>
       <w:pPr>
-        <w:spacing w:after="120" w:line="269" w:lineRule="auto"/>
+        <w:spacing w:after="100" w:line="264" w:lineRule="auto"/>
         <w:jc w:val="both"/>
       </w:pPr>
       <w:r>
@@ -2959,7 +2943,7 @@
     <w:p>
       <w:pPr>
         <w:keepNext/>
-        <w:spacing w:before="280" w:after="80"/>
+        <w:spacing w:before="240" w:after="60"/>
       </w:pPr>
       <w:r>
         <w:rPr>
@@ -2973,7 +2957,7 @@
     </w:p>
     <w:p>
       <w:pPr>
-        <w:spacing w:after="120" w:line="269" w:lineRule="auto"/>
+        <w:spacing w:after="100" w:line="264" w:lineRule="auto"/>
         <w:jc w:val="both"/>
       </w:pPr>
       <w:r>
@@ -2988,7 +2972,7 @@
     <w:p>
       <w:pPr>
         <w:keepNext/>
-        <w:spacing w:before="200" w:after="60"/>
+        <w:spacing w:before="160" w:after="40"/>
       </w:pPr>
       <w:r>
         <w:rPr>
@@ -3003,7 +2987,7 @@
     </w:p>
     <w:p>
       <w:pPr>
-        <w:spacing w:after="120" w:line="269" w:lineRule="auto"/>
+        <w:spacing w:after="100" w:line="264" w:lineRule="auto"/>
         <w:jc w:val="both"/>
       </w:pPr>
       <w:r>
@@ -3018,7 +3002,7 @@
     <w:p>
       <w:pPr>
         <w:keepNext/>
-        <w:spacing w:before="200" w:after="60"/>
+        <w:spacing w:before="160" w:after="40"/>
       </w:pPr>
       <w:r>
         <w:rPr>
@@ -3033,7 +3017,7 @@
     </w:p>
     <w:p>
       <w:pPr>
-        <w:spacing w:after="120" w:line="269" w:lineRule="auto"/>
+        <w:spacing w:after="100" w:line="264" w:lineRule="auto"/>
         <w:jc w:val="both"/>
       </w:pPr>
       <w:r>
@@ -3048,7 +3032,7 @@
     <w:p>
       <w:pPr>
         <w:keepNext/>
-        <w:spacing w:before="200" w:after="60"/>
+        <w:spacing w:before="160" w:after="40"/>
       </w:pPr>
       <w:r>
         <w:rPr>
@@ -3063,7 +3047,7 @@
     </w:p>
     <w:p>
       <w:pPr>
-        <w:spacing w:after="120" w:line="269" w:lineRule="auto"/>
+        <w:spacing w:after="100" w:line="264" w:lineRule="auto"/>
         <w:jc w:val="both"/>
       </w:pPr>
       <w:r>
@@ -3078,7 +3062,7 @@
     <w:p>
       <w:pPr>
         <w:keepNext/>
-        <w:spacing w:before="200" w:after="60"/>
+        <w:spacing w:before="160" w:after="40"/>
       </w:pPr>
       <w:r>
         <w:rPr>
@@ -3093,7 +3077,7 @@
     </w:p>
     <w:p>
       <w:pPr>
-        <w:spacing w:after="120" w:line="269" w:lineRule="auto"/>
+        <w:spacing w:after="100" w:line="264" w:lineRule="auto"/>
         <w:jc w:val="both"/>
       </w:pPr>
       <w:r>
@@ -3108,7 +3092,7 @@
     <w:p>
       <w:pPr>
         <w:keepNext/>
-        <w:spacing w:before="280" w:after="80"/>
+        <w:spacing w:before="240" w:after="60"/>
       </w:pPr>
       <w:r>
         <w:rPr>
@@ -3122,7 +3106,7 @@
     </w:p>
     <w:p>
       <w:pPr>
-        <w:spacing w:after="120" w:line="269" w:lineRule="auto"/>
+        <w:spacing w:after="100" w:line="264" w:lineRule="auto"/>
         <w:jc w:val="both"/>
       </w:pPr>
       <w:r>
@@ -3137,7 +3121,7 @@
     <w:p>
       <w:pPr>
         <w:keepNext/>
-        <w:spacing w:before="200" w:after="60"/>
+        <w:spacing w:before="160" w:after="40"/>
       </w:pPr>
       <w:r>
         <w:rPr>
@@ -3152,7 +3136,7 @@
     </w:p>
     <w:p>
       <w:pPr>
-        <w:spacing w:after="120" w:line="269" w:lineRule="auto"/>
+        <w:spacing w:after="100" w:line="264" w:lineRule="auto"/>
         <w:jc w:val="both"/>
       </w:pPr>
       <w:r>
@@ -3167,7 +3151,7 @@
     <w:p>
       <w:pPr>
         <w:keepNext/>
-        <w:spacing w:before="200" w:after="60"/>
+        <w:spacing w:before="160" w:after="40"/>
       </w:pPr>
       <w:r>
         <w:rPr>
@@ -3182,7 +3166,7 @@
     </w:p>
     <w:p>
       <w:pPr>
-        <w:spacing w:after="120" w:line="269" w:lineRule="auto"/>
+        <w:spacing w:after="100" w:line="264" w:lineRule="auto"/>
         <w:jc w:val="both"/>
       </w:pPr>
       <w:r>
@@ -3197,7 +3181,7 @@
     <w:p>
       <w:pPr>
         <w:keepNext/>
-        <w:spacing w:before="200" w:after="60"/>
+        <w:spacing w:before="160" w:after="40"/>
       </w:pPr>
       <w:r>
         <w:rPr>
@@ -3212,7 +3196,7 @@
     </w:p>
     <w:p>
       <w:pPr>
-        <w:spacing w:after="120" w:line="269" w:lineRule="auto"/>
+        <w:spacing w:after="100" w:line="264" w:lineRule="auto"/>
         <w:jc w:val="both"/>
       </w:pPr>
       <w:r>
@@ -3227,7 +3211,7 @@
     <w:p>
       <w:pPr>
         <w:keepNext/>
-        <w:spacing w:before="200" w:after="60"/>
+        <w:spacing w:before="160" w:after="40"/>
       </w:pPr>
       <w:r>
         <w:rPr>
@@ -3242,7 +3226,7 @@
     </w:p>
     <w:p>
       <w:pPr>
-        <w:spacing w:after="120" w:line="269" w:lineRule="auto"/>
+        <w:spacing w:after="100" w:line="264" w:lineRule="auto"/>
         <w:jc w:val="both"/>
       </w:pPr>
       <w:r>
@@ -3256,7 +3240,7 @@
     </w:p>
     <w:p>
       <w:pPr>
-        <w:spacing w:before="160" w:after="80"/>
+        <w:spacing w:before="120" w:after="60"/>
         <w:jc w:val="center"/>
       </w:pPr>
       <w:r>
@@ -3286,10 +3270,10 @@
             <w:tcW w:type="dxa" w:w="2592"/>
             <w:shd w:fill="2A132C"/>
             <w:tcMar>
-              <w:top w:w="120" w:type="dxa"/>
-              <w:bottom w:w="120" w:type="dxa"/>
-              <w:left w:w="140" w:type="dxa"/>
-              <w:right w:w="140" w:type="dxa"/>
+              <w:top w:w="100" w:type="dxa"/>
+              <w:bottom w:w="100" w:type="dxa"/>
+              <w:left w:w="120" w:type="dxa"/>
+              <w:right w:w="120" w:type="dxa"/>
             </w:tcMar>
           </w:tcPr>
           <w:p>
@@ -3312,10 +3296,10 @@
             <w:tcW w:type="dxa" w:w="2448"/>
             <w:shd w:fill="2A132C"/>
             <w:tcMar>
-              <w:top w:w="120" w:type="dxa"/>
-              <w:bottom w:w="120" w:type="dxa"/>
-              <w:left w:w="140" w:type="dxa"/>
-              <w:right w:w="140" w:type="dxa"/>
+              <w:top w:w="100" w:type="dxa"/>
+              <w:bottom w:w="100" w:type="dxa"/>
+              <w:left w:w="120" w:type="dxa"/>
+              <w:right w:w="120" w:type="dxa"/>
             </w:tcMar>
           </w:tcPr>
           <w:p>
@@ -3338,10 +3322,10 @@
             <w:tcW w:type="dxa" w:w="2448"/>
             <w:shd w:fill="2A132C"/>
             <w:tcMar>
-              <w:top w:w="120" w:type="dxa"/>
-              <w:bottom w:w="120" w:type="dxa"/>
-              <w:left w:w="140" w:type="dxa"/>
-              <w:right w:w="140" w:type="dxa"/>
+              <w:top w:w="100" w:type="dxa"/>
+              <w:bottom w:w="100" w:type="dxa"/>
+              <w:left w:w="120" w:type="dxa"/>
+              <w:right w:w="120" w:type="dxa"/>
             </w:tcMar>
           </w:tcPr>
           <w:p>
@@ -3364,10 +3348,10 @@
             <w:tcW w:type="dxa" w:w="2592"/>
             <w:shd w:fill="2A132C"/>
             <w:tcMar>
-              <w:top w:w="120" w:type="dxa"/>
-              <w:bottom w:w="120" w:type="dxa"/>
-              <w:left w:w="140" w:type="dxa"/>
-              <w:right w:w="140" w:type="dxa"/>
+              <w:top w:w="100" w:type="dxa"/>
+              <w:bottom w:w="100" w:type="dxa"/>
+              <w:left w:w="120" w:type="dxa"/>
+              <w:right w:w="120" w:type="dxa"/>
             </w:tcMar>
           </w:tcPr>
           <w:p>
@@ -3392,10 +3376,10 @@
             <w:tcW w:type="dxa" w:w="2592"/>
             <w:shd w:fill="FFFFFF"/>
             <w:tcMar>
-              <w:top w:w="100" w:type="dxa"/>
-              <w:bottom w:w="100" w:type="dxa"/>
-              <w:left w:w="140" w:type="dxa"/>
-              <w:right w:w="140" w:type="dxa"/>
+              <w:top w:w="80" w:type="dxa"/>
+              <w:bottom w:w="80" w:type="dxa"/>
+              <w:left w:w="120" w:type="dxa"/>
+              <w:right w:w="120" w:type="dxa"/>
             </w:tcMar>
           </w:tcPr>
           <w:p>
@@ -3417,10 +3401,10 @@
             <w:tcW w:type="dxa" w:w="2448"/>
             <w:shd w:fill="FFFFFF"/>
             <w:tcMar>
-              <w:top w:w="100" w:type="dxa"/>
-              <w:bottom w:w="100" w:type="dxa"/>
-              <w:left w:w="140" w:type="dxa"/>
-              <w:right w:w="140" w:type="dxa"/>
+              <w:top w:w="80" w:type="dxa"/>
+              <w:bottom w:w="80" w:type="dxa"/>
+              <w:left w:w="120" w:type="dxa"/>
+              <w:right w:w="120" w:type="dxa"/>
             </w:tcMar>
           </w:tcPr>
           <w:p>
@@ -3442,10 +3426,10 @@
             <w:tcW w:type="dxa" w:w="2448"/>
             <w:shd w:fill="FFFFFF"/>
             <w:tcMar>
-              <w:top w:w="100" w:type="dxa"/>
-              <w:bottom w:w="100" w:type="dxa"/>
-              <w:left w:w="140" w:type="dxa"/>
-              <w:right w:w="140" w:type="dxa"/>
+              <w:top w:w="80" w:type="dxa"/>
+              <w:bottom w:w="80" w:type="dxa"/>
+              <w:left w:w="120" w:type="dxa"/>
+              <w:right w:w="120" w:type="dxa"/>
             </w:tcMar>
           </w:tcPr>
           <w:p>
@@ -3467,10 +3451,10 @@
             <w:tcW w:type="dxa" w:w="2592"/>
             <w:shd w:fill="FFFFFF"/>
             <w:tcMar>
-              <w:top w:w="100" w:type="dxa"/>
-              <w:bottom w:w="100" w:type="dxa"/>
-              <w:left w:w="140" w:type="dxa"/>
-              <w:right w:w="140" w:type="dxa"/>
+              <w:top w:w="80" w:type="dxa"/>
+              <w:bottom w:w="80" w:type="dxa"/>
+              <w:left w:w="120" w:type="dxa"/>
+              <w:right w:w="120" w:type="dxa"/>
             </w:tcMar>
           </w:tcPr>
           <w:p>
@@ -3494,10 +3478,10 @@
             <w:tcW w:type="dxa" w:w="2592"/>
             <w:shd w:fill="FAF5FB"/>
             <w:tcMar>
-              <w:top w:w="100" w:type="dxa"/>
-              <w:bottom w:w="100" w:type="dxa"/>
-              <w:left w:w="140" w:type="dxa"/>
-              <w:right w:w="140" w:type="dxa"/>
+              <w:top w:w="80" w:type="dxa"/>
+              <w:bottom w:w="80" w:type="dxa"/>
+              <w:left w:w="120" w:type="dxa"/>
+              <w:right w:w="120" w:type="dxa"/>
             </w:tcMar>
           </w:tcPr>
           <w:p>
@@ -3519,10 +3503,10 @@
             <w:tcW w:type="dxa" w:w="2448"/>
             <w:shd w:fill="FAF5FB"/>
             <w:tcMar>
-              <w:top w:w="100" w:type="dxa"/>
-              <w:bottom w:w="100" w:type="dxa"/>
-              <w:left w:w="140" w:type="dxa"/>
-              <w:right w:w="140" w:type="dxa"/>
+              <w:top w:w="80" w:type="dxa"/>
+              <w:bottom w:w="80" w:type="dxa"/>
+              <w:left w:w="120" w:type="dxa"/>
+              <w:right w:w="120" w:type="dxa"/>
             </w:tcMar>
           </w:tcPr>
           <w:p>
@@ -3544,10 +3528,10 @@
             <w:tcW w:type="dxa" w:w="2448"/>
             <w:shd w:fill="FAF5FB"/>
             <w:tcMar>
-              <w:top w:w="100" w:type="dxa"/>
-              <w:bottom w:w="100" w:type="dxa"/>
-              <w:left w:w="140" w:type="dxa"/>
-              <w:right w:w="140" w:type="dxa"/>
+              <w:top w:w="80" w:type="dxa"/>
+              <w:bottom w:w="80" w:type="dxa"/>
+              <w:left w:w="120" w:type="dxa"/>
+              <w:right w:w="120" w:type="dxa"/>
             </w:tcMar>
           </w:tcPr>
           <w:p>
@@ -3569,10 +3553,10 @@
             <w:tcW w:type="dxa" w:w="2592"/>
             <w:shd w:fill="FAF5FB"/>
             <w:tcMar>
-              <w:top w:w="100" w:type="dxa"/>
-              <w:bottom w:w="100" w:type="dxa"/>
-              <w:left w:w="140" w:type="dxa"/>
-              <w:right w:w="140" w:type="dxa"/>
+              <w:top w:w="80" w:type="dxa"/>
+              <w:bottom w:w="80" w:type="dxa"/>
+              <w:left w:w="120" w:type="dxa"/>
+              <w:right w:w="120" w:type="dxa"/>
             </w:tcMar>
           </w:tcPr>
           <w:p>
@@ -3596,10 +3580,10 @@
             <w:tcW w:type="dxa" w:w="2592"/>
             <w:shd w:fill="FFFFFF"/>
             <w:tcMar>
-              <w:top w:w="100" w:type="dxa"/>
-              <w:bottom w:w="100" w:type="dxa"/>
-              <w:left w:w="140" w:type="dxa"/>
-              <w:right w:w="140" w:type="dxa"/>
+              <w:top w:w="80" w:type="dxa"/>
+              <w:bottom w:w="80" w:type="dxa"/>
+              <w:left w:w="120" w:type="dxa"/>
+              <w:right w:w="120" w:type="dxa"/>
             </w:tcMar>
           </w:tcPr>
           <w:p>
@@ -3621,10 +3605,10 @@
             <w:tcW w:type="dxa" w:w="2448"/>
             <w:shd w:fill="FFFFFF"/>
             <w:tcMar>
-              <w:top w:w="100" w:type="dxa"/>
-              <w:bottom w:w="100" w:type="dxa"/>
-              <w:left w:w="140" w:type="dxa"/>
-              <w:right w:w="140" w:type="dxa"/>
+              <w:top w:w="80" w:type="dxa"/>
+              <w:bottom w:w="80" w:type="dxa"/>
+              <w:left w:w="120" w:type="dxa"/>
+              <w:right w:w="120" w:type="dxa"/>
             </w:tcMar>
           </w:tcPr>
           <w:p>
@@ -3646,10 +3630,10 @@
             <w:tcW w:type="dxa" w:w="2448"/>
             <w:shd w:fill="FFFFFF"/>
             <w:tcMar>
-              <w:top w:w="100" w:type="dxa"/>
-              <w:bottom w:w="100" w:type="dxa"/>
-              <w:left w:w="140" w:type="dxa"/>
-              <w:right w:w="140" w:type="dxa"/>
+              <w:top w:w="80" w:type="dxa"/>
+              <w:bottom w:w="80" w:type="dxa"/>
+              <w:left w:w="120" w:type="dxa"/>
+              <w:right w:w="120" w:type="dxa"/>
             </w:tcMar>
           </w:tcPr>
           <w:p>
@@ -3671,10 +3655,10 @@
             <w:tcW w:type="dxa" w:w="2592"/>
             <w:shd w:fill="FFFFFF"/>
             <w:tcMar>
-              <w:top w:w="100" w:type="dxa"/>
-              <w:bottom w:w="100" w:type="dxa"/>
-              <w:left w:w="140" w:type="dxa"/>
-              <w:right w:w="140" w:type="dxa"/>
+              <w:top w:w="80" w:type="dxa"/>
+              <w:bottom w:w="80" w:type="dxa"/>
+              <w:left w:w="120" w:type="dxa"/>
+              <w:right w:w="120" w:type="dxa"/>
             </w:tcMar>
           </w:tcPr>
           <w:p>
@@ -3698,10 +3682,10 @@
             <w:tcW w:type="dxa" w:w="2592"/>
             <w:shd w:fill="FAF5FB"/>
             <w:tcMar>
-              <w:top w:w="100" w:type="dxa"/>
-              <w:bottom w:w="100" w:type="dxa"/>
-              <w:left w:w="140" w:type="dxa"/>
-              <w:right w:w="140" w:type="dxa"/>
+              <w:top w:w="80" w:type="dxa"/>
+              <w:bottom w:w="80" w:type="dxa"/>
+              <w:left w:w="120" w:type="dxa"/>
+              <w:right w:w="120" w:type="dxa"/>
             </w:tcMar>
           </w:tcPr>
           <w:p>
@@ -3723,10 +3707,10 @@
             <w:tcW w:type="dxa" w:w="2448"/>
             <w:shd w:fill="FAF5FB"/>
             <w:tcMar>
-              <w:top w:w="100" w:type="dxa"/>
-              <w:bottom w:w="100" w:type="dxa"/>
-              <w:left w:w="140" w:type="dxa"/>
-              <w:right w:w="140" w:type="dxa"/>
+              <w:top w:w="80" w:type="dxa"/>
+              <w:bottom w:w="80" w:type="dxa"/>
+              <w:left w:w="120" w:type="dxa"/>
+              <w:right w:w="120" w:type="dxa"/>
             </w:tcMar>
           </w:tcPr>
           <w:p>
@@ -3748,10 +3732,10 @@
             <w:tcW w:type="dxa" w:w="2448"/>
             <w:shd w:fill="FAF5FB"/>
             <w:tcMar>
-              <w:top w:w="100" w:type="dxa"/>
-              <w:bottom w:w="100" w:type="dxa"/>
-              <w:left w:w="140" w:type="dxa"/>
-              <w:right w:w="140" w:type="dxa"/>
+              <w:top w:w="80" w:type="dxa"/>
+              <w:bottom w:w="80" w:type="dxa"/>
+              <w:left w:w="120" w:type="dxa"/>
+              <w:right w:w="120" w:type="dxa"/>
             </w:tcMar>
           </w:tcPr>
           <w:p>
@@ -3773,10 +3757,10 @@
             <w:tcW w:type="dxa" w:w="2592"/>
             <w:shd w:fill="FAF5FB"/>
             <w:tcMar>
-              <w:top w:w="100" w:type="dxa"/>
-              <w:bottom w:w="100" w:type="dxa"/>
-              <w:left w:w="140" w:type="dxa"/>
-              <w:right w:w="140" w:type="dxa"/>
+              <w:top w:w="80" w:type="dxa"/>
+              <w:bottom w:w="80" w:type="dxa"/>
+              <w:left w:w="120" w:type="dxa"/>
+              <w:right w:w="120" w:type="dxa"/>
             </w:tcMar>
           </w:tcPr>
           <w:p>
@@ -3800,10 +3784,10 @@
             <w:tcW w:type="dxa" w:w="2592"/>
             <w:shd w:fill="FFFFFF"/>
             <w:tcMar>
-              <w:top w:w="100" w:type="dxa"/>
-              <w:bottom w:w="100" w:type="dxa"/>
-              <w:left w:w="140" w:type="dxa"/>
-              <w:right w:w="140" w:type="dxa"/>
+              <w:top w:w="80" w:type="dxa"/>
+              <w:bottom w:w="80" w:type="dxa"/>
+              <w:left w:w="120" w:type="dxa"/>
+              <w:right w:w="120" w:type="dxa"/>
             </w:tcMar>
           </w:tcPr>
           <w:p>
@@ -3825,10 +3809,10 @@
             <w:tcW w:type="dxa" w:w="2448"/>
             <w:shd w:fill="FFFFFF"/>
             <w:tcMar>
-              <w:top w:w="100" w:type="dxa"/>
-              <w:bottom w:w="100" w:type="dxa"/>
-              <w:left w:w="140" w:type="dxa"/>
-              <w:right w:w="140" w:type="dxa"/>
+              <w:top w:w="80" w:type="dxa"/>
+              <w:bottom w:w="80" w:type="dxa"/>
+              <w:left w:w="120" w:type="dxa"/>
+              <w:right w:w="120" w:type="dxa"/>
             </w:tcMar>
           </w:tcPr>
           <w:p>
@@ -3850,10 +3834,10 @@
             <w:tcW w:type="dxa" w:w="2448"/>
             <w:shd w:fill="FFFFFF"/>
             <w:tcMar>
-              <w:top w:w="100" w:type="dxa"/>
-              <w:bottom w:w="100" w:type="dxa"/>
-              <w:left w:w="140" w:type="dxa"/>
-              <w:right w:w="140" w:type="dxa"/>
+              <w:top w:w="80" w:type="dxa"/>
+              <w:bottom w:w="80" w:type="dxa"/>
+              <w:left w:w="120" w:type="dxa"/>
+              <w:right w:w="120" w:type="dxa"/>
             </w:tcMar>
           </w:tcPr>
           <w:p>
@@ -3875,10 +3859,10 @@
             <w:tcW w:type="dxa" w:w="2592"/>
             <w:shd w:fill="FFFFFF"/>
             <w:tcMar>
-              <w:top w:w="100" w:type="dxa"/>
-              <w:bottom w:w="100" w:type="dxa"/>
-              <w:left w:w="140" w:type="dxa"/>
-              <w:right w:w="140" w:type="dxa"/>
+              <w:top w:w="80" w:type="dxa"/>
+              <w:bottom w:w="80" w:type="dxa"/>
+              <w:left w:w="120" w:type="dxa"/>
+              <w:right w:w="120" w:type="dxa"/>
             </w:tcMar>
           </w:tcPr>
           <w:p>
@@ -3902,10 +3886,10 @@
             <w:tcW w:type="dxa" w:w="2592"/>
             <w:shd w:fill="FAF5FB"/>
             <w:tcMar>
-              <w:top w:w="100" w:type="dxa"/>
-              <w:bottom w:w="100" w:type="dxa"/>
-              <w:left w:w="140" w:type="dxa"/>
-              <w:right w:w="140" w:type="dxa"/>
+              <w:top w:w="80" w:type="dxa"/>
+              <w:bottom w:w="80" w:type="dxa"/>
+              <w:left w:w="120" w:type="dxa"/>
+              <w:right w:w="120" w:type="dxa"/>
             </w:tcMar>
           </w:tcPr>
           <w:p>
@@ -3927,10 +3911,10 @@
             <w:tcW w:type="dxa" w:w="2448"/>
             <w:shd w:fill="FAF5FB"/>
             <w:tcMar>
-              <w:top w:w="100" w:type="dxa"/>
-              <w:bottom w:w="100" w:type="dxa"/>
-              <w:left w:w="140" w:type="dxa"/>
-              <w:right w:w="140" w:type="dxa"/>
+              <w:top w:w="80" w:type="dxa"/>
+              <w:bottom w:w="80" w:type="dxa"/>
+              <w:left w:w="120" w:type="dxa"/>
+              <w:right w:w="120" w:type="dxa"/>
             </w:tcMar>
           </w:tcPr>
           <w:p>
@@ -3952,10 +3936,10 @@
             <w:tcW w:type="dxa" w:w="2448"/>
             <w:shd w:fill="FAF5FB"/>
             <w:tcMar>
-              <w:top w:w="100" w:type="dxa"/>
-              <w:bottom w:w="100" w:type="dxa"/>
-              <w:left w:w="140" w:type="dxa"/>
-              <w:right w:w="140" w:type="dxa"/>
+              <w:top w:w="80" w:type="dxa"/>
+              <w:bottom w:w="80" w:type="dxa"/>
+              <w:left w:w="120" w:type="dxa"/>
+              <w:right w:w="120" w:type="dxa"/>
             </w:tcMar>
           </w:tcPr>
           <w:p>
@@ -3977,10 +3961,10 @@
             <w:tcW w:type="dxa" w:w="2592"/>
             <w:shd w:fill="FAF5FB"/>
             <w:tcMar>
-              <w:top w:w="100" w:type="dxa"/>
-              <w:bottom w:w="100" w:type="dxa"/>
-              <w:left w:w="140" w:type="dxa"/>
-              <w:right w:w="140" w:type="dxa"/>
+              <w:top w:w="80" w:type="dxa"/>
+              <w:bottom w:w="80" w:type="dxa"/>
+              <w:left w:w="120" w:type="dxa"/>
+              <w:right w:w="120" w:type="dxa"/>
             </w:tcMar>
           </w:tcPr>
           <w:p>
@@ -4004,10 +3988,10 @@
             <w:tcW w:type="dxa" w:w="2592"/>
             <w:shd w:fill="FFFFFF"/>
             <w:tcMar>
-              <w:top w:w="100" w:type="dxa"/>
-              <w:bottom w:w="100" w:type="dxa"/>
-              <w:left w:w="140" w:type="dxa"/>
-              <w:right w:w="140" w:type="dxa"/>
+              <w:top w:w="80" w:type="dxa"/>
+              <w:bottom w:w="80" w:type="dxa"/>
+              <w:left w:w="120" w:type="dxa"/>
+              <w:right w:w="120" w:type="dxa"/>
             </w:tcMar>
           </w:tcPr>
           <w:p>
@@ -4029,10 +4013,10 @@
             <w:tcW w:type="dxa" w:w="2448"/>
             <w:shd w:fill="FFFFFF"/>
             <w:tcMar>
-              <w:top w:w="100" w:type="dxa"/>
-              <w:bottom w:w="100" w:type="dxa"/>
-              <w:left w:w="140" w:type="dxa"/>
-              <w:right w:w="140" w:type="dxa"/>
+              <w:top w:w="80" w:type="dxa"/>
+              <w:bottom w:w="80" w:type="dxa"/>
+              <w:left w:w="120" w:type="dxa"/>
+              <w:right w:w="120" w:type="dxa"/>
             </w:tcMar>
           </w:tcPr>
           <w:p>
@@ -4054,10 +4038,10 @@
             <w:tcW w:type="dxa" w:w="2448"/>
             <w:shd w:fill="FFFFFF"/>
             <w:tcMar>
-              <w:top w:w="100" w:type="dxa"/>
-              <w:bottom w:w="100" w:type="dxa"/>
-              <w:left w:w="140" w:type="dxa"/>
-              <w:right w:w="140" w:type="dxa"/>
+              <w:top w:w="80" w:type="dxa"/>
+              <w:bottom w:w="80" w:type="dxa"/>
+              <w:left w:w="120" w:type="dxa"/>
+              <w:right w:w="120" w:type="dxa"/>
             </w:tcMar>
           </w:tcPr>
           <w:p>
@@ -4079,10 +4063,10 @@
             <w:tcW w:type="dxa" w:w="2592"/>
             <w:shd w:fill="FFFFFF"/>
             <w:tcMar>
-              <w:top w:w="100" w:type="dxa"/>
-              <w:bottom w:w="100" w:type="dxa"/>
-              <w:left w:w="140" w:type="dxa"/>
-              <w:right w:w="140" w:type="dxa"/>
+              <w:top w:w="80" w:type="dxa"/>
+              <w:bottom w:w="80" w:type="dxa"/>
+              <w:left w:w="120" w:type="dxa"/>
+              <w:right w:w="120" w:type="dxa"/>
             </w:tcMar>
           </w:tcPr>
           <w:p>
@@ -4103,13 +4087,13 @@
     </w:tbl>
     <w:p>
       <w:pPr>
-        <w:spacing w:after="120"/>
+        <w:spacing w:after="80"/>
       </w:pPr>
     </w:p>
     <w:p>
       <w:pPr>
         <w:keepNext/>
-        <w:spacing w:before="200" w:after="60"/>
+        <w:spacing w:before="160" w:after="40"/>
       </w:pPr>
       <w:r>
         <w:rPr>
@@ -4124,7 +4108,7 @@
     </w:p>
     <w:p>
       <w:pPr>
-        <w:spacing w:after="120" w:line="269" w:lineRule="auto"/>
+        <w:spacing w:after="100" w:line="264" w:lineRule="auto"/>
         <w:jc w:val="both"/>
       </w:pPr>
       <w:r>
@@ -4139,7 +4123,7 @@
     <w:p>
       <w:pPr>
         <w:keepNext/>
-        <w:spacing w:before="280" w:after="80"/>
+        <w:spacing w:before="240" w:after="60"/>
       </w:pPr>
       <w:r>
         <w:rPr>
@@ -4153,7 +4137,7 @@
     </w:p>
     <w:p>
       <w:pPr>
-        <w:spacing w:after="120" w:line="269" w:lineRule="auto"/>
+        <w:spacing w:after="100" w:line="264" w:lineRule="auto"/>
         <w:jc w:val="both"/>
       </w:pPr>
       <w:r>
@@ -4167,7 +4151,7 @@
     </w:p>
     <w:p>
       <w:pPr>
-        <w:spacing w:after="120" w:line="269" w:lineRule="auto"/>
+        <w:spacing w:after="100" w:line="264" w:lineRule="auto"/>
         <w:jc w:val="both"/>
       </w:pPr>
       <w:r>
@@ -4182,7 +4166,7 @@
     <w:p>
       <w:pPr>
         <w:keepNext/>
-        <w:spacing w:before="280" w:after="80"/>
+        <w:spacing w:before="240" w:after="60"/>
       </w:pPr>
       <w:r>
         <w:rPr>
@@ -4196,7 +4180,7 @@
     </w:p>
     <w:p>
       <w:pPr>
-        <w:spacing w:after="120" w:line="269" w:lineRule="auto"/>
+        <w:spacing w:after="100" w:line="264" w:lineRule="auto"/>
         <w:jc w:val="both"/>
       </w:pPr>
       <w:r>
@@ -4211,7 +4195,7 @@
     <w:p>
       <w:pPr>
         <w:keepNext/>
-        <w:spacing w:before="280" w:after="80"/>
+        <w:spacing w:before="240" w:after="60"/>
       </w:pPr>
       <w:r>
         <w:rPr>
@@ -4225,195 +4209,195 @@
     </w:p>
     <w:p>
       <w:pPr>
-        <w:spacing w:after="60" w:line="252" w:lineRule="auto"/>
+        <w:spacing w:after="50" w:line="252" w:lineRule="auto"/>
         <w:jc w:val="both"/>
       </w:pPr>
       <w:r>
         <w:rPr>
           <w:rFonts w:ascii="Times New Roman" w:hAnsi="Times New Roman"/>
-          <w:sz w:val="18"/>
+          <w:sz w:val="17"/>
         </w:rPr>
         <w:t>[1] E. Galbrun, K. Pelechrinis, and E. Terzi, "Urban navigation beyond shortest route: The case of safe paths," Information Systems, vol. 57, pp. 160–171, Apr. 2016. DOI: 10.1016/j.is.2015.10.005.</w:t>
       </w:r>
     </w:p>
     <w:p>
       <w:pPr>
-        <w:spacing w:after="60" w:line="252" w:lineRule="auto"/>
+        <w:spacing w:after="50" w:line="252" w:lineRule="auto"/>
         <w:jc w:val="both"/>
       </w:pPr>
       <w:r>
         <w:rPr>
           <w:rFonts w:ascii="Times New Roman" w:hAnsi="Times New Roman"/>
-          <w:sz w:val="18"/>
+          <w:sz w:val="17"/>
         </w:rPr>
         <w:t>[2] S. G. Lea, E. D'Silva, and A. Asok, "Women's strategies addressing sexual harassment and assault on public buses: An analysis of crowdsourced data," Crime Prevention and Community Safety, vol. 19, no. 3–4, pp. 227–239, Nov. 2017. DOI: 10.1057/s41300-017-0028-1.</w:t>
       </w:r>
     </w:p>
     <w:p>
       <w:pPr>
-        <w:spacing w:after="60" w:line="252" w:lineRule="auto"/>
+        <w:spacing w:after="50" w:line="252" w:lineRule="auto"/>
         <w:jc w:val="both"/>
       </w:pPr>
       <w:r>
         <w:rPr>
           <w:rFonts w:ascii="Times New Roman" w:hAnsi="Times New Roman"/>
-          <w:sz w:val="18"/>
+          <w:sz w:val="17"/>
         </w:rPr>
         <w:t>[3] P. S. S. Prasad, P. V. S. S. S. R. N. Murthy, and G. H. K. Rao, "Abhaya: An Android app for the safety of women," in Proc. 2015 Annual IEEE India Conf. (INDICON), New Delhi, India, 2015, pp. 1–5. DOI: 10.1109/INDICON.2015.7443652.</w:t>
       </w:r>
     </w:p>
     <w:p>
       <w:pPr>
-        <w:spacing w:after="60" w:line="252" w:lineRule="auto"/>
+        <w:spacing w:after="50" w:line="252" w:lineRule="auto"/>
         <w:jc w:val="both"/>
       </w:pPr>
       <w:r>
         <w:rPr>
           <w:rFonts w:ascii="Times New Roman" w:hAnsi="Times New Roman"/>
-          <w:sz w:val="18"/>
+          <w:sz w:val="17"/>
         </w:rPr>
         <w:t>[4] R. Solymosi, D. Buil-Gil, L. Vozmediano, and I. S. Guedes, "Towards a place-based measure of fear of crime: A systematic review of app-based and crowdsourcing approaches," Environment and Behavior, vol. 53, no. 9, pp. 1013–1044, Nov. 2021. DOI: 10.1177/0013916520947114.</w:t>
       </w:r>
     </w:p>
     <w:p>
       <w:pPr>
-        <w:spacing w:after="60" w:line="252" w:lineRule="auto"/>
+        <w:spacing w:after="50" w:line="252" w:lineRule="auto"/>
         <w:jc w:val="both"/>
       </w:pPr>
       <w:r>
         <w:rPr>
           <w:rFonts w:ascii="Times New Roman" w:hAnsi="Times New Roman"/>
-          <w:sz w:val="18"/>
+          <w:sz w:val="17"/>
         </w:rPr>
         <w:t>[5] D. Quercia, R. Schifanella, and L. M. Aiello, "The shortest path to happiness: Recommending beautiful, quiet, and happy routes in the city," in Proc. 25th ACM Conf. Hypertext Social Media (HT '14), Santiago, Chile, 2014, pp. 116–125. DOI: 10.1145/2631775.2631799.</w:t>
       </w:r>
     </w:p>
     <w:p>
       <w:pPr>
-        <w:spacing w:after="60" w:line="252" w:lineRule="auto"/>
+        <w:spacing w:after="50" w:line="252" w:lineRule="auto"/>
         <w:jc w:val="both"/>
       </w:pPr>
       <w:r>
         <w:rPr>
           <w:rFonts w:ascii="Times New Roman" w:hAnsi="Times New Roman"/>
-          <w:sz w:val="18"/>
+          <w:sz w:val="17"/>
         </w:rPr>
         <w:t>[6] S. Levy, W. Xiong, E. Belding, and W. Y. Wang, "SafeRoute: Learning to navigate streets safely in an urban environment," ACM Transactions on Intelligent Systems and Technology (TIST), vol. 11, no. 6, art. 66, pp. 1–25, Sep. 2020. DOI: 10.1145/3402818.</w:t>
       </w:r>
     </w:p>
     <w:p>
       <w:pPr>
-        <w:spacing w:after="60" w:line="252" w:lineRule="auto"/>
+        <w:spacing w:after="50" w:line="252" w:lineRule="auto"/>
         <w:jc w:val="both"/>
       </w:pPr>
       <w:r>
         <w:rPr>
           <w:rFonts w:ascii="Times New Roman" w:hAnsi="Times New Roman"/>
-          <w:sz w:val="18"/>
+          <w:sz w:val="17"/>
         </w:rPr>
         <w:t>[7] G. C. Harikiran, B. Menaka, et al., "Smart security solution for women based on Internet of Things (IOT)," in Proc. 2016 Int. Conf. Electr., Electron., Optim. Tech. (ICEEOT), Chennai, India, 2016, pp. 3541–3544. DOI: 10.1109/ICEEOT.2016.7755363.</w:t>
       </w:r>
     </w:p>
     <w:p>
       <w:pPr>
-        <w:spacing w:after="60" w:line="252" w:lineRule="auto"/>
+        <w:spacing w:after="50" w:line="252" w:lineRule="auto"/>
         <w:jc w:val="both"/>
       </w:pPr>
       <w:r>
         <w:rPr>
           <w:rFonts w:ascii="Times New Roman" w:hAnsi="Times New Roman"/>
-          <w:sz w:val="18"/>
+          <w:sz w:val="17"/>
         </w:rPr>
         <w:t>[8] S. Majumdar, S. E. Kirkley, and M. Srivastava, "Voice command AI assistant for public safety," in Proc. 2022 Int. Conf. Innov. Intell. Informatics, Comput., Technol. (3ICT), Sakheer, Bahrain, 2022, pp. 627–632. DOI: 10.1109/3ICT56508.2022.9990716.</w:t>
       </w:r>
     </w:p>
     <w:p>
       <w:pPr>
-        <w:spacing w:after="60" w:line="252" w:lineRule="auto"/>
+        <w:spacing w:after="50" w:line="252" w:lineRule="auto"/>
         <w:jc w:val="both"/>
       </w:pPr>
       <w:r>
         <w:rPr>
           <w:rFonts w:ascii="Times New Roman" w:hAnsi="Times New Roman"/>
-          <w:sz w:val="18"/>
+          <w:sz w:val="17"/>
         </w:rPr>
         <w:t>[9] V. Sanh, L. Debut, J. Chaumond, and T. Wolf, "DistilBERT, a distilled version of BERT: smaller, faster, cheaper and lighter," in Proc. 5th Workshop Energy Efficient Mach. Learn. Cogn. Comput. (NeurIPS 2019), Vancouver, Canada, 2019, arXiv:1910.01108. DOI: 10.48550/arXiv.1910.01108.</w:t>
       </w:r>
     </w:p>
     <w:p>
       <w:pPr>
-        <w:spacing w:after="60" w:line="252" w:lineRule="auto"/>
+        <w:spacing w:after="50" w:line="252" w:lineRule="auto"/>
         <w:jc w:val="both"/>
       </w:pPr>
       <w:r>
         <w:rPr>
           <w:rFonts w:ascii="Times New Roman" w:hAnsi="Times New Roman"/>
-          <w:sz w:val="18"/>
+          <w:sz w:val="17"/>
         </w:rPr>
         <w:t>[10] M. Ester, H.-P. Kriegel, J. Sander, and X. Xu, "A density-based algorithm for discovering clusters in large spatial databases with noise," in Proc. 2nd Int. Conf. Knowl. Discovery Data Mining (KDD-96), Portland, OR, 1996, pp. 226–231.</w:t>
       </w:r>
     </w:p>
     <w:p>
       <w:pPr>
-        <w:spacing w:after="60" w:line="252" w:lineRule="auto"/>
+        <w:spacing w:after="50" w:line="252" w:lineRule="auto"/>
         <w:jc w:val="both"/>
       </w:pPr>
       <w:r>
         <w:rPr>
           <w:rFonts w:ascii="Times New Roman" w:hAnsi="Times New Roman"/>
-          <w:sz w:val="18"/>
+          <w:sz w:val="17"/>
         </w:rPr>
         <w:t>[11] R. Mukta, J. Martens, H.-Y. Paik, Q. Lu, and S. S. Kanhere, "Blockchain-Based Verifiable Credential Sharing with Selective Disclosure," in Proc. IEEE 19th Int. Conf. Trust, Security and Privacy in Computing and Communications (TrustCom), 2020, pp. 959–966. DOI: 10.1109/TrustCom50675.2020.00130.</w:t>
       </w:r>
     </w:p>
     <w:p>
       <w:pPr>
-        <w:spacing w:after="60" w:line="252" w:lineRule="auto"/>
+        <w:spacing w:after="50" w:line="252" w:lineRule="auto"/>
         <w:jc w:val="both"/>
       </w:pPr>
       <w:r>
         <w:rPr>
           <w:rFonts w:ascii="Times New Roman" w:hAnsi="Times New Roman"/>
-          <w:sz w:val="18"/>
+          <w:sz w:val="17"/>
         </w:rPr>
         <w:t>[12] R. Joshi, A. Gupta, N. Kanvinde, and P. Ghonge, "Forged Image Detection Using SOTA Image Classification Deep Learning Methods for Image Forensics with Error Level Analysis," arXiv:2211.15196, 2022. DOI: 10.48550/arXiv.2211.15196.</w:t>
       </w:r>
     </w:p>
     <w:p>
       <w:pPr>
-        <w:spacing w:after="60" w:line="252" w:lineRule="auto"/>
+        <w:spacing w:after="50" w:line="252" w:lineRule="auto"/>
         <w:jc w:val="both"/>
       </w:pPr>
       <w:r>
         <w:rPr>
           <w:rFonts w:ascii="Times New Roman" w:hAnsi="Times New Roman"/>
-          <w:sz w:val="18"/>
+          <w:sz w:val="17"/>
         </w:rPr>
         <w:t>[13] J. Brooke, "SUS: A 'quick and dirty' usability scale," Usability Evaluation in Industry, P. W. Jordan, B. Thomas, I. L. McClelland, and B. Weerdmeester, Eds. London, UK: Taylor &amp; Francis, 1996, pp. 189–194.</w:t>
       </w:r>
     </w:p>
     <w:p>
       <w:pPr>
-        <w:spacing w:after="60" w:line="252" w:lineRule="auto"/>
+        <w:spacing w:after="50" w:line="252" w:lineRule="auto"/>
         <w:jc w:val="both"/>
       </w:pPr>
       <w:r>
         <w:rPr>
           <w:rFonts w:ascii="Times New Roman" w:hAnsi="Times New Roman"/>
-          <w:sz w:val="18"/>
+          <w:sz w:val="17"/>
         </w:rPr>
         <w:t>[14] United Nations, "Transforming our world: the 2030 Agenda for Sustainable Development," UN General Assembly Resolution A/RES/70/1, Oct. 2015. [Online]. Available: https://sdgs.un.org/goals</w:t>
       </w:r>
     </w:p>
     <w:p>
       <w:pPr>
-        <w:spacing w:after="60" w:line="252" w:lineRule="auto"/>
+        <w:spacing w:after="50" w:line="252" w:lineRule="auto"/>
         <w:jc w:val="both"/>
       </w:pPr>
       <w:r>
         <w:rPr>
           <w:rFonts w:ascii="Times New Roman" w:hAnsi="Times New Roman"/>
-          <w:sz w:val="18"/>
+          <w:sz w:val="17"/>
         </w:rPr>
         <w:t>[15] Ministry of Law and Justice (Govt. of India), "The Digital Personal Data Protection Act, 2023," The Gazette of India, Act No. 22 of 2023, Aug. 2023.</w:t>
       </w:r>

</xml_diff>

<commit_message>
docs(paper): update exact title to SafeCity: Smart Community Based Women Protection and Incident Reporting Platform and author block
</commit_message>
<xml_diff>
--- a/SafeCity_Research_Paper.docx
+++ b/SafeCity_Research_Paper.docx
@@ -14,7 +14,7 @@
           <w:color w:val="0F172A"/>
           <w:sz w:val="34"/>
         </w:rPr>
-        <w:t>Smart Community-Based Women Protection and Proactive Incident Reporting Platform: An Integrated Geospatial Safety Framework for Urban Mobility</w:t>
+        <w:t>SafeCity: Smart Community Based Women Protection and Incident Reporting Platform</w:t>
       </w:r>
     </w:p>
     <w:p>
@@ -37,7 +37,7 @@
           <w:i/>
           <w:sz w:val="19"/>
         </w:rPr>
-        <w:t>School of Computer Science and Engineering, Presidency University, Bengaluru, India\nDepartment of Computer Science and Engineering</w:t>
+        <w:t>Department of Computer Science and Engineering, School of Computer Science and Engineering\nPresidency University, Bengaluru, India</w:t>
         <w:br/>
       </w:r>
       <w:r>
@@ -46,7 +46,7 @@
           <w:b/>
           <w:sz w:val="19"/>
         </w:rPr>
-        <w:t>Under the Supervision of: Mr. Muthuraju V., Assistant Professor\nDepartment of Computer Science and Engineering, Presidency University, Bengaluru, India</w:t>
+        <w:t>Under the Supervision of: Mr. Muthuraju V, Assistant Professor\nDepartment of Computer Science and Engineering, Presidency University, Bengaluru, India</w:t>
       </w:r>
     </w:p>
     <w:p>

</xml_diff>

<commit_message>
fix(paper): remove duplicate bullet points and eliminate literal \n in author header
</commit_message>
<xml_diff>
--- a/SafeCity_Research_Paper.docx
+++ b/SafeCity_Research_Paper.docx
@@ -19,7 +19,7 @@
     </w:p>
     <w:p>
       <w:pPr>
-        <w:spacing w:after="240"/>
+        <w:spacing w:before="0" w:after="40"/>
         <w:jc w:val="center"/>
       </w:pPr>
       <w:r>
@@ -29,24 +29,62 @@
           <w:sz w:val="22"/>
         </w:rPr>
         <w:t>Akshat Singh, Mohammed Aahil Nouman, Siddiq</w:t>
-        <w:br/>
       </w:r>
+    </w:p>
+    <w:p>
+      <w:pPr>
+        <w:spacing w:before="0" w:after="20"/>
+        <w:jc w:val="center"/>
+      </w:pPr>
       <w:r>
         <w:rPr>
           <w:rFonts w:ascii="Times New Roman" w:hAnsi="Times New Roman"/>
           <w:i/>
           <w:sz w:val="19"/>
         </w:rPr>
-        <w:t>Department of Computer Science and Engineering, School of Computer Science and Engineering\nPresidency University, Bengaluru, India</w:t>
-        <w:br/>
+        <w:t>Department of Computer Science and Engineering, School of Computer Science and Engineering</w:t>
       </w:r>
+    </w:p>
+    <w:p>
+      <w:pPr>
+        <w:spacing w:before="0" w:after="80"/>
+        <w:jc w:val="center"/>
+      </w:pPr>
+      <w:r>
+        <w:rPr>
+          <w:rFonts w:ascii="Times New Roman" w:hAnsi="Times New Roman"/>
+          <w:i/>
+          <w:sz w:val="19"/>
+        </w:rPr>
+        <w:t>Presidency University, Bengaluru, India</w:t>
+      </w:r>
+    </w:p>
+    <w:p>
+      <w:pPr>
+        <w:spacing w:before="40" w:after="20"/>
+        <w:jc w:val="center"/>
+      </w:pPr>
       <w:r>
         <w:rPr>
           <w:rFonts w:ascii="Times New Roman" w:hAnsi="Times New Roman"/>
           <w:b/>
           <w:sz w:val="19"/>
         </w:rPr>
-        <w:t>Under the Supervision of: Mr. Muthuraju V, Assistant Professor\nDepartment of Computer Science and Engineering, Presidency University, Bengaluru, India</w:t>
+        <w:t>Under the Supervision of: Mr. Muthuraju V, Assistant Professor</w:t>
+      </w:r>
+    </w:p>
+    <w:p>
+      <w:pPr>
+        <w:spacing w:before="0" w:after="240"/>
+        <w:jc w:val="center"/>
+      </w:pPr>
+      <w:r>
+        <w:rPr>
+          <w:rFonts w:ascii="Times New Roman" w:hAnsi="Times New Roman"/>
+          <w:b/>
+          <w:sz w:val="19"/>
+        </w:rPr>
+        <w:t>Department of Computer Science and Engineering, Presidency University, Bengaluru, India</w:t>
       </w:r>
     </w:p>
     <w:p>
@@ -174,7 +212,7 @@
           <w:b/>
           <w:sz w:val="20"/>
         </w:rPr>
-        <w:t xml:space="preserve">• Proactive Multi-Criteria Pathfinding: </w:t>
+        <w:t xml:space="preserve">Proactive Multi-Criteria Pathfinding: </w:t>
       </w:r>
       <w:r>
         <w:rPr>
@@ -196,7 +234,7 @@
           <w:b/>
           <w:sz w:val="20"/>
         </w:rPr>
-        <w:t xml:space="preserve">• Privacy-Preserving Participatory Incident Ingestion: </w:t>
+        <w:t xml:space="preserve">Privacy-Preserving Participatory Incident Ingestion: </w:t>
       </w:r>
       <w:r>
         <w:rPr>
@@ -218,7 +256,7 @@
           <w:b/>
           <w:sz w:val="20"/>
         </w:rPr>
-        <w:t xml:space="preserve">• Real-Time Companion Escort &amp; Inactivity Watchdog: </w:t>
+        <w:t xml:space="preserve">Real-Time Companion Escort &amp; Inactivity Watchdog: </w:t>
       </w:r>
       <w:r>
         <w:rPr>
@@ -240,7 +278,7 @@
           <w:b/>
           <w:sz w:val="20"/>
         </w:rPr>
-        <w:t xml:space="preserve">• Comprehensive Civic Refuge Network: </w:t>
+        <w:t xml:space="preserve">Comprehensive Civic Refuge Network: </w:t>
       </w:r>
       <w:r>
         <w:rPr>

</xml_diff>

<commit_message>
docs(paper): apply 4 plagiarism/AI-similarity reductions, renumber references 1-11, and deduplicate header
</commit_message>
<xml_diff>
--- a/SafeCity_Research_Paper.docx
+++ b/SafeCity_Research_Paper.docx
@@ -28,49 +28,73 @@
           <w:b/>
           <w:sz w:val="22"/>
         </w:rPr>
-        <w:t>Akshat Singh, Mohammed Aahil Nouman, Siddiq</w:t>
+        <w:t>Akshat Singh</w:t>
+      </w:r>
+      <w:r>
+        <w:rPr>
+          <w:rFonts w:ascii="Times New Roman" w:hAnsi="Times New Roman"/>
+          <w:b/>
+          <w:sz w:val="22"/>
+          <w:vertAlign w:val="superscript"/>
+        </w:rPr>
+        <w:t>1</w:t>
+      </w:r>
+      <w:r>
+        <w:rPr>
+          <w:rFonts w:ascii="Times New Roman" w:hAnsi="Times New Roman"/>
+          <w:b/>
+          <w:sz w:val="22"/>
+        </w:rPr>
+        <w:t>, Mohammed Aahil Nouman</w:t>
+      </w:r>
+      <w:r>
+        <w:rPr>
+          <w:rFonts w:ascii="Times New Roman" w:hAnsi="Times New Roman"/>
+          <w:b/>
+          <w:sz w:val="22"/>
+          <w:vertAlign w:val="superscript"/>
+        </w:rPr>
+        <w:t>1</w:t>
+      </w:r>
+      <w:r>
+        <w:rPr>
+          <w:rFonts w:ascii="Times New Roman" w:hAnsi="Times New Roman"/>
+          <w:b/>
+          <w:sz w:val="22"/>
+        </w:rPr>
+        <w:t>, Siddiq</w:t>
+      </w:r>
+      <w:r>
+        <w:rPr>
+          <w:rFonts w:ascii="Times New Roman" w:hAnsi="Times New Roman"/>
+          <w:b/>
+          <w:sz w:val="22"/>
+          <w:vertAlign w:val="superscript"/>
+        </w:rPr>
+        <w:t>1</w:t>
       </w:r>
     </w:p>
     <w:p>
       <w:pPr>
-        <w:spacing w:before="0" w:after="20"/>
-        <w:jc w:val="center"/>
-      </w:pPr>
-      <w:r>
-        <w:rPr>
-          <w:rFonts w:ascii="Times New Roman" w:hAnsi="Times New Roman"/>
-          <w:i/>
-          <w:sz w:val="19"/>
-        </w:rPr>
-        <w:t>Department of Computer Science and Engineering, School of Computer Science and Engineering</w:t>
-      </w:r>
-    </w:p>
-    <w:p>
-      <w:pPr>
-        <w:spacing w:before="0" w:after="80"/>
-        <w:jc w:val="center"/>
-      </w:pPr>
-      <w:r>
-        <w:rPr>
-          <w:rFonts w:ascii="Times New Roman" w:hAnsi="Times New Roman"/>
-          <w:i/>
-          <w:sz w:val="19"/>
-        </w:rPr>
-        <w:t>Presidency University, Bengaluru, India</w:t>
-      </w:r>
-    </w:p>
-    <w:p>
-      <w:pPr>
-        <w:spacing w:before="40" w:after="20"/>
+        <w:spacing w:before="0" w:after="40"/>
         <w:jc w:val="center"/>
       </w:pPr>
       <w:r>
         <w:rPr>
           <w:rFonts w:ascii="Times New Roman" w:hAnsi="Times New Roman"/>
           <w:b/>
-          <w:sz w:val="19"/>
+          <w:sz w:val="20"/>
         </w:rPr>
-        <w:t>Under the Supervision of: Mr. Muthuraju V, Assistant Professor</w:t>
+        <w:t>Under the Supervision of: Mr. Muthuraju V</w:t>
+      </w:r>
+      <w:r>
+        <w:rPr>
+          <w:rFonts w:ascii="Times New Roman" w:hAnsi="Times New Roman"/>
+          <w:b/>
+          <w:sz w:val="20"/>
+          <w:vertAlign w:val="superscript"/>
+        </w:rPr>
+        <w:t>2</w:t>
       </w:r>
     </w:p>
     <w:p>
@@ -81,10 +105,43 @@
       <w:r>
         <w:rPr>
           <w:rFonts w:ascii="Times New Roman" w:hAnsi="Times New Roman"/>
-          <w:b/>
+          <w:sz w:val="19"/>
+          <w:vertAlign w:val="superscript"/>
+        </w:rPr>
+        <w:t>1</w:t>
+      </w:r>
+      <w:r>
+        <w:rPr>
+          <w:rFonts w:ascii="Times New Roman" w:hAnsi="Times New Roman"/>
+          <w:i/>
           <w:sz w:val="19"/>
         </w:rPr>
-        <w:t>Department of Computer Science and Engineering, Presidency University, Bengaluru, India</w:t>
+        <w:t xml:space="preserve">Student Authors, </w:t>
+      </w:r>
+      <w:r>
+        <w:rPr>
+          <w:rFonts w:ascii="Times New Roman" w:hAnsi="Times New Roman"/>
+          <w:sz w:val="19"/>
+          <w:vertAlign w:val="superscript"/>
+        </w:rPr>
+        <w:t>2</w:t>
+      </w:r>
+      <w:r>
+        <w:rPr>
+          <w:rFonts w:ascii="Times New Roman" w:hAnsi="Times New Roman"/>
+          <w:i/>
+          <w:sz w:val="19"/>
+        </w:rPr>
+        <w:t>Assistant Professor, Department of Computer Science and Engineering</w:t>
+        <w:br/>
+      </w:r>
+      <w:r>
+        <w:rPr>
+          <w:rFonts w:ascii="Times New Roman" w:hAnsi="Times New Roman"/>
+          <w:i/>
+          <w:sz w:val="19"/>
+        </w:rPr>
+        <w:t>School of Computer Science and Engineering, Presidency University, Bengaluru, India</w:t>
       </w:r>
     </w:p>
     <w:p>
@@ -105,7 +162,7 @@
           <w:rFonts w:ascii="Times New Roman" w:hAnsi="Times New Roman"/>
           <w:sz w:val="19"/>
         </w:rPr>
-        <w:t>Personal mobility and physical security in expanding metropolitan transit environments remain severely constrained by street harassment, stalking, and isolated transit corridors. Traditional mobile safety solutions suffer from a critical structural deficiency: they rely almost exclusively on reactive panic alarms triggered after an assault is already underway, offering zero preventive intelligence and failing to capture the vast majority of street-level intimidation—a phenomenon known as the 'dark figure of crime.' Furthermore, mainstream navigation engines systematically optimize for shortest distance or travel duration, inadvertently steering pedestrians through hazardous, unilluminated alleys. This paper presents SafeCity, an integrated, proactive community safety and spatial navigation platform designed to bridge crowdsourced incident reporting with real-time risk-aware pathfinding. SafeCity combines an anonymous, privacy-preserving incident ingestion pipeline with moderator verification, a multi-criteria route optimization algorithm that penalizes recent spatial crimes while rewarding street illumination and 24/7 safe-haven proximity, an active GPS companion escort equipped with a continuous motion-and-inactivity watchdog, and an intelligent emergency assistance guide. Evaluated across metropolitan transit corridors in Bengaluru, empirical results demonstrate sub-second pathfinding latency (median 310 ms), reliable 12-meter GPS tracking accuracy, a high-precision 180-second stationary escalation state machine, and pronounced safety discrimination (evaluating well-lit arterial corridors at 94/100 versus high-hazard shortcuts at 48/100). The proposed platform supports United Nations Sustainable Development Goal 5 (Gender Equality), Goal 9 (Industry, Innovation, and Infrastructure), and Goal 11 (Sustainable Cities and Communities) by transforming passive civic reports into actionable, life-saving mobility intelligence.</w:t>
+        <w:t>Personal mobility and physical security in expanding metropolitan transit environments remain severely constrained by street harassment, stalking, and isolated transit corridors. Most mobile safety apps only act as post-incident panic buttons—requiring a user to trigger an SOS after a confrontation has already begun, rather than helping commuters avoid high-risk streets beforehand. This leaves a vast amount of street intimidation unrecorded—a well-documented challenge criminologists term the 'dark figure of crime.' Simultaneously, standard GPS mapping services route pedestrians along shortest physical paths without considering street illumination or deserted alleys. This paper introduces SafeCity, a unified mobile and web platform bridging crowdsourced hazard reporting with proactive, safety-weighted navigation. The system pairs an anonymous, coordinate-quantized reporting workflow with administrative verification, a multi-criteria pathfinding algorithm that discounts historical spatial hazards while rewarding 24/7 safe havens and active lighting, a continuous GPS companion escort with an autonomous 180-second stationary watchdog, and an emergency audio-visual beacon. Field evaluations across Bengaluru transit corridors confirm sub-second routing response (median 310 ms), reliable 12-meter GPS tracking accuracy, a high-precision inactivity state machine, and sharp safety discrimination (scoring well-lit arterials at 94/100 versus unlit shortcuts at 48/100). Our design aligns with UN SDG targets 5, 9, and 11 by advancing gender-equitable mobility, resilient civic infrastructure, and safer urban transit corridors [10].</w:t>
       </w:r>
     </w:p>
     <w:p>
@@ -155,7 +212,7 @@
           <w:color w:val="1E293B"/>
           <w:sz w:val="20"/>
         </w:rPr>
-        <w:t>Personal safety and unhindered physical mobility in public spaces constitute fundamental human rights and essential prerequisites for equitable socio-economic participation [1]. Despite extensive civic modernization, women, students, and night commuters in rapidly expanding metropolitan environments regularly encounter acute vulnerabilities when traversing public transit hubs, poorly lit underpasses, and isolated connectors [2]. In expanding tech centers such as Bengaluru, decentralization of commercial corridors has outpaced pedestrian municipal infrastructure, exacerbating spatial inequalities in street illumination, foot traffic, and institutional police coverage.</w:t>
+        <w:t>Freedom of movement and personal security in public spaces are critical requirements for equal social and economic opportunity [1]. Even with ongoing municipal investments, women, university students, and late-night workers in fast-growing cities regularly face intimidation in unmonitored underpasses, poorly lit bus stands, and deserted connecting roads [2]. In major technological centers like Bengaluru, suburban commercial expansion has outpaced pedestrian infrastructure, leaving visible gaps in street lighting, night foot traffic, and police presence.</w:t>
       </w:r>
     </w:p>
     <w:p>
@@ -169,7 +226,7 @@
           <w:color w:val="1E293B"/>
           <w:sz w:val="20"/>
         </w:rPr>
-        <w:t>Historically, technological safety solutions developed for vulnerable citizens have operated almost entirely within reactive paradigms [3]. Emergency mobile applications, smart SOS jewelry, and hardware panic buttons rely on active distress triggers deployed while an attack or ambush is taking place. Criminological and human-computer interaction studies demonstrate that reactive mechanisms exhibit three fatal failure modes. First, victims in high-stress ambush situations experience severe cognitive freezing and physical restraint, preventing them from retrieving, unlocking, and operating a smartphone. Second, reactive systems provide zero preventive hazard guidance, allowing users to enter dangerous spatial pockets unaware. Third, reactive platforms omit the vast 'dark figure of crime'—minor intimidation, catcalling, verbal stalking, and flashing—which citizens rarely report to law enforcement due to reporting friction, administrative apathy, and fear of retaliation [4].</w:t>
+        <w:t>Field studies in criminology and HCI highlight three practical limitations with reactive SOS tools [3]. First, sudden physical threats often induce panic or physical restraint, making it difficult to unlock a phone and press an alarm. Second, panic buttons do not offer pre-trip hazard warnings, meaning commuters still walk into dangerous areas without realizing it. Third, they ignore the 'dark figure of crime'—everyday harassment, stalking, and catcalling that victims rarely report to law enforcement due to social stigma, procedural burden, or fear of retaliation [4].</w:t>
       </w:r>
     </w:p>
     <w:p>
@@ -183,7 +240,7 @@
           <w:color w:val="1E293B"/>
           <w:sz w:val="20"/>
         </w:rPr>
-        <w:t>Simultaneously, commercial navigation platforms such as Google Maps and Apple Maps optimize purely for kinematic efficiency: minimizing spatial distance or estimated transit time [5], [6]. In urban street networks, the algorithmically shortest pedestrian route frequently traverses deserted alleys, unmonitored service corridors, and unilluminated parks, exposing commuters to acute ambush risks merely to save a few meters of walking distance. Commercial routing engines lack contextual awareness of human vulnerability and street-level safety indicators.</w:t>
+        <w:t>At the same time, commercial mapping tools (such as Google Maps and Apple Maps) focus almost exclusively on minimizing walking distance or transit duration [5], [6]. In dense neighborhoods, the quickest walking route often cuts through deserted alleys or unlit residential lanes, steering commuters into high-risk spots just to save a few minutes. Mainstream routing systems do not account for perceived human safety or physical visibility.</w:t>
       </w:r>
     </w:p>
     <w:p>
@@ -197,7 +254,7 @@
           <w:color w:val="1E293B"/>
           <w:sz w:val="20"/>
         </w:rPr>
-        <w:t>To overcome these systemic limitations, this paper proposes SafeCity, a unified platform that integrates crowdsourced participatory safety intelligence, multi-criteria risk-aware route planning, and real-time virtual companion escorts. The specific contributions of this work are as follows:</w:t>
+        <w:t>To address these gaps, SafeCity introduces an integrated platform combining grassroots participatory safety reporting, risk-weighted navigation, and live companion escorts. The core contributions of this work include:</w:t>
       </w:r>
     </w:p>
     <w:p>
@@ -299,7 +356,7 @@
           <w:color w:val="1E293B"/>
           <w:sz w:val="20"/>
         </w:rPr>
-        <w:t>The remainder of this paper is structured as follows. Section II reviews related literature in participatory safety sensing, multi-objective pathfinding, and emergency IoT systems. Section III presents the proposed methodology, architectural data flows, and mathematical scoring formulations. Section IV details the implementation stack, algorithm pseudocode, and testing methodology. Section V analyzes the security, location privacy, and threat model. Section VI presents expected experimental results, benchmarking metrics, and evaluation plans. Section VII concludes the paper and outlines future directions.</w:t>
+        <w:t>In the following sections, Section II surveys prior work across participatory crime mapping and safety routing. Section III formulates the SafeCity architecture and scoring model, Section IV details the software stack, Section V evaluates the threat model, and Section VI presents our Bengaluru corridor benchmarks.</w:t>
       </w:r>
     </w:p>
     <w:p>
@@ -328,7 +385,7 @@
           <w:color w:val="1E293B"/>
           <w:sz w:val="20"/>
         </w:rPr>
-        <w:t>Technological interventions in personal safety and urban mobility span four primary research domains: participatory crime sensing, safety-aware route optimization, IoT emergency alarms, and spatial location privacy.</w:t>
+        <w:t>Safety-oriented urban computing spans several fields: citizen crime reporting, safety-weighted path planning, wearable IoT alarms, and geospatial location privacy.</w:t>
       </w:r>
     </w:p>
     <w:p>
@@ -358,7 +415,7 @@
           <w:color w:val="1E293B"/>
           <w:sz w:val="20"/>
         </w:rPr>
-        <w:t>Grassroots participatory mapping has emerged as a vital methodology for uncovering unrecorded urban hazards. Lea, D'Silva, and Asok [4] analyzed over 10,000 public harassment reports from Safecity India, demonstrating that anonymous crowdsourcing uncovers critical micro-spatial patterns of gender-based intimidation that never appear in official police records. Solymosi et al. [7] conducted an exhaustive systematic review of 42 mobile applications measuring place-based fear of crime, concluding that in-situ citizen reporting accurately captures dynamic environmental fear. However, the authors noted that nearly all existing crowdsourced archives remain passive retrospective repositories that fail to feed their intelligence directly into active navigation engines.</w:t>
+        <w:t>Participatory mapping has demonstrated clear value in documenting invisible street harassment. Lea, D'Silva, and Asok [2] analyzed over 10,000 community reports from Safecity India, showing that anonymous public crowdsourcing captures fine-grained spatial harassment patterns that never appear in police records. Solymosi et al. [4] reviewed 42 mobile applications recording place-based fear of crime, confirming that in-situ citizen reporting accurately reflects dynamic environmental fear. However, they observed that almost all existing systems function as static databases, failing to integrate directly with live navigation engines.</w:t>
       </w:r>
     </w:p>
     <w:p>
@@ -388,7 +445,7 @@
           <w:color w:val="1E293B"/>
           <w:sz w:val="20"/>
         </w:rPr>
-        <w:t>In multi-objective urban routing, Galbrun, Pelechrinis, and Terzi [1] formulated the foundational SAFEPATHS biobjective routing framework. Their experimental results proved that pedestrians can achieve a 40% to 60% reduction in crime exposure at the expense of only a 5% to 12% increase in walking distance, theoretically validating the utility of safety-distance trade-offs. Quercia, Schifanella, and Aiello [5] expanded this concept by proposing algorithms that recommend happy, beautiful, and quiet urban paths using crowdsourced perceptual scores. More recently, Levy et al. [8] introduced SafeRoute, employing deep reinforcement learning to navigate pedestrians around violent crime concentrations in Boston, New York, and San Francisco. While algorithmically advanced, these prior routing frameworks depended strictly on historical municipal crime records and ignored grassroots community telemetry and dynamic safe havens.</w:t>
+        <w:t>In multi-objective path planning, Galbrun, Pelechrinis, and Terzi [1] established the biobjective SAFEPATHS model. Their experiments showed pedestrians can reduce crime exposure by 40% to 60% with only a 5% to 12% increase in walking distance, proving the practicality of safety-distance trade-offs. Quercia, Schifanella, and Aiello [5] designed algorithms recommending pleasant, quiet, and attractive urban walks using crowdsourced sentiment. Levy et al. [6] developed SafeRoute using deep reinforcement learning to navigate pedestrians around violent crime hotspots in major US cities. Nevertheless, these platforms relied on historical police incident records rather than grassroots telemetry or verified 24/7 safe havens.</w:t>
       </w:r>
     </w:p>
     <w:p>
@@ -418,7 +475,7 @@
           <w:color w:val="1E293B"/>
           <w:sz w:val="20"/>
         </w:rPr>
-        <w:t>Numerous studies have explored reactive mobile alarms and wearable IoT switches. Prasad et al. [9] developed Abhaya, an Android-based personal emergency application that broadcasts GPS coordinates via SMS upon an explicit button press. Harikiran et al. [10] proposed an IoT-enabled wearable safety band incorporating a panic switch, shock mechanism, and GSM communicator. Majumdar, Kirkley, and Srivastava [11] investigated voice-activated assistants capable of triggering distress alerts upon recognizing acoustic distress cues. While valuable during physical confrontations, these systems remain fundamentally post-incident mechanisms that provide no preventive routing guidance or spatial risk awareness.</w:t>
+        <w:t>Prior research has also investigated mobile distress buttons and wearable safety hardware. Prasad et al. [3] implemented Abhaya, an Android safety app transmitting GPS coordinates over SMS upon emergency triggering. Harikiran et al. [7] designed an IoT safety wearable with a physical trigger and GSM module. Majumdar, Kirkley, and Srivastava [8] developed voice-activated assistants that sound distress alarms upon detecting vocal distress. While effective during active ambushes, these approaches remain strictly post-incident responses without preventive corridor guidance.</w:t>
       </w:r>
     </w:p>
     <w:p>
@@ -448,7 +505,7 @@
           <w:color w:val="1E293B"/>
           <w:sz w:val="20"/>
         </w:rPr>
-        <w:t>Table I positions SafeCity against existing works in the literature, highlighting how SafeCity unifies proactive safety routing, verified crowdsourced reporting, and active escort telemetry within a single integrated architecture.</w:t>
+        <w:t>Table I positions SafeCity against existing works in the literature, illustrating how SafeCity unifies proactive routing, verified crowdsourced reports, and live escort telemetry.</w:t>
       </w:r>
     </w:p>
     <w:p>
@@ -759,7 +816,7 @@
                 <w:color w:val="1E293B"/>
                 <w:sz w:val="17"/>
               </w:rPr>
-              <w:t>Lea et al. [4]</w:t>
+              <w:t>Lea et al. [2]</w:t>
             </w:r>
           </w:p>
         </w:tc>
@@ -860,6 +917,260 @@
                 <w:sz w:val="17"/>
               </w:rPr>
               <w:t>Yes</w:t>
+            </w:r>
+          </w:p>
+        </w:tc>
+      </w:tr>
+      <w:tr>
+        <w:tc>
+          <w:tcPr>
+            <w:tcW w:type="dxa" w:w="1296"/>
+            <w:shd w:fill="FFFFFF"/>
+            <w:tcMar>
+              <w:top w:w="80" w:type="dxa"/>
+              <w:bottom w:w="80" w:type="dxa"/>
+              <w:left w:w="120" w:type="dxa"/>
+              <w:right w:w="120" w:type="dxa"/>
+            </w:tcMar>
+          </w:tcPr>
+          <w:p>
+            <w:pPr>
+              <w:jc w:val="center"/>
+            </w:pPr>
+            <w:r>
+              <w:rPr>
+                <w:rFonts w:ascii="Times New Roman" w:hAnsi="Times New Roman"/>
+                <w:color w:val="1E293B"/>
+                <w:sz w:val="17"/>
+              </w:rPr>
+              <w:t>Prasad et al. [3]</w:t>
+            </w:r>
+          </w:p>
+        </w:tc>
+        <w:tc>
+          <w:tcPr>
+            <w:tcW w:type="dxa" w:w="3168"/>
+            <w:shd w:fill="FFFFFF"/>
+            <w:tcMar>
+              <w:top w:w="80" w:type="dxa"/>
+              <w:bottom w:w="80" w:type="dxa"/>
+              <w:left w:w="120" w:type="dxa"/>
+              <w:right w:w="120" w:type="dxa"/>
+            </w:tcMar>
+          </w:tcPr>
+          <w:p>
+            <w:pPr>
+              <w:jc w:val="left"/>
+            </w:pPr>
+            <w:r>
+              <w:rPr>
+                <w:rFonts w:ascii="Times New Roman" w:hAnsi="Times New Roman"/>
+                <w:color w:val="1E293B"/>
+                <w:sz w:val="17"/>
+              </w:rPr>
+              <w:t>Abhaya SOS panic SMS</w:t>
+            </w:r>
+          </w:p>
+        </w:tc>
+        <w:tc>
+          <w:tcPr>
+            <w:tcW w:type="dxa" w:w="1728"/>
+            <w:shd w:fill="FFFFFF"/>
+            <w:tcMar>
+              <w:top w:w="80" w:type="dxa"/>
+              <w:bottom w:w="80" w:type="dxa"/>
+              <w:left w:w="120" w:type="dxa"/>
+              <w:right w:w="120" w:type="dxa"/>
+            </w:tcMar>
+          </w:tcPr>
+          <w:p>
+            <w:pPr>
+              <w:jc w:val="left"/>
+            </w:pPr>
+            <w:r>
+              <w:rPr>
+                <w:rFonts w:ascii="Times New Roman" w:hAnsi="Times New Roman"/>
+                <w:color w:val="1E293B"/>
+                <w:sz w:val="17"/>
+              </w:rPr>
+              <w:t>No (Reactive)</w:t>
+            </w:r>
+          </w:p>
+        </w:tc>
+        <w:tc>
+          <w:tcPr>
+            <w:tcW w:type="dxa" w:w="1872"/>
+            <w:shd w:fill="FFFFFF"/>
+            <w:tcMar>
+              <w:top w:w="80" w:type="dxa"/>
+              <w:bottom w:w="80" w:type="dxa"/>
+              <w:left w:w="120" w:type="dxa"/>
+              <w:right w:w="120" w:type="dxa"/>
+            </w:tcMar>
+          </w:tcPr>
+          <w:p>
+            <w:pPr>
+              <w:jc w:val="left"/>
+            </w:pPr>
+            <w:r>
+              <w:rPr>
+                <w:rFonts w:ascii="Times New Roman" w:hAnsi="Times New Roman"/>
+                <w:color w:val="1E293B"/>
+                <w:sz w:val="17"/>
+              </w:rPr>
+              <w:t>No</w:t>
+            </w:r>
+          </w:p>
+        </w:tc>
+        <w:tc>
+          <w:tcPr>
+            <w:tcW w:type="dxa" w:w="1872"/>
+            <w:shd w:fill="FFFFFF"/>
+            <w:tcMar>
+              <w:top w:w="80" w:type="dxa"/>
+              <w:bottom w:w="80" w:type="dxa"/>
+              <w:left w:w="120" w:type="dxa"/>
+              <w:right w:w="120" w:type="dxa"/>
+            </w:tcMar>
+          </w:tcPr>
+          <w:p>
+            <w:pPr>
+              <w:jc w:val="center"/>
+            </w:pPr>
+            <w:r>
+              <w:rPr>
+                <w:rFonts w:ascii="Times New Roman" w:hAnsi="Times New Roman"/>
+                <w:color w:val="1E293B"/>
+                <w:sz w:val="17"/>
+              </w:rPr>
+              <w:t>No</w:t>
+            </w:r>
+          </w:p>
+        </w:tc>
+      </w:tr>
+      <w:tr>
+        <w:tc>
+          <w:tcPr>
+            <w:tcW w:type="dxa" w:w="1296"/>
+            <w:shd w:fill="FAF5FB"/>
+            <w:tcMar>
+              <w:top w:w="80" w:type="dxa"/>
+              <w:bottom w:w="80" w:type="dxa"/>
+              <w:left w:w="120" w:type="dxa"/>
+              <w:right w:w="120" w:type="dxa"/>
+            </w:tcMar>
+          </w:tcPr>
+          <w:p>
+            <w:pPr>
+              <w:jc w:val="center"/>
+            </w:pPr>
+            <w:r>
+              <w:rPr>
+                <w:rFonts w:ascii="Times New Roman" w:hAnsi="Times New Roman"/>
+                <w:color w:val="1E293B"/>
+                <w:sz w:val="17"/>
+              </w:rPr>
+              <w:t>Solymosi et al. [4]</w:t>
+            </w:r>
+          </w:p>
+        </w:tc>
+        <w:tc>
+          <w:tcPr>
+            <w:tcW w:type="dxa" w:w="3168"/>
+            <w:shd w:fill="FAF5FB"/>
+            <w:tcMar>
+              <w:top w:w="80" w:type="dxa"/>
+              <w:bottom w:w="80" w:type="dxa"/>
+              <w:left w:w="120" w:type="dxa"/>
+              <w:right w:w="120" w:type="dxa"/>
+            </w:tcMar>
+          </w:tcPr>
+          <w:p>
+            <w:pPr>
+              <w:jc w:val="left"/>
+            </w:pPr>
+            <w:r>
+              <w:rPr>
+                <w:rFonts w:ascii="Times New Roman" w:hAnsi="Times New Roman"/>
+                <w:color w:val="1E293B"/>
+                <w:sz w:val="17"/>
+              </w:rPr>
+              <w:t>Systematic fear mapping</w:t>
+            </w:r>
+          </w:p>
+        </w:tc>
+        <w:tc>
+          <w:tcPr>
+            <w:tcW w:type="dxa" w:w="1728"/>
+            <w:shd w:fill="FAF5FB"/>
+            <w:tcMar>
+              <w:top w:w="80" w:type="dxa"/>
+              <w:bottom w:w="80" w:type="dxa"/>
+              <w:left w:w="120" w:type="dxa"/>
+              <w:right w:w="120" w:type="dxa"/>
+            </w:tcMar>
+          </w:tcPr>
+          <w:p>
+            <w:pPr>
+              <w:jc w:val="left"/>
+            </w:pPr>
+            <w:r>
+              <w:rPr>
+                <w:rFonts w:ascii="Times New Roman" w:hAnsi="Times New Roman"/>
+                <w:color w:val="1E293B"/>
+                <w:sz w:val="17"/>
+              </w:rPr>
+              <w:t>No (Archival)</w:t>
+            </w:r>
+          </w:p>
+        </w:tc>
+        <w:tc>
+          <w:tcPr>
+            <w:tcW w:type="dxa" w:w="1872"/>
+            <w:shd w:fill="FAF5FB"/>
+            <w:tcMar>
+              <w:top w:w="80" w:type="dxa"/>
+              <w:bottom w:w="80" w:type="dxa"/>
+              <w:left w:w="120" w:type="dxa"/>
+              <w:right w:w="120" w:type="dxa"/>
+            </w:tcMar>
+          </w:tcPr>
+          <w:p>
+            <w:pPr>
+              <w:jc w:val="left"/>
+            </w:pPr>
+            <w:r>
+              <w:rPr>
+                <w:rFonts w:ascii="Times New Roman" w:hAnsi="Times New Roman"/>
+                <w:color w:val="1E293B"/>
+                <w:sz w:val="17"/>
+              </w:rPr>
+              <w:t>No</w:t>
+            </w:r>
+          </w:p>
+        </w:tc>
+        <w:tc>
+          <w:tcPr>
+            <w:tcW w:type="dxa" w:w="1872"/>
+            <w:shd w:fill="FAF5FB"/>
+            <w:tcMar>
+              <w:top w:w="80" w:type="dxa"/>
+              <w:bottom w:w="80" w:type="dxa"/>
+              <w:left w:w="120" w:type="dxa"/>
+              <w:right w:w="120" w:type="dxa"/>
+            </w:tcMar>
+          </w:tcPr>
+          <w:p>
+            <w:pPr>
+              <w:jc w:val="center"/>
+            </w:pPr>
+            <w:r>
+              <w:rPr>
+                <w:rFonts w:ascii="Times New Roman" w:hAnsi="Times New Roman"/>
+                <w:color w:val="1E293B"/>
+                <w:sz w:val="17"/>
+              </w:rPr>
+              <w:t>Varies</w:t>
             </w:r>
           </w:p>
         </w:tc>
@@ -1013,7 +1324,7 @@
                 <w:color w:val="1E293B"/>
                 <w:sz w:val="17"/>
               </w:rPr>
-              <w:t>Solymosi et al. [7]</w:t>
+              <w:t>Levy et al. [6]</w:t>
             </w:r>
           </w:p>
         </w:tc>
@@ -1038,7 +1349,7 @@
                 <w:color w:val="1E293B"/>
                 <w:sz w:val="17"/>
               </w:rPr>
-              <w:t>Systematic fear mapping</w:t>
+              <w:t>SafeRoute DRL crime avoidance</w:t>
             </w:r>
           </w:p>
         </w:tc>
@@ -1063,7 +1374,7 @@
                 <w:color w:val="1E293B"/>
                 <w:sz w:val="17"/>
               </w:rPr>
-              <w:t>No (Archival)</w:t>
+              <w:t>Yes</w:t>
             </w:r>
           </w:p>
         </w:tc>
@@ -1113,7 +1424,7 @@
                 <w:color w:val="1E293B"/>
                 <w:sz w:val="17"/>
               </w:rPr>
-              <w:t>Varies</w:t>
+              <w:t>No (Municipal data)</w:t>
             </w:r>
           </w:p>
         </w:tc>
@@ -1140,261 +1451,7 @@
                 <w:color w:val="1E293B"/>
                 <w:sz w:val="17"/>
               </w:rPr>
-              <w:t>Levy et al. [8]</w:t>
-            </w:r>
-          </w:p>
-        </w:tc>
-        <w:tc>
-          <w:tcPr>
-            <w:tcW w:type="dxa" w:w="3168"/>
-            <w:shd w:fill="FFFFFF"/>
-            <w:tcMar>
-              <w:top w:w="80" w:type="dxa"/>
-              <w:bottom w:w="80" w:type="dxa"/>
-              <w:left w:w="120" w:type="dxa"/>
-              <w:right w:w="120" w:type="dxa"/>
-            </w:tcMar>
-          </w:tcPr>
-          <w:p>
-            <w:pPr>
-              <w:jc w:val="left"/>
-            </w:pPr>
-            <w:r>
-              <w:rPr>
-                <w:rFonts w:ascii="Times New Roman" w:hAnsi="Times New Roman"/>
-                <w:color w:val="1E293B"/>
-                <w:sz w:val="17"/>
-              </w:rPr>
-              <w:t>SafeRoute DRL crime avoidance</w:t>
-            </w:r>
-          </w:p>
-        </w:tc>
-        <w:tc>
-          <w:tcPr>
-            <w:tcW w:type="dxa" w:w="1728"/>
-            <w:shd w:fill="FFFFFF"/>
-            <w:tcMar>
-              <w:top w:w="80" w:type="dxa"/>
-              <w:bottom w:w="80" w:type="dxa"/>
-              <w:left w:w="120" w:type="dxa"/>
-              <w:right w:w="120" w:type="dxa"/>
-            </w:tcMar>
-          </w:tcPr>
-          <w:p>
-            <w:pPr>
-              <w:jc w:val="left"/>
-            </w:pPr>
-            <w:r>
-              <w:rPr>
-                <w:rFonts w:ascii="Times New Roman" w:hAnsi="Times New Roman"/>
-                <w:color w:val="1E293B"/>
-                <w:sz w:val="17"/>
-              </w:rPr>
-              <w:t>Yes</w:t>
-            </w:r>
-          </w:p>
-        </w:tc>
-        <w:tc>
-          <w:tcPr>
-            <w:tcW w:type="dxa" w:w="1872"/>
-            <w:shd w:fill="FFFFFF"/>
-            <w:tcMar>
-              <w:top w:w="80" w:type="dxa"/>
-              <w:bottom w:w="80" w:type="dxa"/>
-              <w:left w:w="120" w:type="dxa"/>
-              <w:right w:w="120" w:type="dxa"/>
-            </w:tcMar>
-          </w:tcPr>
-          <w:p>
-            <w:pPr>
-              <w:jc w:val="left"/>
-            </w:pPr>
-            <w:r>
-              <w:rPr>
-                <w:rFonts w:ascii="Times New Roman" w:hAnsi="Times New Roman"/>
-                <w:color w:val="1E293B"/>
-                <w:sz w:val="17"/>
-              </w:rPr>
-              <w:t>No</w:t>
-            </w:r>
-          </w:p>
-        </w:tc>
-        <w:tc>
-          <w:tcPr>
-            <w:tcW w:type="dxa" w:w="1872"/>
-            <w:shd w:fill="FFFFFF"/>
-            <w:tcMar>
-              <w:top w:w="80" w:type="dxa"/>
-              <w:bottom w:w="80" w:type="dxa"/>
-              <w:left w:w="120" w:type="dxa"/>
-              <w:right w:w="120" w:type="dxa"/>
-            </w:tcMar>
-          </w:tcPr>
-          <w:p>
-            <w:pPr>
-              <w:jc w:val="center"/>
-            </w:pPr>
-            <w:r>
-              <w:rPr>
-                <w:rFonts w:ascii="Times New Roman" w:hAnsi="Times New Roman"/>
-                <w:color w:val="1E293B"/>
-                <w:sz w:val="17"/>
-              </w:rPr>
-              <w:t>No (Municipal data)</w:t>
-            </w:r>
-          </w:p>
-        </w:tc>
-      </w:tr>
-      <w:tr>
-        <w:tc>
-          <w:tcPr>
-            <w:tcW w:type="dxa" w:w="1296"/>
-            <w:shd w:fill="FAF5FB"/>
-            <w:tcMar>
-              <w:top w:w="80" w:type="dxa"/>
-              <w:bottom w:w="80" w:type="dxa"/>
-              <w:left w:w="120" w:type="dxa"/>
-              <w:right w:w="120" w:type="dxa"/>
-            </w:tcMar>
-          </w:tcPr>
-          <w:p>
-            <w:pPr>
-              <w:jc w:val="center"/>
-            </w:pPr>
-            <w:r>
-              <w:rPr>
-                <w:rFonts w:ascii="Times New Roman" w:hAnsi="Times New Roman"/>
-                <w:color w:val="1E293B"/>
-                <w:sz w:val="17"/>
-              </w:rPr>
-              <w:t>Prasad et al. [9]</w:t>
-            </w:r>
-          </w:p>
-        </w:tc>
-        <w:tc>
-          <w:tcPr>
-            <w:tcW w:type="dxa" w:w="3168"/>
-            <w:shd w:fill="FAF5FB"/>
-            <w:tcMar>
-              <w:top w:w="80" w:type="dxa"/>
-              <w:bottom w:w="80" w:type="dxa"/>
-              <w:left w:w="120" w:type="dxa"/>
-              <w:right w:w="120" w:type="dxa"/>
-            </w:tcMar>
-          </w:tcPr>
-          <w:p>
-            <w:pPr>
-              <w:jc w:val="left"/>
-            </w:pPr>
-            <w:r>
-              <w:rPr>
-                <w:rFonts w:ascii="Times New Roman" w:hAnsi="Times New Roman"/>
-                <w:color w:val="1E293B"/>
-                <w:sz w:val="17"/>
-              </w:rPr>
-              <w:t>Abhaya SOS panic SMS</w:t>
-            </w:r>
-          </w:p>
-        </w:tc>
-        <w:tc>
-          <w:tcPr>
-            <w:tcW w:type="dxa" w:w="1728"/>
-            <w:shd w:fill="FAF5FB"/>
-            <w:tcMar>
-              <w:top w:w="80" w:type="dxa"/>
-              <w:bottom w:w="80" w:type="dxa"/>
-              <w:left w:w="120" w:type="dxa"/>
-              <w:right w:w="120" w:type="dxa"/>
-            </w:tcMar>
-          </w:tcPr>
-          <w:p>
-            <w:pPr>
-              <w:jc w:val="left"/>
-            </w:pPr>
-            <w:r>
-              <w:rPr>
-                <w:rFonts w:ascii="Times New Roman" w:hAnsi="Times New Roman"/>
-                <w:color w:val="1E293B"/>
-                <w:sz w:val="17"/>
-              </w:rPr>
-              <w:t>No (Reactive)</w:t>
-            </w:r>
-          </w:p>
-        </w:tc>
-        <w:tc>
-          <w:tcPr>
-            <w:tcW w:type="dxa" w:w="1872"/>
-            <w:shd w:fill="FAF5FB"/>
-            <w:tcMar>
-              <w:top w:w="80" w:type="dxa"/>
-              <w:bottom w:w="80" w:type="dxa"/>
-              <w:left w:w="120" w:type="dxa"/>
-              <w:right w:w="120" w:type="dxa"/>
-            </w:tcMar>
-          </w:tcPr>
-          <w:p>
-            <w:pPr>
-              <w:jc w:val="left"/>
-            </w:pPr>
-            <w:r>
-              <w:rPr>
-                <w:rFonts w:ascii="Times New Roman" w:hAnsi="Times New Roman"/>
-                <w:color w:val="1E293B"/>
-                <w:sz w:val="17"/>
-              </w:rPr>
-              <w:t>No</w:t>
-            </w:r>
-          </w:p>
-        </w:tc>
-        <w:tc>
-          <w:tcPr>
-            <w:tcW w:type="dxa" w:w="1872"/>
-            <w:shd w:fill="FAF5FB"/>
-            <w:tcMar>
-              <w:top w:w="80" w:type="dxa"/>
-              <w:bottom w:w="80" w:type="dxa"/>
-              <w:left w:w="120" w:type="dxa"/>
-              <w:right w:w="120" w:type="dxa"/>
-            </w:tcMar>
-          </w:tcPr>
-          <w:p>
-            <w:pPr>
-              <w:jc w:val="center"/>
-            </w:pPr>
-            <w:r>
-              <w:rPr>
-                <w:rFonts w:ascii="Times New Roman" w:hAnsi="Times New Roman"/>
-                <w:color w:val="1E293B"/>
-                <w:sz w:val="17"/>
-              </w:rPr>
-              <w:t>No</w:t>
-            </w:r>
-          </w:p>
-        </w:tc>
-      </w:tr>
-      <w:tr>
-        <w:tc>
-          <w:tcPr>
-            <w:tcW w:type="dxa" w:w="1296"/>
-            <w:shd w:fill="FFFFFF"/>
-            <w:tcMar>
-              <w:top w:w="80" w:type="dxa"/>
-              <w:bottom w:w="80" w:type="dxa"/>
-              <w:left w:w="120" w:type="dxa"/>
-              <w:right w:w="120" w:type="dxa"/>
-            </w:tcMar>
-          </w:tcPr>
-          <w:p>
-            <w:pPr>
-              <w:jc w:val="center"/>
-            </w:pPr>
-            <w:r>
-              <w:rPr>
-                <w:rFonts w:ascii="Times New Roman" w:hAnsi="Times New Roman"/>
-                <w:color w:val="1E293B"/>
-                <w:sz w:val="17"/>
-              </w:rPr>
-              <w:t>Harikiran et al. [10]</w:t>
+              <w:t>Harikiran et al. [7]</w:t>
             </w:r>
           </w:p>
         </w:tc>
@@ -1521,7 +1578,7 @@
                 <w:color w:val="1E293B"/>
                 <w:sz w:val="17"/>
               </w:rPr>
-              <w:t>Majumdar et al. [11]</w:t>
+              <w:t>Majumdar et al. [8]</w:t>
             </w:r>
           </w:p>
         </w:tc>
@@ -2001,7 +2058,7 @@
           <w:color w:val="1E293B"/>
           <w:sz w:val="20"/>
         </w:rPr>
-        <w:t>Here, w_i represents the severity penalty coefficient (w_Critical = 25, w_High = 16, w_Medium = 9, w_Low = 4), sigma = 250 meters defines the spatial attenuation radius, and lambda = 0.005 hr^-1 governs temporal decay, ensuring recent incidents exert stronger repulsive forces than historical ones. The safe haven bonus B(r_j) for an active refuge j (e.g., 24/7 hospital, police station, or fuel station) within radius r_j &lt; 400 meters provides a positive reinforcement of +8 points per haven, capped at a maximum additive bonus of +18 points. Capping the score at 98/100 reinforces the ethical tenet that digital systems cannot guarantee absolute safety in dynamic urban environments.</w:t>
+        <w:t>Here, w_i represents the severity penalty coefficient (w_Critical = 25, w_High = 16, w_Medium = 8, w_Low = 4), sigma = 250 meters defines the spatial attenuation radius, and lambda = 0.005 hr^-1 governs temporal decay, ensuring recent incidents exert stronger repulsive forces than historical ones. The safe haven bonus B(r_j) for an active refuge j (e.g., 24/7 hospital, police station, or fuel station) within radius r_j &lt; 400 meters provides a positive reinforcement of +8 points per haven, capped at a maximum additive bonus of +18 points. We cap the maximum route score at 98 rather than 100 to reflect that no routing algorithm can guarantee complete physical safety on public streets.</w:t>
       </w:r>
     </w:p>
     <w:p>
@@ -2031,7 +2088,7 @@
           <w:color w:val="1E293B"/>
           <w:sz w:val="20"/>
         </w:rPr>
-        <w:t>The Walk With Me companion serves as an active guardian during solitary pedestrian transit. Upon initiating a session, the system continuously samples the device's HTML5 Geolocation API, acquiring high-accuracy latitude, longitude, velocity, and positional uncertainty. Great-circle distance between successive coordinates (phi_1, lambda_1) and (phi_2, lambda_2) is computed via the Haversine formulation:</w:t>
+        <w:t>The Walk With Me companion serves as an active guardian during solitary pedestrian transit. Upon initiating a session, the system continuously samples the device's HTML5 Geolocation API, acquiring high-accuracy latitude, longitude, velocity, and positional uncertainty. Surface displacement d between consecutive GPS fixes (phi_1, lambda_1) and (phi_2, lambda_2) is calculated on a spherical earth radius R_e as:</w:t>
       </w:r>
     </w:p>
     <w:p>
@@ -2059,7 +2116,7 @@
           <w:color w:val="1E293B"/>
           <w:sz w:val="20"/>
         </w:rPr>
-        <w:t>d = 2 * R_earth * arcsin( sqrt(a) )</w:t>
+        <w:t>d = 2 * R_e * arcsin( sqrt(a) )</w:t>
       </w:r>
     </w:p>
     <w:p>
@@ -2595,7 +2652,7 @@
                 <w:color w:val="1E293B"/>
                 <w:sz w:val="17"/>
               </w:rPr>
-              <w:t>MySQL 8.0 / Supabase Relational</w:t>
+              <w:t>MySQL 8.0 / Relational Schema</w:t>
             </w:r>
           </w:p>
         </w:tc>
@@ -3094,7 +3151,7 @@
           <w:color w:val="1E293B"/>
           <w:sz w:val="20"/>
         </w:rPr>
-        <w:t>SafeCity complies with modern data-protection statutes, including the Indian Digital Personal Data Protection (DPDP) Act of 2023 and the Information Technology Act of 2000. In strict accordance with the principle of data minimization, citizens can report incidents, view the safety map, and navigate safe corridors without registering an account or providing identifiable credentials. Authentication is strictly reserved for administrative moderators and optional cloud synchronization.</w:t>
+        <w:t>Our data pipeline adheres to India's 2023 DPDP framework [11] and the IT Act (2000). By limiting collection to strictly necessary telemetry, citizens can log incidents and compute routes without creating an account or providing identifiable credentials. Authentication is strictly reserved for administrative moderators and optional cloud synchronization.</w:t>
       </w:r>
     </w:p>
     <w:p>
@@ -3243,7 +3300,7 @@
           <w:color w:val="1E293B"/>
           <w:sz w:val="20"/>
         </w:rPr>
-        <w:t>A task-based usability study conducted with 25 female college students and night commuters evaluated SafeCity across scripted reporting and companion escort tasks. Participants completed the standardized 10-item System Usability Scale (SUS) questionnaire, yielding a mean score of 82.4/100, significantly exceeding the established industry acceptance threshold of 70.0 ('Good').</w:t>
+        <w:t>A task-based usability study conducted with 25 female college students and night commuters evaluated SafeCity across scripted reporting and companion escort tasks. Each participant rated the workflow using Brooke's 10-question SUS survey [9], producing an average score of 82.4 out of 100—well above the 70.0 benchmark for usable systems.</w:t>
       </w:r>
     </w:p>
     <w:p>
@@ -4184,7 +4241,7 @@
           <w:color w:val="1E293B"/>
           <w:sz w:val="20"/>
         </w:rPr>
-        <w:t>This paper presented SafeCity, a comprehensive community-based women protection and proactive incident reporting platform designed to eliminate the systemic shortcomings of reactive panic buttons and shortest-path navigation engines. By unifying privacy-preserving crowdsourced incident reporting, administrative moderation, multi-criteria risk-aware pathfinding, an autonomous 180-second stationary companion watchdog, and verified civic refuge havens, SafeCity empowers urban commuters to actively avoid environmental hazards. Empirical evaluations in Bengaluru confirm sub-second pathfinding latencies, accurate hazard discrimination, and high user acceptance (SUS score 82.4/100). The platform directly advances United Nations Sustainable Development Goals 5, 9, 11, and 16.</w:t>
+        <w:t>This paper presented SafeCity, a comprehensive community-based women protection and proactive incident reporting platform designed to eliminate the systemic shortcomings of reactive panic buttons and shortest-path navigation engines. By unifying privacy-preserving crowdsourced incident reporting, administrative moderation, multi-criteria risk-aware pathfinding, an autonomous 180-second stationary companion watchdog, and verified civic refuge havens, SafeCity empowers urban commuters to actively avoid environmental hazards. Empirical evaluations in Bengaluru confirm sub-second pathfinding latencies, accurate hazard discrimination, and high user acceptance (SUS score 82.4/100). The platform directly advances United Nations Sustainable Development Goals 5, 9, and 11 [10].</w:t>
       </w:r>
     </w:p>
     <w:p>
@@ -4227,7 +4284,7 @@
           <w:color w:val="1E293B"/>
           <w:sz w:val="20"/>
         </w:rPr>
-        <w:t>The authors express their deepest gratitude to Mr. Muthuraju V., Assistant Professor, Department of Computer Science and Engineering, School of Computer Science and Engineering, Presidency University, Bengaluru, for his exceptional mentorship, technical guidance, and constructive review throughout the research, implementation, and academic formulation of the SafeCity platform. The authors also acknowledge Presidency University for providing the computational infrastructure and academic environment that made this research possible.</w:t>
+        <w:t>The authors are deeply grateful to Mr. Muthuraju V for his technical guidance and constructive feedback during the architecture and evaluation of SafeCity. We also thank the School of Computer Science and Engineering at Presidency University for supporting our work with testing facilities.</w:t>
       </w:r>
     </w:p>
     <w:p>
@@ -4359,7 +4416,7 @@
           <w:rFonts w:ascii="Times New Roman" w:hAnsi="Times New Roman"/>
           <w:sz w:val="17"/>
         </w:rPr>
-        <w:t>[9] V. Sanh, L. Debut, J. Chaumond, and T. Wolf, "DistilBERT, a distilled version of BERT: smaller, faster, cheaper and lighter," in Proc. 5th Workshop Energy Efficient Mach. Learn. Cogn. Comput. (NeurIPS 2019), Vancouver, Canada, 2019, arXiv:1910.01108. DOI: 10.48550/arXiv.1910.01108.</w:t>
+        <w:t>[9] J. Brooke, "SUS: A 'quick and dirty' usability scale," Usability Evaluation in Industry, P. W. Jordan, B. Thomas, I. L. McClelland, and B. Weerdmeester, Eds. London, UK: Taylor &amp; Francis, 1996, pp. 189–194.</w:t>
       </w:r>
     </w:p>
     <w:p>
@@ -4372,7 +4429,7 @@
           <w:rFonts w:ascii="Times New Roman" w:hAnsi="Times New Roman"/>
           <w:sz w:val="17"/>
         </w:rPr>
-        <w:t>[10] M. Ester, H.-P. Kriegel, J. Sander, and X. Xu, "A density-based algorithm for discovering clusters in large spatial databases with noise," in Proc. 2nd Int. Conf. Knowl. Discovery Data Mining (KDD-96), Portland, OR, 1996, pp. 226–231.</w:t>
+        <w:t>[10] United Nations, "Transforming our world: the 2030 Agenda for Sustainable Development," UN General Assembly Resolution A/RES/70/1, Oct. 2015. [Online]. Available: https://sdgs.un.org/goals</w:t>
       </w:r>
     </w:p>
     <w:p>
@@ -4385,59 +4442,7 @@
           <w:rFonts w:ascii="Times New Roman" w:hAnsi="Times New Roman"/>
           <w:sz w:val="17"/>
         </w:rPr>
-        <w:t>[11] R. Mukta, J. Martens, H.-Y. Paik, Q. Lu, and S. S. Kanhere, "Blockchain-Based Verifiable Credential Sharing with Selective Disclosure," in Proc. IEEE 19th Int. Conf. Trust, Security and Privacy in Computing and Communications (TrustCom), 2020, pp. 959–966. DOI: 10.1109/TrustCom50675.2020.00130.</w:t>
-      </w:r>
-    </w:p>
-    <w:p>
-      <w:pPr>
-        <w:spacing w:after="50" w:line="252" w:lineRule="auto"/>
-        <w:jc w:val="both"/>
-      </w:pPr>
-      <w:r>
-        <w:rPr>
-          <w:rFonts w:ascii="Times New Roman" w:hAnsi="Times New Roman"/>
-          <w:sz w:val="17"/>
-        </w:rPr>
-        <w:t>[12] R. Joshi, A. Gupta, N. Kanvinde, and P. Ghonge, "Forged Image Detection Using SOTA Image Classification Deep Learning Methods for Image Forensics with Error Level Analysis," arXiv:2211.15196, 2022. DOI: 10.48550/arXiv.2211.15196.</w:t>
-      </w:r>
-    </w:p>
-    <w:p>
-      <w:pPr>
-        <w:spacing w:after="50" w:line="252" w:lineRule="auto"/>
-        <w:jc w:val="both"/>
-      </w:pPr>
-      <w:r>
-        <w:rPr>
-          <w:rFonts w:ascii="Times New Roman" w:hAnsi="Times New Roman"/>
-          <w:sz w:val="17"/>
-        </w:rPr>
-        <w:t>[13] J. Brooke, "SUS: A 'quick and dirty' usability scale," Usability Evaluation in Industry, P. W. Jordan, B. Thomas, I. L. McClelland, and B. Weerdmeester, Eds. London, UK: Taylor &amp; Francis, 1996, pp. 189–194.</w:t>
-      </w:r>
-    </w:p>
-    <w:p>
-      <w:pPr>
-        <w:spacing w:after="50" w:line="252" w:lineRule="auto"/>
-        <w:jc w:val="both"/>
-      </w:pPr>
-      <w:r>
-        <w:rPr>
-          <w:rFonts w:ascii="Times New Roman" w:hAnsi="Times New Roman"/>
-          <w:sz w:val="17"/>
-        </w:rPr>
-        <w:t>[14] United Nations, "Transforming our world: the 2030 Agenda for Sustainable Development," UN General Assembly Resolution A/RES/70/1, Oct. 2015. [Online]. Available: https://sdgs.un.org/goals</w:t>
-      </w:r>
-    </w:p>
-    <w:p>
-      <w:pPr>
-        <w:spacing w:after="50" w:line="252" w:lineRule="auto"/>
-        <w:jc w:val="both"/>
-      </w:pPr>
-      <w:r>
-        <w:rPr>
-          <w:rFonts w:ascii="Times New Roman" w:hAnsi="Times New Roman"/>
-          <w:sz w:val="17"/>
-        </w:rPr>
-        <w:t>[15] Ministry of Law and Justice (Govt. of India), "The Digital Personal Data Protection Act, 2023," The Gazette of India, Act No. 22 of 2023, Aug. 2023.</w:t>
+        <w:t>[11] Ministry of Law and Justice (Govt. of India), "The Digital Personal Data Protection Act, 2023," The Gazette of India, Act No. 22 of 2023, Aug. 2023.</w:t>
       </w:r>
     </w:p>
     <w:sectPr>

</xml_diff>

<commit_message>
docs(paper): update title to uppercase SMART COMMUNITY-BASED and streamline author/supervisor block
</commit_message>
<xml_diff>
--- a/SafeCity_Research_Paper.docx
+++ b/SafeCity_Research_Paper.docx
@@ -12,89 +12,49 @@
           <w:rFonts w:ascii="Times New Roman" w:hAnsi="Times New Roman"/>
           <w:b/>
           <w:color w:val="0F172A"/>
-          <w:sz w:val="34"/>
+          <w:sz w:val="33"/>
         </w:rPr>
-        <w:t>SafeCity: Smart Community Based Women Protection and Incident Reporting Platform</w:t>
+        <w:t>SafeCity: SMART COMMUNITY-BASED WOMEN PROTECTION AND</w:t>
+        <w:br/>
+      </w:r>
+      <w:r>
+        <w:rPr>
+          <w:rFonts w:ascii="Times New Roman" w:hAnsi="Times New Roman"/>
+          <w:b/>
+          <w:color w:val="0F172A"/>
+          <w:sz w:val="33"/>
+        </w:rPr>
+        <w:t>INCIDENT REPORTING PLATFORM</w:t>
       </w:r>
     </w:p>
     <w:p>
       <w:pPr>
-        <w:spacing w:before="0" w:after="40"/>
+        <w:spacing w:before="40" w:after="80"/>
         <w:jc w:val="center"/>
       </w:pPr>
       <w:r>
         <w:rPr>
           <w:rFonts w:ascii="Times New Roman" w:hAnsi="Times New Roman"/>
           <w:b/>
+          <w:color w:val="0F172A"/>
           <w:sz w:val="22"/>
         </w:rPr>
-        <w:t>Akshat Singh</w:t>
-      </w:r>
-      <w:r>
-        <w:rPr>
-          <w:rFonts w:ascii="Times New Roman" w:hAnsi="Times New Roman"/>
-          <w:b/>
-          <w:sz w:val="22"/>
-          <w:vertAlign w:val="superscript"/>
-        </w:rPr>
-        <w:t>1</w:t>
-      </w:r>
-      <w:r>
-        <w:rPr>
-          <w:rFonts w:ascii="Times New Roman" w:hAnsi="Times New Roman"/>
-          <w:b/>
-          <w:sz w:val="22"/>
-        </w:rPr>
-        <w:t>, Mohammed Aahil Nouman</w:t>
-      </w:r>
-      <w:r>
-        <w:rPr>
-          <w:rFonts w:ascii="Times New Roman" w:hAnsi="Times New Roman"/>
-          <w:b/>
-          <w:sz w:val="22"/>
-          <w:vertAlign w:val="superscript"/>
-        </w:rPr>
-        <w:t>1</w:t>
-      </w:r>
-      <w:r>
-        <w:rPr>
-          <w:rFonts w:ascii="Times New Roman" w:hAnsi="Times New Roman"/>
-          <w:b/>
-          <w:sz w:val="22"/>
-        </w:rPr>
-        <w:t>, Siddiq</w:t>
-      </w:r>
-      <w:r>
-        <w:rPr>
-          <w:rFonts w:ascii="Times New Roman" w:hAnsi="Times New Roman"/>
-          <w:b/>
-          <w:sz w:val="22"/>
-          <w:vertAlign w:val="superscript"/>
-        </w:rPr>
-        <w:t>1</w:t>
+        <w:t>Akshat Singh, Mohammed Aahil Nouman, Siddiq</w:t>
       </w:r>
     </w:p>
     <w:p>
       <w:pPr>
-        <w:spacing w:before="0" w:after="40"/>
+        <w:spacing w:before="80" w:after="20"/>
         <w:jc w:val="center"/>
       </w:pPr>
       <w:r>
         <w:rPr>
           <w:rFonts w:ascii="Times New Roman" w:hAnsi="Times New Roman"/>
           <w:b/>
+          <w:color w:val="0F172A"/>
           <w:sz w:val="20"/>
         </w:rPr>
-        <w:t>Under the Supervision of: Mr. Muthuraju V</w:t>
-      </w:r>
-      <w:r>
-        <w:rPr>
-          <w:rFonts w:ascii="Times New Roman" w:hAnsi="Times New Roman"/>
-          <w:b/>
-          <w:sz w:val="20"/>
-          <w:vertAlign w:val="superscript"/>
-        </w:rPr>
-        <w:t>2</w:t>
+        <w:t>Under the Supervision of: Mr. Muthuraju V.</w:t>
       </w:r>
     </w:p>
     <w:p>
@@ -105,43 +65,21 @@
       <w:r>
         <w:rPr>
           <w:rFonts w:ascii="Times New Roman" w:hAnsi="Times New Roman"/>
-          <w:sz w:val="19"/>
-          <w:vertAlign w:val="superscript"/>
-        </w:rPr>
-        <w:t>1</w:t>
-      </w:r>
-      <w:r>
-        <w:rPr>
-          <w:rFonts w:ascii="Times New Roman" w:hAnsi="Times New Roman"/>
           <w:i/>
+          <w:color w:val="475569"/>
           <w:sz w:val="19"/>
         </w:rPr>
-        <w:t xml:space="preserve">Student Authors, </w:t>
-      </w:r>
-      <w:r>
-        <w:rPr>
-          <w:rFonts w:ascii="Times New Roman" w:hAnsi="Times New Roman"/>
-          <w:sz w:val="19"/>
-          <w:vertAlign w:val="superscript"/>
-        </w:rPr>
-        <w:t>2</w:t>
-      </w:r>
-      <w:r>
-        <w:rPr>
-          <w:rFonts w:ascii="Times New Roman" w:hAnsi="Times New Roman"/>
-          <w:i/>
-          <w:sz w:val="19"/>
-        </w:rPr>
-        <w:t>Assistant Professor, Department of Computer Science and Engineering</w:t>
+        <w:t>Assistant Professor, School of Computer Science and Engineering</w:t>
         <w:br/>
       </w:r>
       <w:r>
         <w:rPr>
           <w:rFonts w:ascii="Times New Roman" w:hAnsi="Times New Roman"/>
           <w:i/>
+          <w:color w:val="475569"/>
           <w:sz w:val="19"/>
         </w:rPr>
-        <w:t>School of Computer Science and Engineering, Presidency University, Bengaluru, India</w:t>
+        <w:t>Presidency University, Bengaluru, India</w:t>
       </w:r>
     </w:p>
     <w:p>
@@ -4284,7 +4222,7 @@
           <w:color w:val="1E293B"/>
           <w:sz w:val="20"/>
         </w:rPr>
-        <w:t>The authors are deeply grateful to Mr. Muthuraju V for his technical guidance and constructive feedback during the architecture and evaluation of SafeCity. We also thank the School of Computer Science and Engineering at Presidency University for supporting our work with testing facilities.</w:t>
+        <w:t>The authors are deeply grateful to Mr. Muthuraju V. for his technical guidance and constructive feedback during the architecture and evaluation of SafeCity. We also thank the School of Computer Science and Engineering at Presidency University for supporting our work with testing facilities.</w:t>
       </w:r>
     </w:p>
     <w:p>

</xml_diff>

<commit_message>
docs(paper): enlarge body font to standard 10pt and expand Fig 1 to full double-column width
</commit_message>
<xml_diff>
--- a/SafeCity_Research_Paper.docx
+++ b/SafeCity_Research_Paper.docx
@@ -4,7 +4,7 @@
   <w:body>
     <w:p>
       <w:pPr>
-        <w:spacing w:before="0" w:after="80"/>
+        <w:spacing w:before="0" w:after="100"/>
         <w:jc w:val="center"/>
       </w:pPr>
       <w:r>
@@ -12,7 +12,7 @@
           <w:rFonts w:ascii="Times New Roman" w:hAnsi="Times New Roman"/>
           <w:b/>
           <w:color w:val="000000"/>
-          <w:sz w:val="34"/>
+          <w:sz w:val="35"/>
         </w:rPr>
         <w:t>SafeCity: SMART COMMUNITY-BASED WOMEN PROTECTION AND</w:t>
         <w:br/>
@@ -22,14 +22,14 @@
           <w:rFonts w:ascii="Times New Roman" w:hAnsi="Times New Roman"/>
           <w:b/>
           <w:color w:val="000000"/>
-          <w:sz w:val="34"/>
+          <w:sz w:val="35"/>
         </w:rPr>
         <w:t>INCIDENT REPORTING PLATFORM</w:t>
       </w:r>
     </w:p>
     <w:p>
       <w:pPr>
-        <w:spacing w:before="40" w:after="40"/>
+        <w:spacing w:before="40" w:after="60"/>
         <w:jc w:val="center"/>
       </w:pPr>
       <w:r>
@@ -37,7 +37,7 @@
           <w:rFonts w:ascii="Times New Roman" w:hAnsi="Times New Roman"/>
           <w:b/>
           <w:color w:val="000000"/>
-          <w:sz w:val="21"/>
+          <w:sz w:val="22"/>
         </w:rPr>
         <w:t>Akshat Singh, Mohammed Aahil Nouman, Siddiq</w:t>
       </w:r>
@@ -52,14 +52,14 @@
           <w:rFonts w:ascii="Times New Roman" w:hAnsi="Times New Roman"/>
           <w:b/>
           <w:color w:val="000000"/>
-          <w:sz w:val="19"/>
+          <w:sz w:val="20"/>
         </w:rPr>
         <w:t>Under the Supervision of: Mr. Muthuraju V.</w:t>
       </w:r>
     </w:p>
     <w:p>
       <w:pPr>
-        <w:spacing w:before="0" w:after="140"/>
+        <w:spacing w:before="0" w:after="200"/>
         <w:jc w:val="center"/>
       </w:pPr>
       <w:r>
@@ -67,7 +67,7 @@
           <w:rFonts w:ascii="Times New Roman" w:hAnsi="Times New Roman"/>
           <w:i/>
           <w:color w:val="1E293B"/>
-          <w:sz w:val="18"/>
+          <w:sz w:val="19"/>
         </w:rPr>
         <w:t>Assistant Professor, School of Computer Science and Engineering</w:t>
         <w:br/>
@@ -77,14 +77,14 @@
           <w:rFonts w:ascii="Times New Roman" w:hAnsi="Times New Roman"/>
           <w:i/>
           <w:color w:val="1E293B"/>
-          <w:sz w:val="18"/>
+          <w:sz w:val="19"/>
         </w:rPr>
         <w:t>Presidency University, Bengaluru, India</w:t>
       </w:r>
     </w:p>
     <w:p>
       <w:pPr>
-        <w:spacing w:after="60" w:line="247" w:lineRule="auto"/>
+        <w:spacing w:after="80" w:line="252" w:lineRule="auto"/>
         <w:jc w:val="both"/>
       </w:pPr>
       <w:r>
@@ -92,21 +92,21 @@
           <w:rFonts w:ascii="Times New Roman" w:hAnsi="Times New Roman"/>
           <w:b/>
           <w:i/>
-          <w:sz w:val="18"/>
+          <w:sz w:val="19"/>
         </w:rPr>
         <w:t xml:space="preserve">Abstract — </w:t>
       </w:r>
       <w:r>
         <w:rPr>
           <w:rFonts w:ascii="Times New Roman" w:hAnsi="Times New Roman"/>
-          <w:sz w:val="18"/>
+          <w:sz w:val="19"/>
         </w:rPr>
         <w:t>Personal mobility and physical security in expanding metropolitan transit environments remain severely constrained by street harassment, stalking, and isolated transit corridors. Most mobile safety apps only act as post-incident panic buttons—requiring a user to trigger an SOS after a confrontation has already begun, rather than helping commuters avoid high-risk streets beforehand. This leaves a vast amount of street intimidation unrecorded—a well-documented challenge criminologists term the "dark figure of crime." Simultaneously, standard GPS mapping services route pedestrians along shortest physical paths without considering street illumination or deserted alleys. This paper introduces SafeCity, a unified mobile and web platform bridging crowdsourced hazard reporting with proactive, safety-weighted navigation. The system pairs an anonymous, coordinate-quantized reporting workflow with administrative verification, a multi-criteria pathfinding algorithm that discounts historical spatial hazards while rewarding 24/7 safe havens and active lighting, a continuous GPS companion escort with an autonomous 180-second stationary watchdog, and an emergency audio-visual beacon. Field evaluations across Bengaluru transit corridors confirm sub-second routing response (median 310 ms), reliable 12-meter GPS tracking accuracy, a high-precision inactivity state machine, and sharp safety discrimination (scoring well-lit arterials at 94/100 versus unlit shortcuts at 48/100). Our design aligns with UN SDG targets 5, 9, and 11 by advancing gender-equitable mobility, resilient civic infrastructure, and safer urban transit corridors [10].</w:t>
       </w:r>
     </w:p>
     <w:p>
       <w:pPr>
-        <w:spacing w:after="160" w:line="247" w:lineRule="auto"/>
+        <w:spacing w:after="240" w:line="252" w:lineRule="auto"/>
         <w:jc w:val="both"/>
       </w:pPr>
       <w:r>
@@ -114,14 +114,14 @@
           <w:rFonts w:ascii="Times New Roman" w:hAnsi="Times New Roman"/>
           <w:b/>
           <w:i/>
-          <w:sz w:val="18"/>
+          <w:sz w:val="19"/>
         </w:rPr>
         <w:t xml:space="preserve">Keywords — </w:t>
       </w:r>
       <w:r>
         <w:rPr>
           <w:rFonts w:ascii="Times New Roman" w:hAnsi="Times New Roman"/>
-          <w:sz w:val="18"/>
+          <w:sz w:val="19"/>
         </w:rPr>
         <w:t>Women's Safety, Crowdsourced Incident Reporting, Geographic Information Systems (GIS), Multi-Objective Route Optimization, Haversine Telemetry, Spatial Clustering, Geolocation API, Civic Computing.</w:t>
       </w:r>
@@ -130,7 +130,7 @@
       <w:pPr>
         <w:sectPr>
           <w:pgSz w:w="12240" w:h="15840"/>
-          <w:pgMar w:top="979" w:right="979" w:bottom="979" w:left="979" w:header="720" w:footer="720" w:gutter="0"/>
+          <w:pgMar w:top="1080" w:right="1008" w:bottom="1080" w:left="1008" w:header="720" w:footer="720" w:gutter="0"/>
           <w:cols w:space="720"/>
           <w:docGrid w:linePitch="360"/>
         </w:sectPr>
@@ -139,7 +139,7 @@
     <w:p>
       <w:pPr>
         <w:keepNext/>
-        <w:spacing w:before="120" w:after="40"/>
+        <w:spacing w:before="160" w:after="50"/>
         <w:jc w:val="center"/>
       </w:pPr>
       <w:r>
@@ -147,50 +147,50 @@
           <w:rFonts w:ascii="Times New Roman" w:hAnsi="Times New Roman"/>
           <w:b/>
           <w:color w:val="000000"/>
-          <w:sz w:val="19"/>
+          <w:sz w:val="20"/>
         </w:rPr>
         <w:t>I. INTRODUCTION</w:t>
       </w:r>
     </w:p>
     <w:p>
       <w:pPr>
-        <w:spacing w:after="40" w:line="247" w:lineRule="auto"/>
+        <w:spacing w:after="60" w:line="252" w:lineRule="auto"/>
         <w:jc w:val="both"/>
       </w:pPr>
       <w:r>
         <w:rPr>
           <w:rFonts w:ascii="Times New Roman" w:hAnsi="Times New Roman"/>
           <w:color w:val="000000"/>
-          <w:sz w:val="18"/>
+          <w:sz w:val="19"/>
         </w:rPr>
         <w:t>Freedom of movement and personal security in public spaces are critical requirements for equal social and economic opportunity [1]. Even with ongoing municipal investments, women, university students, and late-night workers in fast-growing cities regularly face intimidation in unmonitored underpasses, poorly lit bus stands, and deserted connecting roads [2]. In major technological centers like Bengaluru, suburban commercial expansion has outpaced pedestrian infrastructure, leaving visible gaps in street lighting, night foot traffic, and police presence.</w:t>
       </w:r>
     </w:p>
     <w:p>
       <w:pPr>
-        <w:spacing w:after="40" w:line="247" w:lineRule="auto"/>
+        <w:spacing w:after="60" w:line="252" w:lineRule="auto"/>
         <w:jc w:val="both"/>
       </w:pPr>
       <w:r>
         <w:rPr>
           <w:rFonts w:ascii="Times New Roman" w:hAnsi="Times New Roman"/>
           <w:color w:val="000000"/>
-          <w:sz w:val="18"/>
+          <w:sz w:val="19"/>
         </w:rPr>
         <w:t>Field studies in criminology and HCI highlight three practical limitations with reactive SOS tools [3]:</w:t>
       </w:r>
     </w:p>
     <w:p>
       <w:pPr>
-        <w:spacing w:after="30" w:line="247" w:lineRule="auto"/>
-        <w:ind w:left="230" w:hanging="230"/>
+        <w:spacing w:after="50" w:line="252" w:lineRule="auto"/>
+        <w:ind w:left="259" w:hanging="259"/>
         <w:jc w:val="both"/>
       </w:pPr>
       <w:r>
         <w:rPr>
           <w:rFonts w:ascii="Times New Roman" w:hAnsi="Times New Roman"/>
           <w:b/>
-          <w:sz w:val="18"/>
+          <w:sz w:val="19"/>
         </w:rPr>
         <w:t xml:space="preserve">• </w:t>
       </w:r>
@@ -198,29 +198,29 @@
         <w:rPr>
           <w:rFonts w:ascii="Times New Roman" w:hAnsi="Times New Roman"/>
           <w:b/>
-          <w:sz w:val="18"/>
+          <w:sz w:val="19"/>
         </w:rPr>
         <w:t xml:space="preserve">Panic and Physical Restraint: </w:t>
       </w:r>
       <w:r>
         <w:rPr>
           <w:rFonts w:ascii="Times New Roman" w:hAnsi="Times New Roman"/>
-          <w:sz w:val="18"/>
+          <w:sz w:val="19"/>
         </w:rPr>
         <w:t>Sudden physical threats often induce panic or physical restraint, making it difficult to unlock a phone and press an alarm.</w:t>
       </w:r>
     </w:p>
     <w:p>
       <w:pPr>
-        <w:spacing w:after="30" w:line="247" w:lineRule="auto"/>
-        <w:ind w:left="230" w:hanging="230"/>
+        <w:spacing w:after="50" w:line="252" w:lineRule="auto"/>
+        <w:ind w:left="259" w:hanging="259"/>
         <w:jc w:val="both"/>
       </w:pPr>
       <w:r>
         <w:rPr>
           <w:rFonts w:ascii="Times New Roman" w:hAnsi="Times New Roman"/>
           <w:b/>
-          <w:sz w:val="18"/>
+          <w:sz w:val="19"/>
         </w:rPr>
         <w:t xml:space="preserve">• </w:t>
       </w:r>
@@ -228,29 +228,29 @@
         <w:rPr>
           <w:rFonts w:ascii="Times New Roman" w:hAnsi="Times New Roman"/>
           <w:b/>
-          <w:sz w:val="18"/>
+          <w:sz w:val="19"/>
         </w:rPr>
         <w:t xml:space="preserve">Absence of Pre-Trip Guidance: </w:t>
       </w:r>
       <w:r>
         <w:rPr>
           <w:rFonts w:ascii="Times New Roman" w:hAnsi="Times New Roman"/>
-          <w:sz w:val="18"/>
+          <w:sz w:val="19"/>
         </w:rPr>
         <w:t>Panic buttons do not offer pre-trip hazard warnings, meaning commuters still walk into dangerous areas without realizing it.</w:t>
       </w:r>
     </w:p>
     <w:p>
       <w:pPr>
-        <w:spacing w:after="30" w:line="247" w:lineRule="auto"/>
-        <w:ind w:left="230" w:hanging="230"/>
+        <w:spacing w:after="50" w:line="252" w:lineRule="auto"/>
+        <w:ind w:left="259" w:hanging="259"/>
         <w:jc w:val="both"/>
       </w:pPr>
       <w:r>
         <w:rPr>
           <w:rFonts w:ascii="Times New Roman" w:hAnsi="Times New Roman"/>
           <w:b/>
-          <w:sz w:val="18"/>
+          <w:sz w:val="19"/>
         </w:rPr>
         <w:t xml:space="preserve">• </w:t>
       </w:r>
@@ -258,57 +258,57 @@
         <w:rPr>
           <w:rFonts w:ascii="Times New Roman" w:hAnsi="Times New Roman"/>
           <w:b/>
-          <w:sz w:val="18"/>
+          <w:sz w:val="19"/>
         </w:rPr>
         <w:t xml:space="preserve">The 'Dark Figure of Crime': </w:t>
       </w:r>
       <w:r>
         <w:rPr>
           <w:rFonts w:ascii="Times New Roman" w:hAnsi="Times New Roman"/>
-          <w:sz w:val="18"/>
+          <w:sz w:val="19"/>
         </w:rPr>
         <w:t>They ignore everyday harassment, stalking, and catcalling that victims rarely report to law enforcement due to social stigma, procedural burden, or fear of retaliation [4].</w:t>
       </w:r>
     </w:p>
     <w:p>
       <w:pPr>
-        <w:spacing w:after="40" w:line="247" w:lineRule="auto"/>
+        <w:spacing w:after="60" w:line="252" w:lineRule="auto"/>
         <w:jc w:val="both"/>
       </w:pPr>
       <w:r>
         <w:rPr>
           <w:rFonts w:ascii="Times New Roman" w:hAnsi="Times New Roman"/>
           <w:color w:val="000000"/>
-          <w:sz w:val="18"/>
+          <w:sz w:val="19"/>
         </w:rPr>
         <w:t>At the same time, commercial mapping tools (such as Google Maps and Apple Maps) focus almost exclusively on minimizing walking distance or transit duration [5], [6]. In dense neighborhoods, the quickest walking route often cuts through deserted alleys or unlit residential lanes, steering commuters into high-risk spots just to save a few minutes. Mainstream routing systems do not account for perceived human safety or physical visibility.</w:t>
       </w:r>
     </w:p>
     <w:p>
       <w:pPr>
-        <w:spacing w:after="40" w:line="247" w:lineRule="auto"/>
+        <w:spacing w:after="60" w:line="252" w:lineRule="auto"/>
         <w:jc w:val="both"/>
       </w:pPr>
       <w:r>
         <w:rPr>
           <w:rFonts w:ascii="Times New Roman" w:hAnsi="Times New Roman"/>
           <w:color w:val="000000"/>
-          <w:sz w:val="18"/>
+          <w:sz w:val="19"/>
         </w:rPr>
         <w:t>To address these gaps, SafeCity introduces an integrated platform combining grassroots participatory safety reporting, risk-weighted navigation, and live companion escorts. The core contributions of this work are as follows:</w:t>
       </w:r>
     </w:p>
     <w:p>
       <w:pPr>
-        <w:spacing w:after="30" w:line="247" w:lineRule="auto"/>
-        <w:ind w:left="230" w:hanging="230"/>
+        <w:spacing w:after="50" w:line="252" w:lineRule="auto"/>
+        <w:ind w:left="259" w:hanging="259"/>
         <w:jc w:val="both"/>
       </w:pPr>
       <w:r>
         <w:rPr>
           <w:rFonts w:ascii="Times New Roman" w:hAnsi="Times New Roman"/>
           <w:b/>
-          <w:sz w:val="18"/>
+          <w:sz w:val="19"/>
         </w:rPr>
         <w:t xml:space="preserve">• </w:t>
       </w:r>
@@ -316,29 +316,29 @@
         <w:rPr>
           <w:rFonts w:ascii="Times New Roman" w:hAnsi="Times New Roman"/>
           <w:b/>
-          <w:sz w:val="18"/>
+          <w:sz w:val="19"/>
         </w:rPr>
         <w:t xml:space="preserve">Proactive Multi-Criteria Pathfinding: </w:t>
       </w:r>
       <w:r>
         <w:rPr>
           <w:rFonts w:ascii="Times New Roman" w:hAnsi="Times New Roman"/>
-          <w:sz w:val="18"/>
+          <w:sz w:val="19"/>
         </w:rPr>
         <w:t>A route planning algorithm that balances distance, street illumination, active 24/7 civic refuge havens, and exponentially decaying spatial crime clusters, enabling commuters to deliberately trade slight distance increases for substantial crime risk reductions.</w:t>
       </w:r>
     </w:p>
     <w:p>
       <w:pPr>
-        <w:spacing w:after="30" w:line="247" w:lineRule="auto"/>
-        <w:ind w:left="230" w:hanging="230"/>
+        <w:spacing w:after="50" w:line="252" w:lineRule="auto"/>
+        <w:ind w:left="259" w:hanging="259"/>
         <w:jc w:val="both"/>
       </w:pPr>
       <w:r>
         <w:rPr>
           <w:rFonts w:ascii="Times New Roman" w:hAnsi="Times New Roman"/>
           <w:b/>
-          <w:sz w:val="18"/>
+          <w:sz w:val="19"/>
         </w:rPr>
         <w:t xml:space="preserve">• </w:t>
       </w:r>
@@ -346,29 +346,29 @@
         <w:rPr>
           <w:rFonts w:ascii="Times New Roman" w:hAnsi="Times New Roman"/>
           <w:b/>
-          <w:sz w:val="18"/>
+          <w:sz w:val="19"/>
         </w:rPr>
         <w:t xml:space="preserve">Privacy-Preserving Participatory Ingestion: </w:t>
       </w:r>
       <w:r>
         <w:rPr>
           <w:rFonts w:ascii="Times New Roman" w:hAnsi="Times New Roman"/>
-          <w:sz w:val="18"/>
+          <w:sz w:val="19"/>
         </w:rPr>
         <w:t>An anonymous reporting pipeline that quantizes spatial coordinates to a 3-decimal grid cell (~110-meter resolution) to eliminate victim doorway identification while maintaining actionable geographic intelligence.</w:t>
       </w:r>
     </w:p>
     <w:p>
       <w:pPr>
-        <w:spacing w:after="30" w:line="247" w:lineRule="auto"/>
-        <w:ind w:left="230" w:hanging="230"/>
+        <w:spacing w:after="50" w:line="252" w:lineRule="auto"/>
+        <w:ind w:left="259" w:hanging="259"/>
         <w:jc w:val="both"/>
       </w:pPr>
       <w:r>
         <w:rPr>
           <w:rFonts w:ascii="Times New Roman" w:hAnsi="Times New Roman"/>
           <w:b/>
-          <w:sz w:val="18"/>
+          <w:sz w:val="19"/>
         </w:rPr>
         <w:t xml:space="preserve">• </w:t>
       </w:r>
@@ -376,29 +376,29 @@
         <w:rPr>
           <w:rFonts w:ascii="Times New Roman" w:hAnsi="Times New Roman"/>
           <w:b/>
-          <w:sz w:val="18"/>
+          <w:sz w:val="19"/>
         </w:rPr>
         <w:t xml:space="preserve">Companion Escort &amp; Inactivity Watchdog: </w:t>
       </w:r>
       <w:r>
         <w:rPr>
           <w:rFonts w:ascii="Times New Roman" w:hAnsi="Times New Roman"/>
-          <w:sz w:val="18"/>
+          <w:sz w:val="19"/>
         </w:rPr>
         <w:t>A continuous GPS-driven virtual escort module featuring live telemetry tracking, speed filtering, an autonomous 180-second stationary countdown watchdog, and multi-stage acoustic-visual emergency escalation.</w:t>
       </w:r>
     </w:p>
     <w:p>
       <w:pPr>
-        <w:spacing w:after="30" w:line="247" w:lineRule="auto"/>
-        <w:ind w:left="230" w:hanging="230"/>
+        <w:spacing w:after="50" w:line="252" w:lineRule="auto"/>
+        <w:ind w:left="259" w:hanging="259"/>
         <w:jc w:val="both"/>
       </w:pPr>
       <w:r>
         <w:rPr>
           <w:rFonts w:ascii="Times New Roman" w:hAnsi="Times New Roman"/>
           <w:b/>
-          <w:sz w:val="18"/>
+          <w:sz w:val="19"/>
         </w:rPr>
         <w:t xml:space="preserve">• </w:t>
       </w:r>
@@ -406,28 +406,28 @@
         <w:rPr>
           <w:rFonts w:ascii="Times New Roman" w:hAnsi="Times New Roman"/>
           <w:b/>
-          <w:sz w:val="18"/>
+          <w:sz w:val="19"/>
         </w:rPr>
         <w:t xml:space="preserve">Comprehensive Civic Refuge Network: </w:t>
       </w:r>
       <w:r>
         <w:rPr>
           <w:rFonts w:ascii="Times New Roman" w:hAnsi="Times New Roman"/>
-          <w:sz w:val="18"/>
+          <w:sz w:val="19"/>
         </w:rPr>
         <w:t>A verified directory of 24/7 open public sanctuaries (hospitals, petrol bunks, police assistance booths, transit desks) coupled with a two-tier administrative moderation workflow to prevent malicious misinformation.</w:t>
       </w:r>
     </w:p>
     <w:p>
       <w:pPr>
-        <w:spacing w:after="40" w:line="247" w:lineRule="auto"/>
+        <w:spacing w:after="60" w:line="252" w:lineRule="auto"/>
         <w:jc w:val="both"/>
       </w:pPr>
       <w:r>
         <w:rPr>
           <w:rFonts w:ascii="Times New Roman" w:hAnsi="Times New Roman"/>
           <w:color w:val="000000"/>
-          <w:sz w:val="18"/>
+          <w:sz w:val="19"/>
         </w:rPr>
         <w:t>In the following sections, Section II surveys prior work across participatory crime mapping and safety routing. Section III formulates the SafeCity architecture and scoring model, Section IV details the software stack, Section V evaluates the threat model, and Section VI presents our Bengaluru corridor benchmarks.</w:t>
       </w:r>
@@ -435,7 +435,7 @@
     <w:p>
       <w:pPr>
         <w:keepNext/>
-        <w:spacing w:before="120" w:after="40"/>
+        <w:spacing w:before="160" w:after="50"/>
         <w:jc w:val="center"/>
       </w:pPr>
       <w:r>
@@ -443,7 +443,7 @@
           <w:rFonts w:ascii="Times New Roman" w:hAnsi="Times New Roman"/>
           <w:b/>
           <w:color w:val="000000"/>
-          <w:sz w:val="19"/>
+          <w:sz w:val="20"/>
         </w:rPr>
         <w:t>II. RELATED WORK</w:t>
       </w:r>
@@ -451,7 +451,7 @@
     <w:p>
       <w:pPr>
         <w:keepNext/>
-        <w:spacing w:before="80" w:after="20"/>
+        <w:spacing w:before="100" w:after="30"/>
         <w:jc w:val="left"/>
       </w:pPr>
       <w:r>
@@ -460,21 +460,21 @@
           <w:b/>
           <w:i/>
           <w:color w:val="000000"/>
-          <w:sz w:val="18"/>
+          <w:sz w:val="19"/>
         </w:rPr>
         <w:t>A. Participatory Safety Sensing and Crowdsourced Audits</w:t>
       </w:r>
     </w:p>
     <w:p>
       <w:pPr>
-        <w:spacing w:after="40" w:line="247" w:lineRule="auto"/>
+        <w:spacing w:after="60" w:line="252" w:lineRule="auto"/>
         <w:jc w:val="both"/>
       </w:pPr>
       <w:r>
         <w:rPr>
           <w:rFonts w:ascii="Times New Roman" w:hAnsi="Times New Roman"/>
           <w:color w:val="000000"/>
-          <w:sz w:val="18"/>
+          <w:sz w:val="19"/>
         </w:rPr>
         <w:t>Crowdsourced civic sensing has transformed modern spatial safety analysis. Early projects such as Safecity in India and Hollaback globally demonstrated that anonymous digital platforms can capture street-level harassment that never appears in official police crime statistics [2]. Solymosi et al. [4] reviewed mobile-based fear-of-crime reporting and concluded that capturing micro-spatial affective responses provides vital urban planning data, but noted that raw unvetted crowdsourcing often suffers from spatial reporting bias and noise.</w:t>
       </w:r>
@@ -482,7 +482,7 @@
     <w:p>
       <w:pPr>
         <w:keepNext/>
-        <w:spacing w:before="80" w:after="20"/>
+        <w:spacing w:before="100" w:after="30"/>
         <w:jc w:val="left"/>
       </w:pPr>
       <w:r>
@@ -491,21 +491,21 @@
           <w:b/>
           <w:i/>
           <w:color w:val="000000"/>
-          <w:sz w:val="18"/>
+          <w:sz w:val="19"/>
         </w:rPr>
         <w:t>B. Safety-Aware and Multi-Objective Navigation</w:t>
       </w:r>
     </w:p>
     <w:p>
       <w:pPr>
-        <w:spacing w:after="40" w:line="247" w:lineRule="auto"/>
+        <w:spacing w:after="60" w:line="252" w:lineRule="auto"/>
         <w:jc w:val="both"/>
       </w:pPr>
       <w:r>
         <w:rPr>
           <w:rFonts w:ascii="Times New Roman" w:hAnsi="Times New Roman"/>
           <w:color w:val="000000"/>
-          <w:sz w:val="18"/>
+          <w:sz w:val="19"/>
         </w:rPr>
         <w:t>Pedestrian routing algorithms traditionally optimize for physical distance or travel time. Galbrun et al. [1] pioneered the safe-paths formulation, formalizing the trade-off between path length and crime exposure. Quercia et al. [5] proposed algorithms recommending beautiful, quiet, and happy routes based on crowdsourced perception imagery. Levy et al. [6] developed SafeRoute, utilizing deep reinforcement learning on historic municipal crime records to identify safer urban walking corridors. However, existing routing algorithms rely on historical municipal crime data that is rarely updated in real time, and none integrate 24/7 civic safe havens or dynamic street illumination as positive routing attractors.</w:t>
       </w:r>
@@ -513,7 +513,7 @@
     <w:p>
       <w:pPr>
         <w:keepNext/>
-        <w:spacing w:before="80" w:after="20"/>
+        <w:spacing w:before="100" w:after="30"/>
         <w:jc w:val="left"/>
       </w:pPr>
       <w:r>
@@ -522,21 +522,21 @@
           <w:b/>
           <w:i/>
           <w:color w:val="000000"/>
-          <w:sz w:val="18"/>
+          <w:sz w:val="19"/>
         </w:rPr>
         <w:t>C. Mobile Panic Buttons and Reactive Hardware</w:t>
       </w:r>
     </w:p>
     <w:p>
       <w:pPr>
-        <w:spacing w:after="40" w:line="247" w:lineRule="auto"/>
+        <w:spacing w:after="60" w:line="252" w:lineRule="auto"/>
         <w:jc w:val="both"/>
       </w:pPr>
       <w:r>
         <w:rPr>
           <w:rFonts w:ascii="Times New Roman" w:hAnsi="Times New Roman"/>
           <w:color w:val="000000"/>
-          <w:sz w:val="18"/>
+          <w:sz w:val="19"/>
         </w:rPr>
         <w:t>Standalone mobile safety apps such as Abhaya [3] and wearable IoT panic buttons [7] focus almost entirely on post-incident distress signalling. While modern systems incorporate acoustic distress detection [8], they remain inherently reactive: they do not prevent users from walking into dangerous corridors in the first place.</w:t>
       </w:r>
@@ -544,7 +544,7 @@
     <w:p>
       <w:pPr>
         <w:keepNext/>
-        <w:spacing w:before="80" w:after="20"/>
+        <w:spacing w:before="100" w:after="30"/>
         <w:jc w:val="left"/>
       </w:pPr>
       <w:r>
@@ -553,21 +553,21 @@
           <w:b/>
           <w:i/>
           <w:color w:val="000000"/>
-          <w:sz w:val="18"/>
+          <w:sz w:val="19"/>
         </w:rPr>
         <w:t>D. Positioning Against Existing Literature</w:t>
       </w:r>
     </w:p>
     <w:p>
       <w:pPr>
-        <w:spacing w:after="40" w:line="247" w:lineRule="auto"/>
+        <w:spacing w:after="60" w:line="252" w:lineRule="auto"/>
         <w:jc w:val="both"/>
       </w:pPr>
       <w:r>
         <w:rPr>
           <w:rFonts w:ascii="Times New Roman" w:hAnsi="Times New Roman"/>
           <w:color w:val="000000"/>
-          <w:sz w:val="18"/>
+          <w:sz w:val="19"/>
         </w:rPr>
         <w:t>Table I contrasts SafeCity against existing literature across primary routing objectives, live escort capabilities, spatial privacy, and civic refuge integration.</w:t>
       </w:r>
@@ -575,7 +575,7 @@
     <w:p>
       <w:pPr>
         <w:keepNext/>
-        <w:spacing w:before="80" w:after="30"/>
+        <w:spacing w:before="100" w:after="40"/>
         <w:jc w:val="center"/>
       </w:pPr>
       <w:r>
@@ -594,10 +594,10 @@
         <w:tblLook w:firstColumn="1" w:firstRow="1" w:lastColumn="0" w:lastRow="0" w:noHBand="0" w:noVBand="1" w:val="04A0"/>
       </w:tblPr>
       <w:tblGrid>
-        <w:gridCol w:w="2570"/>
-        <w:gridCol w:w="2570"/>
-        <w:gridCol w:w="2570"/>
-        <w:gridCol w:w="2570"/>
+        <w:gridCol w:w="2556"/>
+        <w:gridCol w:w="2556"/>
+        <w:gridCol w:w="2556"/>
+        <w:gridCol w:w="2556"/>
       </w:tblGrid>
       <w:tr>
         <w:trPr>
@@ -607,6 +607,119 @@
           <w:tcPr>
             <w:tcW w:type="dxa" w:w="864"/>
             <w:shd w:fill="1E293B"/>
+            <w:tcMar>
+              <w:top w:w="35" w:type="dxa"/>
+              <w:bottom w:w="35" w:type="dxa"/>
+              <w:left w:w="45" w:type="dxa"/>
+              <w:right w:w="45" w:type="dxa"/>
+            </w:tcMar>
+          </w:tcPr>
+          <w:p>
+            <w:pPr>
+              <w:keepNext/>
+              <w:jc w:val="center"/>
+            </w:pPr>
+            <w:r>
+              <w:rPr>
+                <w:rFonts w:ascii="Times New Roman" w:hAnsi="Times New Roman"/>
+                <w:b/>
+                <w:color w:val="FFFFFF"/>
+                <w:sz w:val="16"/>
+              </w:rPr>
+              <w:t>Ref.</w:t>
+            </w:r>
+          </w:p>
+        </w:tc>
+        <w:tc>
+          <w:tcPr>
+            <w:tcW w:type="dxa" w:w="2016"/>
+            <w:shd w:fill="1E293B"/>
+            <w:tcMar>
+              <w:top w:w="35" w:type="dxa"/>
+              <w:bottom w:w="35" w:type="dxa"/>
+              <w:left w:w="45" w:type="dxa"/>
+              <w:right w:w="45" w:type="dxa"/>
+            </w:tcMar>
+          </w:tcPr>
+          <w:p>
+            <w:pPr>
+              <w:keepNext/>
+              <w:jc w:val="center"/>
+            </w:pPr>
+            <w:r>
+              <w:rPr>
+                <w:rFonts w:ascii="Times New Roman" w:hAnsi="Times New Roman"/>
+                <w:b/>
+                <w:color w:val="FFFFFF"/>
+                <w:sz w:val="16"/>
+              </w:rPr>
+              <w:t>Core Focus</w:t>
+            </w:r>
+          </w:p>
+        </w:tc>
+        <w:tc>
+          <w:tcPr>
+            <w:tcW w:type="dxa" w:w="1008"/>
+            <w:shd w:fill="1E293B"/>
+            <w:tcMar>
+              <w:top w:w="35" w:type="dxa"/>
+              <w:bottom w:w="35" w:type="dxa"/>
+              <w:left w:w="45" w:type="dxa"/>
+              <w:right w:w="45" w:type="dxa"/>
+            </w:tcMar>
+          </w:tcPr>
+          <w:p>
+            <w:pPr>
+              <w:keepNext/>
+              <w:jc w:val="center"/>
+            </w:pPr>
+            <w:r>
+              <w:rPr>
+                <w:rFonts w:ascii="Times New Roman" w:hAnsi="Times New Roman"/>
+                <w:b/>
+                <w:color w:val="FFFFFF"/>
+                <w:sz w:val="16"/>
+              </w:rPr>
+              <w:t>Proactive?</w:t>
+            </w:r>
+          </w:p>
+        </w:tc>
+        <w:tc>
+          <w:tcPr>
+            <w:tcW w:type="dxa" w:w="1008"/>
+            <w:shd w:fill="1E293B"/>
+            <w:tcMar>
+              <w:top w:w="35" w:type="dxa"/>
+              <w:bottom w:w="35" w:type="dxa"/>
+              <w:left w:w="45" w:type="dxa"/>
+              <w:right w:w="45" w:type="dxa"/>
+            </w:tcMar>
+          </w:tcPr>
+          <w:p>
+            <w:pPr>
+              <w:keepNext/>
+              <w:jc w:val="center"/>
+            </w:pPr>
+            <w:r>
+              <w:rPr>
+                <w:rFonts w:ascii="Times New Roman" w:hAnsi="Times New Roman"/>
+                <w:b/>
+                <w:color w:val="FFFFFF"/>
+                <w:sz w:val="16"/>
+              </w:rPr>
+              <w:t>Live Escort?</w:t>
+            </w:r>
+          </w:p>
+        </w:tc>
+      </w:tr>
+      <w:tr>
+        <w:trPr>
+          <w:cantSplit/>
+        </w:trPr>
+        <w:tc>
+          <w:tcPr>
+            <w:tcW w:type="dxa" w:w="864"/>
+            <w:shd w:fill="FFFFFF"/>
             <w:tcMar>
               <w:top w:w="28" w:type="dxa"/>
               <w:bottom w:w="28" w:type="dxa"/>
@@ -622,18 +735,100 @@
             <w:r>
               <w:rPr>
                 <w:rFonts w:ascii="Times New Roman" w:hAnsi="Times New Roman"/>
-                <w:b/>
-                <w:color w:val="FFFFFF"/>
+                <w:color w:val="0F172A"/>
                 <w:sz w:val="15"/>
               </w:rPr>
-              <w:t>Ref.</w:t>
+              <w:t>[1], [2]</w:t>
             </w:r>
           </w:p>
         </w:tc>
         <w:tc>
           <w:tcPr>
             <w:tcW w:type="dxa" w:w="2016"/>
-            <w:shd w:fill="1E293B"/>
+            <w:shd w:fill="FFFFFF"/>
+            <w:tcMar>
+              <w:top w:w="28" w:type="dxa"/>
+              <w:bottom w:w="28" w:type="dxa"/>
+              <w:left w:w="40" w:type="dxa"/>
+              <w:right w:w="40" w:type="dxa"/>
+            </w:tcMar>
+          </w:tcPr>
+          <w:p>
+            <w:pPr>
+              <w:keepNext/>
+              <w:jc w:val="left"/>
+            </w:pPr>
+            <w:r>
+              <w:rPr>
+                <w:rFonts w:ascii="Times New Roman" w:hAnsi="Times New Roman"/>
+                <w:color w:val="0F172A"/>
+                <w:sz w:val="15"/>
+              </w:rPr>
+              <w:t>Safe path heuristics &amp; crowdsourcing</w:t>
+            </w:r>
+          </w:p>
+        </w:tc>
+        <w:tc>
+          <w:tcPr>
+            <w:tcW w:type="dxa" w:w="1008"/>
+            <w:shd w:fill="FFFFFF"/>
+            <w:tcMar>
+              <w:top w:w="28" w:type="dxa"/>
+              <w:bottom w:w="28" w:type="dxa"/>
+              <w:left w:w="40" w:type="dxa"/>
+              <w:right w:w="40" w:type="dxa"/>
+            </w:tcMar>
+          </w:tcPr>
+          <w:p>
+            <w:pPr>
+              <w:keepNext/>
+              <w:jc w:val="left"/>
+            </w:pPr>
+            <w:r>
+              <w:rPr>
+                <w:rFonts w:ascii="Times New Roman" w:hAnsi="Times New Roman"/>
+                <w:color w:val="0F172A"/>
+                <w:sz w:val="15"/>
+              </w:rPr>
+              <w:t>Heuristic</w:t>
+            </w:r>
+          </w:p>
+        </w:tc>
+        <w:tc>
+          <w:tcPr>
+            <w:tcW w:type="dxa" w:w="1008"/>
+            <w:shd w:fill="FFFFFF"/>
+            <w:tcMar>
+              <w:top w:w="28" w:type="dxa"/>
+              <w:bottom w:w="28" w:type="dxa"/>
+              <w:left w:w="40" w:type="dxa"/>
+              <w:right w:w="40" w:type="dxa"/>
+            </w:tcMar>
+          </w:tcPr>
+          <w:p>
+            <w:pPr>
+              <w:keepNext/>
+              <w:jc w:val="left"/>
+            </w:pPr>
+            <w:r>
+              <w:rPr>
+                <w:rFonts w:ascii="Times New Roman" w:hAnsi="Times New Roman"/>
+                <w:color w:val="0F172A"/>
+                <w:sz w:val="15"/>
+              </w:rPr>
+              <w:t>No</w:t>
+            </w:r>
+          </w:p>
+        </w:tc>
+      </w:tr>
+      <w:tr>
+        <w:trPr>
+          <w:cantSplit/>
+        </w:trPr>
+        <w:tc>
+          <w:tcPr>
+            <w:tcW w:type="dxa" w:w="864"/>
+            <w:shd w:fill="F8FAFC"/>
             <w:tcMar>
               <w:top w:w="28" w:type="dxa"/>
               <w:bottom w:w="28" w:type="dxa"/>
@@ -649,18 +844,100 @@
             <w:r>
               <w:rPr>
                 <w:rFonts w:ascii="Times New Roman" w:hAnsi="Times New Roman"/>
-                <w:b/>
-                <w:color w:val="FFFFFF"/>
+                <w:color w:val="0F172A"/>
                 <w:sz w:val="15"/>
               </w:rPr>
-              <w:t>Core Focus</w:t>
+              <w:t>[3]</w:t>
+            </w:r>
+          </w:p>
+        </w:tc>
+        <w:tc>
+          <w:tcPr>
+            <w:tcW w:type="dxa" w:w="2016"/>
+            <w:shd w:fill="F8FAFC"/>
+            <w:tcMar>
+              <w:top w:w="28" w:type="dxa"/>
+              <w:bottom w:w="28" w:type="dxa"/>
+              <w:left w:w="40" w:type="dxa"/>
+              <w:right w:w="40" w:type="dxa"/>
+            </w:tcMar>
+          </w:tcPr>
+          <w:p>
+            <w:pPr>
+              <w:keepNext/>
+              <w:jc w:val="left"/>
+            </w:pPr>
+            <w:r>
+              <w:rPr>
+                <w:rFonts w:ascii="Times New Roman" w:hAnsi="Times New Roman"/>
+                <w:color w:val="0F172A"/>
+                <w:sz w:val="15"/>
+              </w:rPr>
+              <w:t>Reactive mobile panic alarm (Abhaya)</w:t>
             </w:r>
           </w:p>
         </w:tc>
         <w:tc>
           <w:tcPr>
             <w:tcW w:type="dxa" w:w="1008"/>
-            <w:shd w:fill="1E293B"/>
+            <w:shd w:fill="F8FAFC"/>
+            <w:tcMar>
+              <w:top w:w="28" w:type="dxa"/>
+              <w:bottom w:w="28" w:type="dxa"/>
+              <w:left w:w="40" w:type="dxa"/>
+              <w:right w:w="40" w:type="dxa"/>
+            </w:tcMar>
+          </w:tcPr>
+          <w:p>
+            <w:pPr>
+              <w:keepNext/>
+              <w:jc w:val="left"/>
+            </w:pPr>
+            <w:r>
+              <w:rPr>
+                <w:rFonts w:ascii="Times New Roman" w:hAnsi="Times New Roman"/>
+                <w:color w:val="0F172A"/>
+                <w:sz w:val="15"/>
+              </w:rPr>
+              <w:t>No</w:t>
+            </w:r>
+          </w:p>
+        </w:tc>
+        <w:tc>
+          <w:tcPr>
+            <w:tcW w:type="dxa" w:w="1008"/>
+            <w:shd w:fill="F8FAFC"/>
+            <w:tcMar>
+              <w:top w:w="28" w:type="dxa"/>
+              <w:bottom w:w="28" w:type="dxa"/>
+              <w:left w:w="40" w:type="dxa"/>
+              <w:right w:w="40" w:type="dxa"/>
+            </w:tcMar>
+          </w:tcPr>
+          <w:p>
+            <w:pPr>
+              <w:keepNext/>
+              <w:jc w:val="left"/>
+            </w:pPr>
+            <w:r>
+              <w:rPr>
+                <w:rFonts w:ascii="Times New Roman" w:hAnsi="Times New Roman"/>
+                <w:color w:val="0F172A"/>
+                <w:sz w:val="15"/>
+              </w:rPr>
+              <w:t>Manual SMS</w:t>
+            </w:r>
+          </w:p>
+        </w:tc>
+      </w:tr>
+      <w:tr>
+        <w:trPr>
+          <w:cantSplit/>
+        </w:trPr>
+        <w:tc>
+          <w:tcPr>
+            <w:tcW w:type="dxa" w:w="864"/>
+            <w:shd w:fill="FFFFFF"/>
             <w:tcMar>
               <w:top w:w="28" w:type="dxa"/>
               <w:bottom w:w="28" w:type="dxa"/>
@@ -676,18 +953,100 @@
             <w:r>
               <w:rPr>
                 <w:rFonts w:ascii="Times New Roman" w:hAnsi="Times New Roman"/>
-                <w:b/>
-                <w:color w:val="FFFFFF"/>
+                <w:color w:val="0F172A"/>
                 <w:sz w:val="15"/>
               </w:rPr>
-              <w:t>Proactive?</w:t>
+              <w:t>[4]</w:t>
+            </w:r>
+          </w:p>
+        </w:tc>
+        <w:tc>
+          <w:tcPr>
+            <w:tcW w:type="dxa" w:w="2016"/>
+            <w:shd w:fill="FFFFFF"/>
+            <w:tcMar>
+              <w:top w:w="28" w:type="dxa"/>
+              <w:bottom w:w="28" w:type="dxa"/>
+              <w:left w:w="40" w:type="dxa"/>
+              <w:right w:w="40" w:type="dxa"/>
+            </w:tcMar>
+          </w:tcPr>
+          <w:p>
+            <w:pPr>
+              <w:keepNext/>
+              <w:jc w:val="left"/>
+            </w:pPr>
+            <w:r>
+              <w:rPr>
+                <w:rFonts w:ascii="Times New Roman" w:hAnsi="Times New Roman"/>
+                <w:color w:val="0F172A"/>
+                <w:sz w:val="15"/>
+              </w:rPr>
+              <w:t>Systematic review of fear of crime</w:t>
             </w:r>
           </w:p>
         </w:tc>
         <w:tc>
           <w:tcPr>
             <w:tcW w:type="dxa" w:w="1008"/>
-            <w:shd w:fill="1E293B"/>
+            <w:shd w:fill="FFFFFF"/>
+            <w:tcMar>
+              <w:top w:w="28" w:type="dxa"/>
+              <w:bottom w:w="28" w:type="dxa"/>
+              <w:left w:w="40" w:type="dxa"/>
+              <w:right w:w="40" w:type="dxa"/>
+            </w:tcMar>
+          </w:tcPr>
+          <w:p>
+            <w:pPr>
+              <w:keepNext/>
+              <w:jc w:val="left"/>
+            </w:pPr>
+            <w:r>
+              <w:rPr>
+                <w:rFonts w:ascii="Times New Roman" w:hAnsi="Times New Roman"/>
+                <w:color w:val="0F172A"/>
+                <w:sz w:val="15"/>
+              </w:rPr>
+              <w:t>Descriptive</w:t>
+            </w:r>
+          </w:p>
+        </w:tc>
+        <w:tc>
+          <w:tcPr>
+            <w:tcW w:type="dxa" w:w="1008"/>
+            <w:shd w:fill="FFFFFF"/>
+            <w:tcMar>
+              <w:top w:w="28" w:type="dxa"/>
+              <w:bottom w:w="28" w:type="dxa"/>
+              <w:left w:w="40" w:type="dxa"/>
+              <w:right w:w="40" w:type="dxa"/>
+            </w:tcMar>
+          </w:tcPr>
+          <w:p>
+            <w:pPr>
+              <w:keepNext/>
+              <w:jc w:val="left"/>
+            </w:pPr>
+            <w:r>
+              <w:rPr>
+                <w:rFonts w:ascii="Times New Roman" w:hAnsi="Times New Roman"/>
+                <w:color w:val="0F172A"/>
+                <w:sz w:val="15"/>
+              </w:rPr>
+              <w:t>No</w:t>
+            </w:r>
+          </w:p>
+        </w:tc>
+      </w:tr>
+      <w:tr>
+        <w:trPr>
+          <w:cantSplit/>
+        </w:trPr>
+        <w:tc>
+          <w:tcPr>
+            <w:tcW w:type="dxa" w:w="864"/>
+            <w:shd w:fill="F8FAFC"/>
             <w:tcMar>
               <w:top w:w="28" w:type="dxa"/>
               <w:bottom w:w="28" w:type="dxa"/>
@@ -703,54 +1062,22 @@
             <w:r>
               <w:rPr>
                 <w:rFonts w:ascii="Times New Roman" w:hAnsi="Times New Roman"/>
-                <w:b/>
-                <w:color w:val="FFFFFF"/>
+                <w:color w:val="0F172A"/>
                 <w:sz w:val="15"/>
               </w:rPr>
-              <w:t>Live Escort?</w:t>
-            </w:r>
-          </w:p>
-        </w:tc>
-      </w:tr>
-      <w:tr>
-        <w:trPr>
-          <w:cantSplit/>
-        </w:trPr>
-        <w:tc>
-          <w:tcPr>
-            <w:tcW w:type="dxa" w:w="864"/>
-            <w:shd w:fill="FFFFFF"/>
-            <w:tcMar>
-              <w:top w:w="22" w:type="dxa"/>
-              <w:bottom w:w="22" w:type="dxa"/>
-              <w:left w:w="35" w:type="dxa"/>
-              <w:right w:w="35" w:type="dxa"/>
-            </w:tcMar>
-          </w:tcPr>
-          <w:p>
-            <w:pPr>
-              <w:keepNext/>
-              <w:jc w:val="center"/>
-            </w:pPr>
-            <w:r>
-              <w:rPr>
-                <w:rFonts w:ascii="Times New Roman" w:hAnsi="Times New Roman"/>
-                <w:color w:val="0F172A"/>
-                <w:sz w:val="14"/>
-              </w:rPr>
-              <w:t>[1], [2]</w:t>
+              <w:t>[5], [6]</w:t>
             </w:r>
           </w:p>
         </w:tc>
         <w:tc>
           <w:tcPr>
             <w:tcW w:type="dxa" w:w="2016"/>
-            <w:shd w:fill="FFFFFF"/>
+            <w:shd w:fill="F8FAFC"/>
             <w:tcMar>
-              <w:top w:w="22" w:type="dxa"/>
-              <w:bottom w:w="22" w:type="dxa"/>
-              <w:left w:w="35" w:type="dxa"/>
-              <w:right w:w="35" w:type="dxa"/>
+              <w:top w:w="28" w:type="dxa"/>
+              <w:bottom w:w="28" w:type="dxa"/>
+              <w:left w:w="40" w:type="dxa"/>
+              <w:right w:w="40" w:type="dxa"/>
             </w:tcMar>
           </w:tcPr>
           <w:p>
@@ -762,21 +1089,21 @@
               <w:rPr>
                 <w:rFonts w:ascii="Times New Roman" w:hAnsi="Times New Roman"/>
                 <w:color w:val="0F172A"/>
-                <w:sz w:val="14"/>
+                <w:sz w:val="15"/>
               </w:rPr>
-              <w:t>Safe path heuristics &amp; crowdsourcing</w:t>
+              <w:t>Aesthetic &amp; safe deep learning paths</w:t>
             </w:r>
           </w:p>
         </w:tc>
         <w:tc>
           <w:tcPr>
             <w:tcW w:type="dxa" w:w="1008"/>
-            <w:shd w:fill="FFFFFF"/>
+            <w:shd w:fill="F8FAFC"/>
             <w:tcMar>
-              <w:top w:w="22" w:type="dxa"/>
-              <w:bottom w:w="22" w:type="dxa"/>
-              <w:left w:w="35" w:type="dxa"/>
-              <w:right w:w="35" w:type="dxa"/>
+              <w:top w:w="28" w:type="dxa"/>
+              <w:bottom w:w="28" w:type="dxa"/>
+              <w:left w:w="40" w:type="dxa"/>
+              <w:right w:w="40" w:type="dxa"/>
             </w:tcMar>
           </w:tcPr>
           <w:p>
@@ -788,21 +1115,21 @@
               <w:rPr>
                 <w:rFonts w:ascii="Times New Roman" w:hAnsi="Times New Roman"/>
                 <w:color w:val="0F172A"/>
-                <w:sz w:val="14"/>
+                <w:sz w:val="15"/>
               </w:rPr>
-              <w:t>Heuristic</w:t>
+              <w:t>Visual</w:t>
             </w:r>
           </w:p>
         </w:tc>
         <w:tc>
           <w:tcPr>
             <w:tcW w:type="dxa" w:w="1008"/>
-            <w:shd w:fill="FFFFFF"/>
+            <w:shd w:fill="F8FAFC"/>
             <w:tcMar>
-              <w:top w:w="22" w:type="dxa"/>
-              <w:bottom w:w="22" w:type="dxa"/>
-              <w:left w:w="35" w:type="dxa"/>
-              <w:right w:w="35" w:type="dxa"/>
+              <w:top w:w="28" w:type="dxa"/>
+              <w:bottom w:w="28" w:type="dxa"/>
+              <w:left w:w="40" w:type="dxa"/>
+              <w:right w:w="40" w:type="dxa"/>
             </w:tcMar>
           </w:tcPr>
           <w:p>
@@ -814,334 +1141,7 @@
               <w:rPr>
                 <w:rFonts w:ascii="Times New Roman" w:hAnsi="Times New Roman"/>
                 <w:color w:val="0F172A"/>
-                <w:sz w:val="14"/>
-              </w:rPr>
-              <w:t>No</w:t>
-            </w:r>
-          </w:p>
-        </w:tc>
-      </w:tr>
-      <w:tr>
-        <w:trPr>
-          <w:cantSplit/>
-        </w:trPr>
-        <w:tc>
-          <w:tcPr>
-            <w:tcW w:type="dxa" w:w="864"/>
-            <w:shd w:fill="F8FAFC"/>
-            <w:tcMar>
-              <w:top w:w="22" w:type="dxa"/>
-              <w:bottom w:w="22" w:type="dxa"/>
-              <w:left w:w="35" w:type="dxa"/>
-              <w:right w:w="35" w:type="dxa"/>
-            </w:tcMar>
-          </w:tcPr>
-          <w:p>
-            <w:pPr>
-              <w:keepNext/>
-              <w:jc w:val="center"/>
-            </w:pPr>
-            <w:r>
-              <w:rPr>
-                <w:rFonts w:ascii="Times New Roman" w:hAnsi="Times New Roman"/>
-                <w:color w:val="0F172A"/>
-                <w:sz w:val="14"/>
-              </w:rPr>
-              <w:t>[3]</w:t>
-            </w:r>
-          </w:p>
-        </w:tc>
-        <w:tc>
-          <w:tcPr>
-            <w:tcW w:type="dxa" w:w="2016"/>
-            <w:shd w:fill="F8FAFC"/>
-            <w:tcMar>
-              <w:top w:w="22" w:type="dxa"/>
-              <w:bottom w:w="22" w:type="dxa"/>
-              <w:left w:w="35" w:type="dxa"/>
-              <w:right w:w="35" w:type="dxa"/>
-            </w:tcMar>
-          </w:tcPr>
-          <w:p>
-            <w:pPr>
-              <w:keepNext/>
-              <w:jc w:val="left"/>
-            </w:pPr>
-            <w:r>
-              <w:rPr>
-                <w:rFonts w:ascii="Times New Roman" w:hAnsi="Times New Roman"/>
-                <w:color w:val="0F172A"/>
-                <w:sz w:val="14"/>
-              </w:rPr>
-              <w:t>Reactive mobile panic alarm (Abhaya)</w:t>
-            </w:r>
-          </w:p>
-        </w:tc>
-        <w:tc>
-          <w:tcPr>
-            <w:tcW w:type="dxa" w:w="1008"/>
-            <w:shd w:fill="F8FAFC"/>
-            <w:tcMar>
-              <w:top w:w="22" w:type="dxa"/>
-              <w:bottom w:w="22" w:type="dxa"/>
-              <w:left w:w="35" w:type="dxa"/>
-              <w:right w:w="35" w:type="dxa"/>
-            </w:tcMar>
-          </w:tcPr>
-          <w:p>
-            <w:pPr>
-              <w:keepNext/>
-              <w:jc w:val="left"/>
-            </w:pPr>
-            <w:r>
-              <w:rPr>
-                <w:rFonts w:ascii="Times New Roman" w:hAnsi="Times New Roman"/>
-                <w:color w:val="0F172A"/>
-                <w:sz w:val="14"/>
-              </w:rPr>
-              <w:t>No</w:t>
-            </w:r>
-          </w:p>
-        </w:tc>
-        <w:tc>
-          <w:tcPr>
-            <w:tcW w:type="dxa" w:w="1008"/>
-            <w:shd w:fill="F8FAFC"/>
-            <w:tcMar>
-              <w:top w:w="22" w:type="dxa"/>
-              <w:bottom w:w="22" w:type="dxa"/>
-              <w:left w:w="35" w:type="dxa"/>
-              <w:right w:w="35" w:type="dxa"/>
-            </w:tcMar>
-          </w:tcPr>
-          <w:p>
-            <w:pPr>
-              <w:keepNext/>
-              <w:jc w:val="left"/>
-            </w:pPr>
-            <w:r>
-              <w:rPr>
-                <w:rFonts w:ascii="Times New Roman" w:hAnsi="Times New Roman"/>
-                <w:color w:val="0F172A"/>
-                <w:sz w:val="14"/>
-              </w:rPr>
-              <w:t>Manual SMS</w:t>
-            </w:r>
-          </w:p>
-        </w:tc>
-      </w:tr>
-      <w:tr>
-        <w:trPr>
-          <w:cantSplit/>
-        </w:trPr>
-        <w:tc>
-          <w:tcPr>
-            <w:tcW w:type="dxa" w:w="864"/>
-            <w:shd w:fill="FFFFFF"/>
-            <w:tcMar>
-              <w:top w:w="22" w:type="dxa"/>
-              <w:bottom w:w="22" w:type="dxa"/>
-              <w:left w:w="35" w:type="dxa"/>
-              <w:right w:w="35" w:type="dxa"/>
-            </w:tcMar>
-          </w:tcPr>
-          <w:p>
-            <w:pPr>
-              <w:keepNext/>
-              <w:jc w:val="center"/>
-            </w:pPr>
-            <w:r>
-              <w:rPr>
-                <w:rFonts w:ascii="Times New Roman" w:hAnsi="Times New Roman"/>
-                <w:color w:val="0F172A"/>
-                <w:sz w:val="14"/>
-              </w:rPr>
-              <w:t>[4]</w:t>
-            </w:r>
-          </w:p>
-        </w:tc>
-        <w:tc>
-          <w:tcPr>
-            <w:tcW w:type="dxa" w:w="2016"/>
-            <w:shd w:fill="FFFFFF"/>
-            <w:tcMar>
-              <w:top w:w="22" w:type="dxa"/>
-              <w:bottom w:w="22" w:type="dxa"/>
-              <w:left w:w="35" w:type="dxa"/>
-              <w:right w:w="35" w:type="dxa"/>
-            </w:tcMar>
-          </w:tcPr>
-          <w:p>
-            <w:pPr>
-              <w:keepNext/>
-              <w:jc w:val="left"/>
-            </w:pPr>
-            <w:r>
-              <w:rPr>
-                <w:rFonts w:ascii="Times New Roman" w:hAnsi="Times New Roman"/>
-                <w:color w:val="0F172A"/>
-                <w:sz w:val="14"/>
-              </w:rPr>
-              <w:t>Systematic review of fear of crime</w:t>
-            </w:r>
-          </w:p>
-        </w:tc>
-        <w:tc>
-          <w:tcPr>
-            <w:tcW w:type="dxa" w:w="1008"/>
-            <w:shd w:fill="FFFFFF"/>
-            <w:tcMar>
-              <w:top w:w="22" w:type="dxa"/>
-              <w:bottom w:w="22" w:type="dxa"/>
-              <w:left w:w="35" w:type="dxa"/>
-              <w:right w:w="35" w:type="dxa"/>
-            </w:tcMar>
-          </w:tcPr>
-          <w:p>
-            <w:pPr>
-              <w:keepNext/>
-              <w:jc w:val="left"/>
-            </w:pPr>
-            <w:r>
-              <w:rPr>
-                <w:rFonts w:ascii="Times New Roman" w:hAnsi="Times New Roman"/>
-                <w:color w:val="0F172A"/>
-                <w:sz w:val="14"/>
-              </w:rPr>
-              <w:t>Descriptive</w:t>
-            </w:r>
-          </w:p>
-        </w:tc>
-        <w:tc>
-          <w:tcPr>
-            <w:tcW w:type="dxa" w:w="1008"/>
-            <w:shd w:fill="FFFFFF"/>
-            <w:tcMar>
-              <w:top w:w="22" w:type="dxa"/>
-              <w:bottom w:w="22" w:type="dxa"/>
-              <w:left w:w="35" w:type="dxa"/>
-              <w:right w:w="35" w:type="dxa"/>
-            </w:tcMar>
-          </w:tcPr>
-          <w:p>
-            <w:pPr>
-              <w:keepNext/>
-              <w:jc w:val="left"/>
-            </w:pPr>
-            <w:r>
-              <w:rPr>
-                <w:rFonts w:ascii="Times New Roman" w:hAnsi="Times New Roman"/>
-                <w:color w:val="0F172A"/>
-                <w:sz w:val="14"/>
-              </w:rPr>
-              <w:t>No</w:t>
-            </w:r>
-          </w:p>
-        </w:tc>
-      </w:tr>
-      <w:tr>
-        <w:trPr>
-          <w:cantSplit/>
-        </w:trPr>
-        <w:tc>
-          <w:tcPr>
-            <w:tcW w:type="dxa" w:w="864"/>
-            <w:shd w:fill="F8FAFC"/>
-            <w:tcMar>
-              <w:top w:w="22" w:type="dxa"/>
-              <w:bottom w:w="22" w:type="dxa"/>
-              <w:left w:w="35" w:type="dxa"/>
-              <w:right w:w="35" w:type="dxa"/>
-            </w:tcMar>
-          </w:tcPr>
-          <w:p>
-            <w:pPr>
-              <w:keepNext/>
-              <w:jc w:val="center"/>
-            </w:pPr>
-            <w:r>
-              <w:rPr>
-                <w:rFonts w:ascii="Times New Roman" w:hAnsi="Times New Roman"/>
-                <w:color w:val="0F172A"/>
-                <w:sz w:val="14"/>
-              </w:rPr>
-              <w:t>[5], [6]</w:t>
-            </w:r>
-          </w:p>
-        </w:tc>
-        <w:tc>
-          <w:tcPr>
-            <w:tcW w:type="dxa" w:w="2016"/>
-            <w:shd w:fill="F8FAFC"/>
-            <w:tcMar>
-              <w:top w:w="22" w:type="dxa"/>
-              <w:bottom w:w="22" w:type="dxa"/>
-              <w:left w:w="35" w:type="dxa"/>
-              <w:right w:w="35" w:type="dxa"/>
-            </w:tcMar>
-          </w:tcPr>
-          <w:p>
-            <w:pPr>
-              <w:keepNext/>
-              <w:jc w:val="left"/>
-            </w:pPr>
-            <w:r>
-              <w:rPr>
-                <w:rFonts w:ascii="Times New Roman" w:hAnsi="Times New Roman"/>
-                <w:color w:val="0F172A"/>
-                <w:sz w:val="14"/>
-              </w:rPr>
-              <w:t>Aesthetic &amp; safe deep learning paths</w:t>
-            </w:r>
-          </w:p>
-        </w:tc>
-        <w:tc>
-          <w:tcPr>
-            <w:tcW w:type="dxa" w:w="1008"/>
-            <w:shd w:fill="F8FAFC"/>
-            <w:tcMar>
-              <w:top w:w="22" w:type="dxa"/>
-              <w:bottom w:w="22" w:type="dxa"/>
-              <w:left w:w="35" w:type="dxa"/>
-              <w:right w:w="35" w:type="dxa"/>
-            </w:tcMar>
-          </w:tcPr>
-          <w:p>
-            <w:pPr>
-              <w:keepNext/>
-              <w:jc w:val="left"/>
-            </w:pPr>
-            <w:r>
-              <w:rPr>
-                <w:rFonts w:ascii="Times New Roman" w:hAnsi="Times New Roman"/>
-                <w:color w:val="0F172A"/>
-                <w:sz w:val="14"/>
-              </w:rPr>
-              <w:t>Visual</w:t>
-            </w:r>
-          </w:p>
-        </w:tc>
-        <w:tc>
-          <w:tcPr>
-            <w:tcW w:type="dxa" w:w="1008"/>
-            <w:shd w:fill="F8FAFC"/>
-            <w:tcMar>
-              <w:top w:w="22" w:type="dxa"/>
-              <w:bottom w:w="22" w:type="dxa"/>
-              <w:left w:w="35" w:type="dxa"/>
-              <w:right w:w="35" w:type="dxa"/>
-            </w:tcMar>
-          </w:tcPr>
-          <w:p>
-            <w:pPr>
-              <w:keepNext/>
-              <w:jc w:val="left"/>
-            </w:pPr>
-            <w:r>
-              <w:rPr>
-                <w:rFonts w:ascii="Times New Roman" w:hAnsi="Times New Roman"/>
-                <w:color w:val="0F172A"/>
-                <w:sz w:val="14"/>
+                <w:sz w:val="15"/>
               </w:rPr>
               <w:t>No</w:t>
             </w:r>
@@ -1157,10 +1157,10 @@
             <w:tcW w:type="dxa" w:w="864"/>
             <w:shd w:fill="FFFFFF"/>
             <w:tcMar>
-              <w:top w:w="22" w:type="dxa"/>
-              <w:bottom w:w="22" w:type="dxa"/>
-              <w:left w:w="35" w:type="dxa"/>
-              <w:right w:w="35" w:type="dxa"/>
+              <w:top w:w="28" w:type="dxa"/>
+              <w:bottom w:w="28" w:type="dxa"/>
+              <w:left w:w="40" w:type="dxa"/>
+              <w:right w:w="40" w:type="dxa"/>
             </w:tcMar>
           </w:tcPr>
           <w:p>
@@ -1172,7 +1172,7 @@
               <w:rPr>
                 <w:rFonts w:ascii="Times New Roman" w:hAnsi="Times New Roman"/>
                 <w:color w:val="0F172A"/>
-                <w:sz w:val="14"/>
+                <w:sz w:val="15"/>
               </w:rPr>
               <w:t>[7], [8]</w:t>
             </w:r>
@@ -1183,10 +1183,10 @@
             <w:tcW w:type="dxa" w:w="2016"/>
             <w:shd w:fill="FFFFFF"/>
             <w:tcMar>
-              <w:top w:w="22" w:type="dxa"/>
-              <w:bottom w:w="22" w:type="dxa"/>
-              <w:left w:w="35" w:type="dxa"/>
-              <w:right w:w="35" w:type="dxa"/>
+              <w:top w:w="28" w:type="dxa"/>
+              <w:bottom w:w="28" w:type="dxa"/>
+              <w:left w:w="40" w:type="dxa"/>
+              <w:right w:w="40" w:type="dxa"/>
             </w:tcMar>
           </w:tcPr>
           <w:p>
@@ -1198,7 +1198,7 @@
               <w:rPr>
                 <w:rFonts w:ascii="Times New Roman" w:hAnsi="Times New Roman"/>
                 <w:color w:val="0F172A"/>
-                <w:sz w:val="14"/>
+                <w:sz w:val="15"/>
               </w:rPr>
               <w:t>IoT wearables &amp; voice distress AI</w:t>
             </w:r>
@@ -1209,10 +1209,10 @@
             <w:tcW w:type="dxa" w:w="1008"/>
             <w:shd w:fill="FFFFFF"/>
             <w:tcMar>
-              <w:top w:w="22" w:type="dxa"/>
-              <w:bottom w:w="22" w:type="dxa"/>
-              <w:left w:w="35" w:type="dxa"/>
-              <w:right w:w="35" w:type="dxa"/>
+              <w:top w:w="28" w:type="dxa"/>
+              <w:bottom w:w="28" w:type="dxa"/>
+              <w:left w:w="40" w:type="dxa"/>
+              <w:right w:w="40" w:type="dxa"/>
             </w:tcMar>
           </w:tcPr>
           <w:p>
@@ -1224,7 +1224,7 @@
               <w:rPr>
                 <w:rFonts w:ascii="Times New Roman" w:hAnsi="Times New Roman"/>
                 <w:color w:val="0F172A"/>
-                <w:sz w:val="14"/>
+                <w:sz w:val="15"/>
               </w:rPr>
               <w:t>Post-threat</w:t>
             </w:r>
@@ -1235,10 +1235,10 @@
             <w:tcW w:type="dxa" w:w="1008"/>
             <w:shd w:fill="FFFFFF"/>
             <w:tcMar>
-              <w:top w:w="22" w:type="dxa"/>
-              <w:bottom w:w="22" w:type="dxa"/>
-              <w:left w:w="35" w:type="dxa"/>
-              <w:right w:w="35" w:type="dxa"/>
+              <w:top w:w="28" w:type="dxa"/>
+              <w:bottom w:w="28" w:type="dxa"/>
+              <w:left w:w="40" w:type="dxa"/>
+              <w:right w:w="40" w:type="dxa"/>
             </w:tcMar>
           </w:tcPr>
           <w:p>
@@ -1250,7 +1250,7 @@
               <w:rPr>
                 <w:rFonts w:ascii="Times New Roman" w:hAnsi="Times New Roman"/>
                 <w:color w:val="0F172A"/>
-                <w:sz w:val="14"/>
+                <w:sz w:val="15"/>
               </w:rPr>
               <w:t>Sensor-only</w:t>
             </w:r>
@@ -1266,10 +1266,10 @@
             <w:tcW w:type="dxa" w:w="864"/>
             <w:shd w:fill="F8FAFC"/>
             <w:tcMar>
-              <w:top w:w="22" w:type="dxa"/>
-              <w:bottom w:w="22" w:type="dxa"/>
-              <w:left w:w="35" w:type="dxa"/>
-              <w:right w:w="35" w:type="dxa"/>
+              <w:top w:w="28" w:type="dxa"/>
+              <w:bottom w:w="28" w:type="dxa"/>
+              <w:left w:w="40" w:type="dxa"/>
+              <w:right w:w="40" w:type="dxa"/>
             </w:tcMar>
           </w:tcPr>
           <w:p>
@@ -1280,7 +1280,7 @@
               <w:rPr>
                 <w:rFonts w:ascii="Times New Roman" w:hAnsi="Times New Roman"/>
                 <w:color w:val="0F172A"/>
-                <w:sz w:val="14"/>
+                <w:sz w:val="15"/>
               </w:rPr>
               <w:t>This work</w:t>
             </w:r>
@@ -1291,10 +1291,10 @@
             <w:tcW w:type="dxa" w:w="2016"/>
             <w:shd w:fill="F8FAFC"/>
             <w:tcMar>
-              <w:top w:w="22" w:type="dxa"/>
-              <w:bottom w:w="22" w:type="dxa"/>
-              <w:left w:w="35" w:type="dxa"/>
-              <w:right w:w="35" w:type="dxa"/>
+              <w:top w:w="28" w:type="dxa"/>
+              <w:bottom w:w="28" w:type="dxa"/>
+              <w:left w:w="40" w:type="dxa"/>
+              <w:right w:w="40" w:type="dxa"/>
             </w:tcMar>
           </w:tcPr>
           <w:p>
@@ -1305,7 +1305,7 @@
               <w:rPr>
                 <w:rFonts w:ascii="Times New Roman" w:hAnsi="Times New Roman"/>
                 <w:color w:val="0F172A"/>
-                <w:sz w:val="14"/>
+                <w:sz w:val="15"/>
               </w:rPr>
               <w:t>Multi-criteria routing + 180s Watchdog</w:t>
             </w:r>
@@ -1316,10 +1316,10 @@
             <w:tcW w:type="dxa" w:w="1008"/>
             <w:shd w:fill="F8FAFC"/>
             <w:tcMar>
-              <w:top w:w="22" w:type="dxa"/>
-              <w:bottom w:w="22" w:type="dxa"/>
-              <w:left w:w="35" w:type="dxa"/>
-              <w:right w:w="35" w:type="dxa"/>
+              <w:top w:w="28" w:type="dxa"/>
+              <w:bottom w:w="28" w:type="dxa"/>
+              <w:left w:w="40" w:type="dxa"/>
+              <w:right w:w="40" w:type="dxa"/>
             </w:tcMar>
           </w:tcPr>
           <w:p>
@@ -1330,7 +1330,7 @@
               <w:rPr>
                 <w:rFonts w:ascii="Times New Roman" w:hAnsi="Times New Roman"/>
                 <w:color w:val="0F172A"/>
-                <w:sz w:val="14"/>
+                <w:sz w:val="15"/>
               </w:rPr>
               <w:t>Yes (Decay)</w:t>
             </w:r>
@@ -1341,10 +1341,10 @@
             <w:tcW w:type="dxa" w:w="1008"/>
             <w:shd w:fill="F8FAFC"/>
             <w:tcMar>
-              <w:top w:w="22" w:type="dxa"/>
-              <w:bottom w:w="22" w:type="dxa"/>
-              <w:left w:w="35" w:type="dxa"/>
-              <w:right w:w="35" w:type="dxa"/>
+              <w:top w:w="28" w:type="dxa"/>
+              <w:bottom w:w="28" w:type="dxa"/>
+              <w:left w:w="40" w:type="dxa"/>
+              <w:right w:w="40" w:type="dxa"/>
             </w:tcMar>
           </w:tcPr>
           <w:p>
@@ -1355,7 +1355,7 @@
               <w:rPr>
                 <w:rFonts w:ascii="Times New Roman" w:hAnsi="Times New Roman"/>
                 <w:color w:val="0F172A"/>
-                <w:sz w:val="14"/>
+                <w:sz w:val="15"/>
               </w:rPr>
               <w:t>Yes (Active)</w:t>
             </w:r>
@@ -1366,7 +1366,7 @@
     <w:p>
       <w:pPr>
         <w:keepNext/>
-        <w:spacing w:before="120" w:after="40"/>
+        <w:spacing w:before="160" w:after="50"/>
         <w:jc w:val="center"/>
       </w:pPr>
       <w:r>
@@ -1374,7 +1374,7 @@
           <w:rFonts w:ascii="Times New Roman" w:hAnsi="Times New Roman"/>
           <w:b/>
           <w:color w:val="000000"/>
-          <w:sz w:val="19"/>
+          <w:sz w:val="20"/>
         </w:rPr>
         <w:t>III. PROPOSED METHODOLOGY AND SYSTEM ARCHITECTURE</w:t>
       </w:r>
@@ -1382,7 +1382,7 @@
     <w:p>
       <w:pPr>
         <w:keepNext/>
-        <w:spacing w:before="80" w:after="20"/>
+        <w:spacing w:before="100" w:after="30"/>
         <w:jc w:val="left"/>
       </w:pPr>
       <w:r>
@@ -1391,29 +1391,39 @@
           <w:b/>
           <w:i/>
           <w:color w:val="000000"/>
-          <w:sz w:val="18"/>
+          <w:sz w:val="19"/>
         </w:rPr>
         <w:t>A. Architecture Overview</w:t>
       </w:r>
     </w:p>
     <w:p>
       <w:pPr>
-        <w:spacing w:after="40" w:line="247" w:lineRule="auto"/>
+        <w:spacing w:after="60" w:line="252" w:lineRule="auto"/>
         <w:jc w:val="both"/>
       </w:pPr>
       <w:r>
         <w:rPr>
           <w:rFonts w:ascii="Times New Roman" w:hAnsi="Times New Roman"/>
           <w:color w:val="000000"/>
-          <w:sz w:val="18"/>
+          <w:sz w:val="19"/>
         </w:rPr>
-        <w:t>SafeCity employs a four-tier architecture designed for rapid field operation across varied mobile network environments: (i) Client PWA / Mobile Tier, (ii) Geospatial Application API Tier, (iii) Administrative Verification Engine, and (iv) High-Availability Persistence Tier. Fig. 1 depicts the operational interaction between citizen reporting, moderator auditing, routing calculation, and real-time companion tracking.</w:t>
+        <w:t>SafeCity employs a four-tier architecture designed for rapid field operation across varied mobile network environments: (i) Client PWA / Mobile Tier, (ii) Geospatial Application API Tier, (iii) Administrative Verification Engine, and (iv) High-Availability Persistence Tier. Fig. 1 illustrates the end-to-end data flow, from anonymous community incident reporting and administrative moderation to safety-weighted route generation and real-time companion tracking.</w:t>
       </w:r>
     </w:p>
     <w:p>
       <w:pPr>
-        <w:keepNext/>
-        <w:spacing w:before="80" w:after="20"/>
+        <w:sectPr>
+          <w:type w:val="continuous"/>
+          <w:pgSz w:w="12240" w:h="15840"/>
+          <w:pgMar w:top="1080" w:right="1008" w:bottom="1080" w:left="1008" w:header="720" w:footer="720" w:gutter="0"/>
+          <w:cols w:space="360" w:num="2" w:equalWidth="1"/>
+          <w:docGrid w:linePitch="360"/>
+        </w:sectPr>
+      </w:pPr>
+    </w:p>
+    <w:p>
+      <w:pPr>
+        <w:spacing w:before="120" w:after="40"/>
         <w:jc w:val="center"/>
       </w:pPr>
     </w:p>
@@ -1421,7 +1431,7 @@
       <w:r>
         <w:drawing>
           <wp:inline xmlns:a="http://schemas.openxmlformats.org/drawingml/2006/main" xmlns:pic="http://schemas.openxmlformats.org/drawingml/2006/picture">
-            <wp:extent cx="3017520" cy="1710557"/>
+            <wp:extent cx="6263640" cy="3550701"/>
             <wp:docPr id="1" name="Picture 1"/>
             <wp:cNvGraphicFramePr>
               <a:graphicFrameLocks noChangeAspect="1"/>
@@ -1442,7 +1452,7 @@
                   <pic:spPr>
                     <a:xfrm>
                       <a:off x="0" y="0"/>
-                      <a:ext cx="3017520" cy="1710557"/>
+                      <a:ext cx="6263640" cy="3550701"/>
                     </a:xfrm>
                     <a:prstGeom prst="rect"/>
                   </pic:spPr>
@@ -1455,23 +1465,33 @@
     </w:p>
     <w:p>
       <w:pPr>
-        <w:keepNext/>
-        <w:spacing w:before="20" w:after="80"/>
+        <w:spacing w:before="40" w:after="160"/>
         <w:jc w:val="center"/>
       </w:pPr>
       <w:r>
         <w:rPr>
           <w:rFonts w:ascii="Times New Roman" w:hAnsi="Times New Roman"/>
           <w:i/>
-          <w:sz w:val="15"/>
+          <w:sz w:val="17"/>
         </w:rPr>
         <w:t>Fig. 1. Proposed system architecture: participatory incident reporting, administrative moderation, multi-criteria route optimization, and live companion escort.</w:t>
       </w:r>
     </w:p>
     <w:p>
       <w:pPr>
+        <w:sectPr>
+          <w:type w:val="continuous"/>
+          <w:pgSz w:w="12240" w:h="15840"/>
+          <w:pgMar w:top="1080" w:right="1008" w:bottom="1080" w:left="1008" w:header="720" w:footer="720" w:gutter="0"/>
+          <w:cols w:space="360" w:num="1" w:equalWidth="1"/>
+          <w:docGrid w:linePitch="360"/>
+        </w:sectPr>
+      </w:pPr>
+    </w:p>
+    <w:p>
+      <w:pPr>
         <w:keepNext/>
-        <w:spacing w:before="80" w:after="20"/>
+        <w:spacing w:before="100" w:after="30"/>
         <w:jc w:val="left"/>
       </w:pPr>
       <w:r>
@@ -1480,21 +1500,21 @@
           <w:b/>
           <w:i/>
           <w:color w:val="000000"/>
-          <w:sz w:val="18"/>
+          <w:sz w:val="19"/>
         </w:rPr>
         <w:t>B. Geospatial Incident Ingestion and Verification</w:t>
       </w:r>
     </w:p>
     <w:p>
       <w:pPr>
-        <w:spacing w:after="40" w:line="247" w:lineRule="auto"/>
+        <w:spacing w:after="60" w:line="252" w:lineRule="auto"/>
         <w:jc w:val="both"/>
       </w:pPr>
       <w:r>
         <w:rPr>
           <w:rFonts w:ascii="Times New Roman" w:hAnsi="Times New Roman"/>
           <w:color w:val="000000"/>
-          <w:sz w:val="18"/>
+          <w:sz w:val="19"/>
         </w:rPr>
         <w:t>Citizen reports enter a multi-stage verification pipeline. To preserve reporter anonymity and protect individual privacy, GPS coordinates are truncated to 3 decimal places (~110-meter precision), preventing doorway-level identification. Each submission requires a category (harassment, unlit street, suspicious stalking, physical hazard), timestamp, severity rating, and optional textual notes. Incoming reports are routed to an administrative verification portal where verified community moderators review incoming flags, filtering out commercial spam, test entries, and duplicate records. Approved incidents immediately feed into the spatial scoring surface.</w:t>
       </w:r>
@@ -1502,7 +1522,7 @@
     <w:p>
       <w:pPr>
         <w:keepNext/>
-        <w:spacing w:before="80" w:after="20"/>
+        <w:spacing w:before="100" w:after="30"/>
         <w:jc w:val="left"/>
       </w:pPr>
       <w:r>
@@ -1511,21 +1531,21 @@
           <w:b/>
           <w:i/>
           <w:color w:val="000000"/>
-          <w:sz w:val="18"/>
+          <w:sz w:val="19"/>
         </w:rPr>
         <w:t>C. Multi-Criteria Safety-Aware Pathfinding Engine</w:t>
       </w:r>
     </w:p>
     <w:p>
       <w:pPr>
-        <w:spacing w:after="40" w:line="247" w:lineRule="auto"/>
+        <w:spacing w:after="60" w:line="252" w:lineRule="auto"/>
         <w:jc w:val="both"/>
       </w:pPr>
       <w:r>
         <w:rPr>
           <w:rFonts w:ascii="Times New Roman" w:hAnsi="Times New Roman"/>
           <w:color w:val="000000"/>
-          <w:sz w:val="18"/>
+          <w:sz w:val="19"/>
         </w:rPr>
         <w:t>Unlike shortest-path Dijkstra algorithms, SafeCity optimizes for a composite Safety Score S_route(R) in [0, 100]. Let R be a candidate corridor consisting of road segments e in E. The route safety score is evaluated by subtracting spatial-temporal hazard penalties while rewarding illumination and proximity to 24/7 civic safe havens:</w:t>
       </w:r>
@@ -1533,14 +1553,14 @@
     <w:p>
       <w:pPr>
         <w:keepNext/>
-        <w:spacing w:before="50" w:after="50"/>
+        <w:spacing w:before="70" w:after="70"/>
         <w:jc w:val="center"/>
       </w:pPr>
       <w:r>
         <w:rPr>
           <w:rFonts w:ascii="Times New Roman" w:hAnsi="Times New Roman"/>
           <w:i/>
-          <w:sz w:val="17"/>
+          <w:sz w:val="18"/>
         </w:rPr>
         <w:t>S_route(R) = 100 - min(80, Sigma(w_s * C_s)) + B_haven + B_light</w:t>
       </w:r>
@@ -1548,21 +1568,21 @@
         <w:rPr>
           <w:rFonts w:ascii="Times New Roman" w:hAnsi="Times New Roman"/>
           <w:i w:val="0"/>
-          <w:sz w:val="17"/>
+          <w:sz w:val="18"/>
         </w:rPr>
         <w:t xml:space="preserve">    (1)</w:t>
       </w:r>
     </w:p>
     <w:p>
       <w:pPr>
-        <w:spacing w:after="40" w:line="247" w:lineRule="auto"/>
+        <w:spacing w:after="60" w:line="252" w:lineRule="auto"/>
         <w:jc w:val="both"/>
       </w:pPr>
       <w:r>
         <w:rPr>
           <w:rFonts w:ascii="Times New Roman" w:hAnsi="Times New Roman"/>
           <w:color w:val="000000"/>
-          <w:sz w:val="18"/>
+          <w:sz w:val="19"/>
         </w:rPr>
         <w:t>where w_s is the incident severity weight (w_High = 15, w_Medium = 8, w_Low = 4), C_s is the spatial-temporal decay factor:</w:t>
       </w:r>
@@ -1570,14 +1590,14 @@
     <w:p>
       <w:pPr>
         <w:keepNext/>
-        <w:spacing w:before="50" w:after="50"/>
+        <w:spacing w:before="70" w:after="70"/>
         <w:jc w:val="center"/>
       </w:pPr>
       <w:r>
         <w:rPr>
           <w:rFonts w:ascii="Times New Roman" w:hAnsi="Times New Roman"/>
           <w:i/>
-          <w:sz w:val="17"/>
+          <w:sz w:val="18"/>
         </w:rPr>
         <w:t>C_s = exp(-d_s^2 / (2 * sigma^2)) * exp(-Delta t_s / tau)</w:t>
       </w:r>
@@ -1585,21 +1605,21 @@
         <w:rPr>
           <w:rFonts w:ascii="Times New Roman" w:hAnsi="Times New Roman"/>
           <w:i w:val="0"/>
-          <w:sz w:val="17"/>
+          <w:sz w:val="18"/>
         </w:rPr>
         <w:t xml:space="preserve">    (2)</w:t>
       </w:r>
     </w:p>
     <w:p>
       <w:pPr>
-        <w:spacing w:after="40" w:line="247" w:lineRule="auto"/>
+        <w:spacing w:after="60" w:line="252" w:lineRule="auto"/>
         <w:jc w:val="both"/>
       </w:pPr>
       <w:r>
         <w:rPr>
           <w:rFonts w:ascii="Times New Roman" w:hAnsi="Times New Roman"/>
           <w:color w:val="000000"/>
-          <w:sz w:val="18"/>
+          <w:sz w:val="19"/>
         </w:rPr>
         <w:t>with spatial decay sigma = 150 m and temporal half-life tau = 30 days. B_haven in [0, 12] rewards proximity to 24/7 safe havens, and B_light in [0, 8] rewards verified street illumination. We cap the maximum route score at 98 rather than 100 to reflect that no routing algorithm can guarantee complete physical safety on public streets.</w:t>
       </w:r>
@@ -1607,7 +1627,7 @@
     <w:p>
       <w:pPr>
         <w:keepNext/>
-        <w:spacing w:before="80" w:after="20"/>
+        <w:spacing w:before="100" w:after="30"/>
         <w:jc w:val="left"/>
       </w:pPr>
       <w:r>
@@ -1616,21 +1636,21 @@
           <w:b/>
           <w:i/>
           <w:color w:val="000000"/>
-          <w:sz w:val="18"/>
+          <w:sz w:val="19"/>
         </w:rPr>
         <w:t>D. Walk With Me Virtual Escort and Telemetry Watchdog</w:t>
       </w:r>
     </w:p>
     <w:p>
       <w:pPr>
-        <w:spacing w:after="40" w:line="247" w:lineRule="auto"/>
+        <w:spacing w:after="60" w:line="252" w:lineRule="auto"/>
         <w:jc w:val="both"/>
       </w:pPr>
       <w:r>
         <w:rPr>
           <w:rFonts w:ascii="Times New Roman" w:hAnsi="Times New Roman"/>
           <w:color w:val="000000"/>
-          <w:sz w:val="18"/>
+          <w:sz w:val="19"/>
         </w:rPr>
         <w:t>During active transit, the Walk With Me companion escort streams continuous GPS telemetry. Surface displacement d between consecutive GPS fixes (phi_1, lambda_1) and (phi_2, lambda_2) is calculated on a spherical earth radius R_e as:</w:t>
       </w:r>
@@ -1638,14 +1658,14 @@
     <w:p>
       <w:pPr>
         <w:keepNext/>
-        <w:spacing w:before="50" w:after="50"/>
+        <w:spacing w:before="70" w:after="70"/>
         <w:jc w:val="center"/>
       </w:pPr>
       <w:r>
         <w:rPr>
           <w:rFonts w:ascii="Times New Roman" w:hAnsi="Times New Roman"/>
           <w:i/>
-          <w:sz w:val="17"/>
+          <w:sz w:val="18"/>
         </w:rPr>
         <w:t>d = 2 * R_e * arcsin(sqrt(sin^2(Delta phi / 2) + cos(phi_1)cos(phi_2)sin^2(Delta lambda / 2)))</w:t>
       </w:r>
@@ -1653,21 +1673,21 @@
         <w:rPr>
           <w:rFonts w:ascii="Times New Roman" w:hAnsi="Times New Roman"/>
           <w:i w:val="0"/>
-          <w:sz w:val="17"/>
+          <w:sz w:val="18"/>
         </w:rPr>
         <w:t xml:space="preserve">    (3)</w:t>
       </w:r>
     </w:p>
     <w:p>
       <w:pPr>
-        <w:spacing w:after="40" w:line="247" w:lineRule="auto"/>
+        <w:spacing w:after="60" w:line="252" w:lineRule="auto"/>
         <w:jc w:val="both"/>
       </w:pPr>
       <w:r>
         <w:rPr>
           <w:rFonts w:ascii="Times New Roman" w:hAnsi="Times New Roman"/>
           <w:color w:val="000000"/>
-          <w:sz w:val="18"/>
+          <w:sz w:val="19"/>
         </w:rPr>
         <w:t>The escort engine samples position at 3-second intervals. If displacement d &lt; 3 meters across successive intervals while in transit mode, an autonomous 180-second stationary watchdog timer activates. If no motion is registered and the user does not dismiss the prompt within 180 seconds, the client escalates: initiating an audible pulsing siren, activating high-intensity screen flash strobes, and packaging the current GPS coordinates into an emergency dispatch link.</w:t>
       </w:r>
@@ -1675,7 +1695,7 @@
     <w:p>
       <w:pPr>
         <w:keepNext/>
-        <w:spacing w:before="120" w:after="40"/>
+        <w:spacing w:before="160" w:after="50"/>
         <w:jc w:val="center"/>
       </w:pPr>
       <w:r>
@@ -1683,21 +1703,21 @@
           <w:rFonts w:ascii="Times New Roman" w:hAnsi="Times New Roman"/>
           <w:b/>
           <w:color w:val="000000"/>
-          <w:sz w:val="19"/>
+          <w:sz w:val="20"/>
         </w:rPr>
         <w:t>IV. IMPLEMENTATION</w:t>
       </w:r>
     </w:p>
     <w:p>
       <w:pPr>
-        <w:spacing w:after="40" w:line="247" w:lineRule="auto"/>
+        <w:spacing w:after="60" w:line="252" w:lineRule="auto"/>
         <w:jc w:val="both"/>
       </w:pPr>
       <w:r>
         <w:rPr>
           <w:rFonts w:ascii="Times New Roman" w:hAnsi="Times New Roman"/>
           <w:color w:val="000000"/>
-          <w:sz w:val="18"/>
+          <w:sz w:val="19"/>
         </w:rPr>
         <w:t>SafeCity is implemented as a modern full-stack web and mobile application. Table II summarizes the core components and technology frameworks across each architectural layer.</w:t>
       </w:r>
@@ -1705,7 +1725,7 @@
     <w:p>
       <w:pPr>
         <w:keepNext/>
-        <w:spacing w:before="80" w:after="30"/>
+        <w:spacing w:before="100" w:after="40"/>
         <w:jc w:val="center"/>
       </w:pPr>
       <w:r>
@@ -1724,8 +1744,8 @@
         <w:tblLook w:firstColumn="1" w:firstRow="1" w:lastColumn="0" w:lastRow="0" w:noHBand="0" w:noVBand="1" w:val="04A0"/>
       </w:tblPr>
       <w:tblGrid>
-        <w:gridCol w:w="5141"/>
-        <w:gridCol w:w="5141"/>
+        <w:gridCol w:w="5112"/>
+        <w:gridCol w:w="5112"/>
       </w:tblGrid>
       <w:tr>
         <w:trPr>
@@ -1735,6 +1755,65 @@
           <w:tcPr>
             <w:tcW w:type="dxa" w:w="1512"/>
             <w:shd w:fill="1E293B"/>
+            <w:tcMar>
+              <w:top w:w="35" w:type="dxa"/>
+              <w:bottom w:w="35" w:type="dxa"/>
+              <w:left w:w="45" w:type="dxa"/>
+              <w:right w:w="45" w:type="dxa"/>
+            </w:tcMar>
+          </w:tcPr>
+          <w:p>
+            <w:pPr>
+              <w:keepNext/>
+              <w:jc w:val="center"/>
+            </w:pPr>
+            <w:r>
+              <w:rPr>
+                <w:rFonts w:ascii="Times New Roman" w:hAnsi="Times New Roman"/>
+                <w:b/>
+                <w:color w:val="FFFFFF"/>
+                <w:sz w:val="16"/>
+              </w:rPr>
+              <w:t>System Layer</w:t>
+            </w:r>
+          </w:p>
+        </w:tc>
+        <w:tc>
+          <w:tcPr>
+            <w:tcW w:type="dxa" w:w="3384"/>
+            <w:shd w:fill="1E293B"/>
+            <w:tcMar>
+              <w:top w:w="35" w:type="dxa"/>
+              <w:bottom w:w="35" w:type="dxa"/>
+              <w:left w:w="45" w:type="dxa"/>
+              <w:right w:w="45" w:type="dxa"/>
+            </w:tcMar>
+          </w:tcPr>
+          <w:p>
+            <w:pPr>
+              <w:keepNext/>
+              <w:jc w:val="center"/>
+            </w:pPr>
+            <w:r>
+              <w:rPr>
+                <w:rFonts w:ascii="Times New Roman" w:hAnsi="Times New Roman"/>
+                <w:b/>
+                <w:color w:val="FFFFFF"/>
+                <w:sz w:val="16"/>
+              </w:rPr>
+              <w:t>Framework &amp; Technology</w:t>
+            </w:r>
+          </w:p>
+        </w:tc>
+      </w:tr>
+      <w:tr>
+        <w:trPr>
+          <w:cantSplit/>
+        </w:trPr>
+        <w:tc>
+          <w:tcPr>
+            <w:tcW w:type="dxa" w:w="1512"/>
+            <w:shd w:fill="FFFFFF"/>
             <w:tcMar>
               <w:top w:w="28" w:type="dxa"/>
               <w:bottom w:w="28" w:type="dxa"/>
@@ -1750,18 +1829,48 @@
             <w:r>
               <w:rPr>
                 <w:rFonts w:ascii="Times New Roman" w:hAnsi="Times New Roman"/>
-                <w:b/>
-                <w:color w:val="FFFFFF"/>
+                <w:color w:val="0F172A"/>
                 <w:sz w:val="15"/>
               </w:rPr>
-              <w:t>System Layer</w:t>
+              <w:t>Frontend Web</w:t>
             </w:r>
           </w:p>
         </w:tc>
         <w:tc>
           <w:tcPr>
             <w:tcW w:type="dxa" w:w="3384"/>
-            <w:shd w:fill="1E293B"/>
+            <w:shd w:fill="FFFFFF"/>
+            <w:tcMar>
+              <w:top w:w="28" w:type="dxa"/>
+              <w:bottom w:w="28" w:type="dxa"/>
+              <w:left w:w="40" w:type="dxa"/>
+              <w:right w:w="40" w:type="dxa"/>
+            </w:tcMar>
+          </w:tcPr>
+          <w:p>
+            <w:pPr>
+              <w:keepNext/>
+              <w:jc w:val="left"/>
+            </w:pPr>
+            <w:r>
+              <w:rPr>
+                <w:rFonts w:ascii="Times New Roman" w:hAnsi="Times New Roman"/>
+                <w:color w:val="0F172A"/>
+                <w:sz w:val="15"/>
+              </w:rPr>
+              <w:t>Next.js 14, React 18, Tailwind CSS, Lucide Icons</w:t>
+            </w:r>
+          </w:p>
+        </w:tc>
+      </w:tr>
+      <w:tr>
+        <w:trPr>
+          <w:cantSplit/>
+        </w:trPr>
+        <w:tc>
+          <w:tcPr>
+            <w:tcW w:type="dxa" w:w="1512"/>
+            <w:shd w:fill="F8FAFC"/>
             <w:tcMar>
               <w:top w:w="28" w:type="dxa"/>
               <w:bottom w:w="28" w:type="dxa"/>
@@ -1777,54 +1886,22 @@
             <w:r>
               <w:rPr>
                 <w:rFonts w:ascii="Times New Roman" w:hAnsi="Times New Roman"/>
-                <w:b/>
-                <w:color w:val="FFFFFF"/>
+                <w:color w:val="0F172A"/>
                 <w:sz w:val="15"/>
               </w:rPr>
-              <w:t>Framework &amp; Technology</w:t>
-            </w:r>
-          </w:p>
-        </w:tc>
-      </w:tr>
-      <w:tr>
-        <w:trPr>
-          <w:cantSplit/>
-        </w:trPr>
-        <w:tc>
-          <w:tcPr>
-            <w:tcW w:type="dxa" w:w="1512"/>
-            <w:shd w:fill="FFFFFF"/>
-            <w:tcMar>
-              <w:top w:w="22" w:type="dxa"/>
-              <w:bottom w:w="22" w:type="dxa"/>
-              <w:left w:w="35" w:type="dxa"/>
-              <w:right w:w="35" w:type="dxa"/>
-            </w:tcMar>
-          </w:tcPr>
-          <w:p>
-            <w:pPr>
-              <w:keepNext/>
-              <w:jc w:val="center"/>
-            </w:pPr>
-            <w:r>
-              <w:rPr>
-                <w:rFonts w:ascii="Times New Roman" w:hAnsi="Times New Roman"/>
-                <w:color w:val="0F172A"/>
-                <w:sz w:val="14"/>
-              </w:rPr>
-              <w:t>Frontend Web</w:t>
+              <w:t>Mobile Client</w:t>
             </w:r>
           </w:p>
         </w:tc>
         <w:tc>
           <w:tcPr>
             <w:tcW w:type="dxa" w:w="3384"/>
-            <w:shd w:fill="FFFFFF"/>
+            <w:shd w:fill="F8FAFC"/>
             <w:tcMar>
-              <w:top w:w="22" w:type="dxa"/>
-              <w:bottom w:w="22" w:type="dxa"/>
-              <w:left w:w="35" w:type="dxa"/>
-              <w:right w:w="35" w:type="dxa"/>
+              <w:top w:w="28" w:type="dxa"/>
+              <w:bottom w:w="28" w:type="dxa"/>
+              <w:left w:w="40" w:type="dxa"/>
+              <w:right w:w="40" w:type="dxa"/>
             </w:tcMar>
           </w:tcPr>
           <w:p>
@@ -1836,64 +1913,7 @@
               <w:rPr>
                 <w:rFonts w:ascii="Times New Roman" w:hAnsi="Times New Roman"/>
                 <w:color w:val="0F172A"/>
-                <w:sz w:val="14"/>
-              </w:rPr>
-              <w:t>Next.js 14, React 18, Tailwind CSS, Lucide Icons</w:t>
-            </w:r>
-          </w:p>
-        </w:tc>
-      </w:tr>
-      <w:tr>
-        <w:trPr>
-          <w:cantSplit/>
-        </w:trPr>
-        <w:tc>
-          <w:tcPr>
-            <w:tcW w:type="dxa" w:w="1512"/>
-            <w:shd w:fill="F8FAFC"/>
-            <w:tcMar>
-              <w:top w:w="22" w:type="dxa"/>
-              <w:bottom w:w="22" w:type="dxa"/>
-              <w:left w:w="35" w:type="dxa"/>
-              <w:right w:w="35" w:type="dxa"/>
-            </w:tcMar>
-          </w:tcPr>
-          <w:p>
-            <w:pPr>
-              <w:keepNext/>
-              <w:jc w:val="center"/>
-            </w:pPr>
-            <w:r>
-              <w:rPr>
-                <w:rFonts w:ascii="Times New Roman" w:hAnsi="Times New Roman"/>
-                <w:color w:val="0F172A"/>
-                <w:sz w:val="14"/>
-              </w:rPr>
-              <w:t>Mobile Client</w:t>
-            </w:r>
-          </w:p>
-        </w:tc>
-        <w:tc>
-          <w:tcPr>
-            <w:tcW w:type="dxa" w:w="3384"/>
-            <w:shd w:fill="F8FAFC"/>
-            <w:tcMar>
-              <w:top w:w="22" w:type="dxa"/>
-              <w:bottom w:w="22" w:type="dxa"/>
-              <w:left w:w="35" w:type="dxa"/>
-              <w:right w:w="35" w:type="dxa"/>
-            </w:tcMar>
-          </w:tcPr>
-          <w:p>
-            <w:pPr>
-              <w:keepNext/>
-              <w:jc w:val="left"/>
-            </w:pPr>
-            <w:r>
-              <w:rPr>
-                <w:rFonts w:ascii="Times New Roman" w:hAnsi="Times New Roman"/>
-                <w:color w:val="0F172A"/>
-                <w:sz w:val="14"/>
+                <w:sz w:val="15"/>
               </w:rPr>
               <w:t>React Native (Expo SDK 52), TypeScript</w:t>
             </w:r>
@@ -1909,10 +1929,10 @@
             <w:tcW w:type="dxa" w:w="1512"/>
             <w:shd w:fill="FFFFFF"/>
             <w:tcMar>
-              <w:top w:w="22" w:type="dxa"/>
-              <w:bottom w:w="22" w:type="dxa"/>
-              <w:left w:w="35" w:type="dxa"/>
-              <w:right w:w="35" w:type="dxa"/>
+              <w:top w:w="28" w:type="dxa"/>
+              <w:bottom w:w="28" w:type="dxa"/>
+              <w:left w:w="40" w:type="dxa"/>
+              <w:right w:w="40" w:type="dxa"/>
             </w:tcMar>
           </w:tcPr>
           <w:p>
@@ -1924,7 +1944,7 @@
               <w:rPr>
                 <w:rFonts w:ascii="Times New Roman" w:hAnsi="Times New Roman"/>
                 <w:color w:val="0F172A"/>
-                <w:sz w:val="14"/>
+                <w:sz w:val="15"/>
               </w:rPr>
               <w:t>Mapping / GIS</w:t>
             </w:r>
@@ -1935,10 +1955,10 @@
             <w:tcW w:type="dxa" w:w="3384"/>
             <w:shd w:fill="FFFFFF"/>
             <w:tcMar>
-              <w:top w:w="22" w:type="dxa"/>
-              <w:bottom w:w="22" w:type="dxa"/>
-              <w:left w:w="35" w:type="dxa"/>
-              <w:right w:w="35" w:type="dxa"/>
+              <w:top w:w="28" w:type="dxa"/>
+              <w:bottom w:w="28" w:type="dxa"/>
+              <w:left w:w="40" w:type="dxa"/>
+              <w:right w:w="40" w:type="dxa"/>
             </w:tcMar>
           </w:tcPr>
           <w:p>
@@ -1950,7 +1970,7 @@
               <w:rPr>
                 <w:rFonts w:ascii="Times New Roman" w:hAnsi="Times New Roman"/>
                 <w:color w:val="0F172A"/>
-                <w:sz w:val="14"/>
+                <w:sz w:val="15"/>
               </w:rPr>
               <w:t>Leaflet, OpenStreetMap, Overpass API, Turf.js</w:t>
             </w:r>
@@ -1966,10 +1986,10 @@
             <w:tcW w:type="dxa" w:w="1512"/>
             <w:shd w:fill="F8FAFC"/>
             <w:tcMar>
-              <w:top w:w="22" w:type="dxa"/>
-              <w:bottom w:w="22" w:type="dxa"/>
-              <w:left w:w="35" w:type="dxa"/>
-              <w:right w:w="35" w:type="dxa"/>
+              <w:top w:w="28" w:type="dxa"/>
+              <w:bottom w:w="28" w:type="dxa"/>
+              <w:left w:w="40" w:type="dxa"/>
+              <w:right w:w="40" w:type="dxa"/>
             </w:tcMar>
           </w:tcPr>
           <w:p>
@@ -1981,7 +2001,7 @@
               <w:rPr>
                 <w:rFonts w:ascii="Times New Roman" w:hAnsi="Times New Roman"/>
                 <w:color w:val="0F172A"/>
-                <w:sz w:val="14"/>
+                <w:sz w:val="15"/>
               </w:rPr>
               <w:t>Backend / DB</w:t>
             </w:r>
@@ -1992,10 +2012,10 @@
             <w:tcW w:type="dxa" w:w="3384"/>
             <w:shd w:fill="F8FAFC"/>
             <w:tcMar>
-              <w:top w:w="22" w:type="dxa"/>
-              <w:bottom w:w="22" w:type="dxa"/>
-              <w:left w:w="35" w:type="dxa"/>
-              <w:right w:w="35" w:type="dxa"/>
+              <w:top w:w="28" w:type="dxa"/>
+              <w:bottom w:w="28" w:type="dxa"/>
+              <w:left w:w="40" w:type="dxa"/>
+              <w:right w:w="40" w:type="dxa"/>
             </w:tcMar>
           </w:tcPr>
           <w:p>
@@ -2007,7 +2027,7 @@
               <w:rPr>
                 <w:rFonts w:ascii="Times New Roman" w:hAnsi="Times New Roman"/>
                 <w:color w:val="0F172A"/>
-                <w:sz w:val="14"/>
+                <w:sz w:val="15"/>
               </w:rPr>
               <w:t>Node.js, Express, Supabase (PostgreSQL + RLS)</w:t>
             </w:r>
@@ -2023,10 +2043,10 @@
             <w:tcW w:type="dxa" w:w="1512"/>
             <w:shd w:fill="FFFFFF"/>
             <w:tcMar>
-              <w:top w:w="22" w:type="dxa"/>
-              <w:bottom w:w="22" w:type="dxa"/>
-              <w:left w:w="35" w:type="dxa"/>
-              <w:right w:w="35" w:type="dxa"/>
+              <w:top w:w="28" w:type="dxa"/>
+              <w:bottom w:w="28" w:type="dxa"/>
+              <w:left w:w="40" w:type="dxa"/>
+              <w:right w:w="40" w:type="dxa"/>
             </w:tcMar>
           </w:tcPr>
           <w:p>
@@ -2038,7 +2058,7 @@
               <w:rPr>
                 <w:rFonts w:ascii="Times New Roman" w:hAnsi="Times New Roman"/>
                 <w:color w:val="0F172A"/>
-                <w:sz w:val="14"/>
+                <w:sz w:val="15"/>
               </w:rPr>
               <w:t>Escort Telemetry</w:t>
             </w:r>
@@ -2049,10 +2069,10 @@
             <w:tcW w:type="dxa" w:w="3384"/>
             <w:shd w:fill="FFFFFF"/>
             <w:tcMar>
-              <w:top w:w="22" w:type="dxa"/>
-              <w:bottom w:w="22" w:type="dxa"/>
-              <w:left w:w="35" w:type="dxa"/>
-              <w:right w:w="35" w:type="dxa"/>
+              <w:top w:w="28" w:type="dxa"/>
+              <w:bottom w:w="28" w:type="dxa"/>
+              <w:left w:w="40" w:type="dxa"/>
+              <w:right w:w="40" w:type="dxa"/>
             </w:tcMar>
           </w:tcPr>
           <w:p>
@@ -2064,7 +2084,7 @@
               <w:rPr>
                 <w:rFonts w:ascii="Times New Roman" w:hAnsi="Times New Roman"/>
                 <w:color w:val="0F172A"/>
-                <w:sz w:val="14"/>
+                <w:sz w:val="15"/>
               </w:rPr>
               <w:t>W3C Geolocation API, Web Audio API, Web Workers</w:t>
             </w:r>
@@ -2080,10 +2100,10 @@
             <w:tcW w:type="dxa" w:w="1512"/>
             <w:shd w:fill="F8FAFC"/>
             <w:tcMar>
-              <w:top w:w="22" w:type="dxa"/>
-              <w:bottom w:w="22" w:type="dxa"/>
-              <w:left w:w="35" w:type="dxa"/>
-              <w:right w:w="35" w:type="dxa"/>
+              <w:top w:w="28" w:type="dxa"/>
+              <w:bottom w:w="28" w:type="dxa"/>
+              <w:left w:w="40" w:type="dxa"/>
+              <w:right w:w="40" w:type="dxa"/>
             </w:tcMar>
           </w:tcPr>
           <w:p>
@@ -2094,7 +2114,7 @@
               <w:rPr>
                 <w:rFonts w:ascii="Times New Roman" w:hAnsi="Times New Roman"/>
                 <w:color w:val="0F172A"/>
-                <w:sz w:val="14"/>
+                <w:sz w:val="15"/>
               </w:rPr>
               <w:t>Tooling &amp; CI</w:t>
             </w:r>
@@ -2105,10 +2125,10 @@
             <w:tcW w:type="dxa" w:w="3384"/>
             <w:shd w:fill="F8FAFC"/>
             <w:tcMar>
-              <w:top w:w="22" w:type="dxa"/>
-              <w:bottom w:w="22" w:type="dxa"/>
-              <w:left w:w="35" w:type="dxa"/>
-              <w:right w:w="35" w:type="dxa"/>
+              <w:top w:w="28" w:type="dxa"/>
+              <w:bottom w:w="28" w:type="dxa"/>
+              <w:left w:w="40" w:type="dxa"/>
+              <w:right w:w="40" w:type="dxa"/>
             </w:tcMar>
           </w:tcPr>
           <w:p>
@@ -2119,7 +2139,7 @@
               <w:rPr>
                 <w:rFonts w:ascii="Times New Roman" w:hAnsi="Times New Roman"/>
                 <w:color w:val="0F172A"/>
-                <w:sz w:val="14"/>
+                <w:sz w:val="15"/>
               </w:rPr>
               <w:t>Git, GitHub, Vitest, ESLint, VS Code</w:t>
             </w:r>
@@ -2130,7 +2150,7 @@
     <w:p>
       <w:pPr>
         <w:keepNext/>
-        <w:spacing w:before="80" w:after="20"/>
+        <w:spacing w:before="100" w:after="30"/>
         <w:jc w:val="left"/>
       </w:pPr>
       <w:r>
@@ -2139,21 +2159,21 @@
           <w:b/>
           <w:i/>
           <w:color w:val="000000"/>
-          <w:sz w:val="18"/>
+          <w:sz w:val="19"/>
         </w:rPr>
         <w:t>A. Routing Logic and Algorithm Specification</w:t>
       </w:r>
     </w:p>
     <w:p>
       <w:pPr>
-        <w:spacing w:after="40" w:line="247" w:lineRule="auto"/>
+        <w:spacing w:after="60" w:line="252" w:lineRule="auto"/>
         <w:jc w:val="both"/>
       </w:pPr>
       <w:r>
         <w:rPr>
           <w:rFonts w:ascii="Times New Roman" w:hAnsi="Times New Roman"/>
           <w:color w:val="000000"/>
-          <w:sz w:val="18"/>
+          <w:sz w:val="19"/>
         </w:rPr>
         <w:t>Listing 1 details the core multi-criteria route evaluation and stationary watchdog routine implemented in TypeScript.</w:t>
       </w:r>
@@ -2165,7 +2185,7 @@
         <w:tblLook w:firstColumn="1" w:firstRow="1" w:lastColumn="0" w:lastRow="0" w:noHBand="0" w:noVBand="1" w:val="04A0"/>
       </w:tblPr>
       <w:tblGrid>
-        <w:gridCol w:w="10282"/>
+        <w:gridCol w:w="10224"/>
       </w:tblGrid>
       <w:tr>
         <w:trPr>
@@ -2173,13 +2193,13 @@
         </w:trPr>
         <w:tc>
           <w:tcPr>
-            <w:tcW w:type="dxa" w:w="10282"/>
+            <w:tcW w:type="dxa" w:w="10224"/>
             <w:shd w:fill="F8FAFC"/>
             <w:tcMar>
-              <w:top w:w="25" w:type="dxa"/>
-              <w:bottom w:w="25" w:type="dxa"/>
-              <w:left w:w="45" w:type="dxa"/>
-              <w:right w:w="45" w:type="dxa"/>
+              <w:top w:w="30" w:type="dxa"/>
+              <w:bottom w:w="30" w:type="dxa"/>
+              <w:left w:w="50" w:type="dxa"/>
+              <w:right w:w="50" w:type="dxa"/>
             </w:tcMar>
           </w:tcPr>
           <w:p>
@@ -2191,7 +2211,7 @@
               <w:rPr>
                 <w:rFonts w:ascii="Consolas" w:hAnsi="Consolas"/>
                 <w:color w:val="0F172A"/>
-                <w:sz w:val="12"/>
+                <w:sz w:val="13"/>
               </w:rPr>
               <w:t>// Listing 1: Multi-Criteria Route Safety Evaluation</w:t>
               <w:br/>
@@ -2236,14 +2256,14 @@
     <w:p>
       <w:pPr>
         <w:keepNext/>
-        <w:spacing w:before="20" w:after="70"/>
+        <w:spacing w:before="30" w:after="80"/>
         <w:jc w:val="center"/>
       </w:pPr>
       <w:r>
         <w:rPr>
           <w:rFonts w:ascii="Times New Roman" w:hAnsi="Times New Roman"/>
           <w:i/>
-          <w:sz w:val="15"/>
+          <w:sz w:val="16"/>
         </w:rPr>
         <w:t>Listing 1. Multi-criteria route safety evaluation routine.</w:t>
       </w:r>
@@ -2251,7 +2271,7 @@
     <w:p>
       <w:pPr>
         <w:keepNext/>
-        <w:spacing w:before="80" w:after="20"/>
+        <w:spacing w:before="100" w:after="30"/>
         <w:jc w:val="left"/>
       </w:pPr>
       <w:r>
@@ -2260,21 +2280,21 @@
           <w:b/>
           <w:i/>
           <w:color w:val="000000"/>
-          <w:sz w:val="18"/>
+          <w:sz w:val="19"/>
         </w:rPr>
         <w:t>B. Deployment and Testing Methodology</w:t>
       </w:r>
     </w:p>
     <w:p>
       <w:pPr>
-        <w:spacing w:after="40" w:line="247" w:lineRule="auto"/>
+        <w:spacing w:after="60" w:line="252" w:lineRule="auto"/>
         <w:jc w:val="both"/>
       </w:pPr>
       <w:r>
         <w:rPr>
           <w:rFonts w:ascii="Times New Roman" w:hAnsi="Times New Roman"/>
           <w:color w:val="000000"/>
-          <w:sz w:val="18"/>
+          <w:sz w:val="19"/>
         </w:rPr>
         <w:t>Unit testing was conducted across mathematical decay routines, boundary clipping, and watchdog timer transitions using the Vitest test runner. Client components were verified on Chromium and WebKit mobile engines across both high-density 4G/5G connections and degraded 2G connectivity (simulated via Chrome DevTools Network Throttling).</w:t>
       </w:r>
@@ -2282,7 +2302,7 @@
     <w:p>
       <w:pPr>
         <w:keepNext/>
-        <w:spacing w:before="120" w:after="40"/>
+        <w:spacing w:before="160" w:after="50"/>
         <w:jc w:val="center"/>
       </w:pPr>
       <w:r>
@@ -2290,7 +2310,7 @@
           <w:rFonts w:ascii="Times New Roman" w:hAnsi="Times New Roman"/>
           <w:b/>
           <w:color w:val="000000"/>
-          <w:sz w:val="19"/>
+          <w:sz w:val="20"/>
         </w:rPr>
         <w:t>V. SECURITY, PRIVACY AND THREAT MODEL</w:t>
       </w:r>
@@ -2298,7 +2318,7 @@
     <w:p>
       <w:pPr>
         <w:keepNext/>
-        <w:spacing w:before="80" w:after="20"/>
+        <w:spacing w:before="100" w:after="30"/>
         <w:jc w:val="left"/>
       </w:pPr>
       <w:r>
@@ -2307,21 +2327,21 @@
           <w:b/>
           <w:i/>
           <w:color w:val="000000"/>
-          <w:sz w:val="18"/>
+          <w:sz w:val="19"/>
         </w:rPr>
         <w:t>A. Threat Model</w:t>
       </w:r>
     </w:p>
     <w:p>
       <w:pPr>
-        <w:spacing w:after="40" w:line="247" w:lineRule="auto"/>
+        <w:spacing w:after="60" w:line="252" w:lineRule="auto"/>
         <w:jc w:val="both"/>
       </w:pPr>
       <w:r>
         <w:rPr>
           <w:rFonts w:ascii="Times New Roman" w:hAnsi="Times New Roman"/>
           <w:color w:val="000000"/>
-          <w:sz w:val="18"/>
+          <w:sz w:val="19"/>
         </w:rPr>
         <w:t>Four threat classes were modeled during system formulation: (i) Malicious Disinformation: bad actors submitting bogus incident reports to artificially stigmatize neighborhoods; (ii) Location Deanonymization: adversaries correlating timestamps to deanonymize vulnerable reporters; (iii) DoS Flooding: automated bots overwhelming the reporting API; and (iv) False Panic Triggers: inadvertent emergency escalations caused by transit slowdowns.</w:t>
       </w:r>
@@ -2329,7 +2349,7 @@
     <w:p>
       <w:pPr>
         <w:keepNext/>
-        <w:spacing w:before="80" w:after="20"/>
+        <w:spacing w:before="100" w:after="30"/>
         <w:jc w:val="left"/>
       </w:pPr>
       <w:r>
@@ -2338,21 +2358,21 @@
           <w:b/>
           <w:i/>
           <w:color w:val="000000"/>
-          <w:sz w:val="18"/>
+          <w:sz w:val="19"/>
         </w:rPr>
         <w:t>B. Location Privacy and Spatial Obfuscation</w:t>
       </w:r>
     </w:p>
     <w:p>
       <w:pPr>
-        <w:spacing w:after="40" w:line="247" w:lineRule="auto"/>
+        <w:spacing w:after="60" w:line="252" w:lineRule="auto"/>
         <w:jc w:val="both"/>
       </w:pPr>
       <w:r>
         <w:rPr>
           <w:rFonts w:ascii="Times New Roman" w:hAnsi="Times New Roman"/>
           <w:color w:val="000000"/>
-          <w:sz w:val="18"/>
+          <w:sz w:val="19"/>
         </w:rPr>
         <w:t>To counter deanonymization, client-side coordinates are truncated to 3 decimal places (~110-meter cell resolution) prior to transmission. Exact street address strings and doorway coordinates are discarded, preserving victim anonymity while ensuring neighborhood-scale situational awareness.</w:t>
       </w:r>
@@ -2360,7 +2380,7 @@
     <w:p>
       <w:pPr>
         <w:keepNext/>
-        <w:spacing w:before="80" w:after="20"/>
+        <w:spacing w:before="100" w:after="30"/>
         <w:jc w:val="left"/>
       </w:pPr>
       <w:r>
@@ -2369,21 +2389,21 @@
           <w:b/>
           <w:i/>
           <w:color w:val="000000"/>
-          <w:sz w:val="18"/>
+          <w:sz w:val="19"/>
         </w:rPr>
         <w:t>C. Data Minimization and Regulatory Alignment</w:t>
       </w:r>
     </w:p>
     <w:p>
       <w:pPr>
-        <w:spacing w:after="40" w:line="247" w:lineRule="auto"/>
+        <w:spacing w:after="60" w:line="252" w:lineRule="auto"/>
         <w:jc w:val="both"/>
       </w:pPr>
       <w:r>
         <w:rPr>
           <w:rFonts w:ascii="Times New Roman" w:hAnsi="Times New Roman"/>
           <w:color w:val="000000"/>
-          <w:sz w:val="18"/>
+          <w:sz w:val="19"/>
         </w:rPr>
         <w:t>Our data pipeline adheres to India's 2023 DPDP framework [11] and the IT Act (2000). By limiting collection to strictly necessary telemetry, citizens can log incidents and compute routes without creating an account or providing telephone numbers. Session coordinates are held in volatile browser memory and purged immediately upon trip conclusion.</w:t>
       </w:r>
@@ -2391,7 +2411,7 @@
     <w:p>
       <w:pPr>
         <w:keepNext/>
-        <w:spacing w:before="80" w:after="20"/>
+        <w:spacing w:before="100" w:after="30"/>
         <w:jc w:val="left"/>
       </w:pPr>
       <w:r>
@@ -2400,21 +2420,21 @@
           <w:b/>
           <w:i/>
           <w:color w:val="000000"/>
-          <w:sz w:val="18"/>
+          <w:sz w:val="19"/>
         </w:rPr>
         <w:t>D. Residual Risks and Operational Mitigations</w:t>
       </w:r>
     </w:p>
     <w:p>
       <w:pPr>
-        <w:spacing w:after="40" w:line="247" w:lineRule="auto"/>
+        <w:spacing w:after="60" w:line="252" w:lineRule="auto"/>
         <w:jc w:val="both"/>
       </w:pPr>
       <w:r>
         <w:rPr>
           <w:rFonts w:ascii="Times New Roman" w:hAnsi="Times New Roman"/>
           <w:color w:val="000000"/>
-          <w:sz w:val="18"/>
+          <w:sz w:val="19"/>
         </w:rPr>
         <w:t>While coordinate truncation protects identity, persistent harassment reporting in sparsely populated rural zones can still reveal victim activity. In such scenarios, administrative moderators apply geographic aggregation buffers before publishing reports to public heatmaps.</w:t>
       </w:r>
@@ -2422,7 +2442,7 @@
     <w:p>
       <w:pPr>
         <w:keepNext/>
-        <w:spacing w:before="120" w:after="40"/>
+        <w:spacing w:before="160" w:after="50"/>
         <w:jc w:val="center"/>
       </w:pPr>
       <w:r>
@@ -2430,7 +2450,7 @@
           <w:rFonts w:ascii="Times New Roman" w:hAnsi="Times New Roman"/>
           <w:b/>
           <w:color w:val="000000"/>
-          <w:sz w:val="19"/>
+          <w:sz w:val="20"/>
         </w:rPr>
         <w:t>VI. EXPECTED RESULTS AND EVALUATION PLAN</w:t>
       </w:r>
@@ -2438,7 +2458,7 @@
     <w:p>
       <w:pPr>
         <w:keepNext/>
-        <w:spacing w:before="80" w:after="20"/>
+        <w:spacing w:before="100" w:after="30"/>
         <w:jc w:val="left"/>
       </w:pPr>
       <w:r>
@@ -2447,21 +2467,21 @@
           <w:b/>
           <w:i/>
           <w:color w:val="000000"/>
-          <w:sz w:val="18"/>
+          <w:sz w:val="19"/>
         </w:rPr>
         <w:t>A. Route Computation Latency</w:t>
       </w:r>
     </w:p>
     <w:p>
       <w:pPr>
-        <w:spacing w:after="40" w:line="247" w:lineRule="auto"/>
+        <w:spacing w:after="60" w:line="252" w:lineRule="auto"/>
         <w:jc w:val="both"/>
       </w:pPr>
       <w:r>
         <w:rPr>
           <w:rFonts w:ascii="Times New Roman" w:hAnsi="Times New Roman"/>
           <w:color w:val="000000"/>
-          <w:sz w:val="18"/>
+          <w:sz w:val="19"/>
         </w:rPr>
         <w:t>Benchmarking over 200 simulated route queries between Manyata Tech Park and Nagavara Metro Station demonstrated a median pathfinding response time of 310 ms (95th-percentile: 480 ms). This confirms that the multi-criteria safety evaluation introduces negligible computational overhead compared to plain distance-based Dijkstra routing.</w:t>
       </w:r>
@@ -2469,7 +2489,7 @@
     <w:p>
       <w:pPr>
         <w:keepNext/>
-        <w:spacing w:before="80" w:after="20"/>
+        <w:spacing w:before="100" w:after="30"/>
         <w:jc w:val="left"/>
       </w:pPr>
       <w:r>
@@ -2478,21 +2498,21 @@
           <w:b/>
           <w:i/>
           <w:color w:val="000000"/>
-          <w:sz w:val="18"/>
+          <w:sz w:val="19"/>
         </w:rPr>
         <w:t>B. Route Safety Discrimination in Bengaluru Corridors</w:t>
       </w:r>
     </w:p>
     <w:p>
       <w:pPr>
-        <w:spacing w:after="40" w:line="247" w:lineRule="auto"/>
+        <w:spacing w:after="60" w:line="252" w:lineRule="auto"/>
         <w:jc w:val="both"/>
       </w:pPr>
       <w:r>
         <w:rPr>
           <w:rFonts w:ascii="Times New Roman" w:hAnsi="Times New Roman"/>
           <w:color w:val="000000"/>
-          <w:sz w:val="18"/>
+          <w:sz w:val="19"/>
         </w:rPr>
         <w:t>The pathfinding engine was evaluated on a verified 7.2 km suburban corridor. Route 1 (via Outer Ring Road, 7.2 km) utilized well-illuminated commercial arterials with two active 24/7 safe havens, achieving a Safety Score of 94/100. Route 2 (via Govindpura interior service lanes, 6.4 km) was 800 meters shorter but traversed two high-severity historical harassment zones with zero illumination, resulting in a Safety Score of 48/100. Whereas commercial routing engines unconditionally recommended Route 2, SafeCity correctly directed users toward Route 1.</w:t>
       </w:r>
@@ -2500,7 +2520,7 @@
     <w:p>
       <w:pPr>
         <w:keepNext/>
-        <w:spacing w:before="80" w:after="20"/>
+        <w:spacing w:before="100" w:after="30"/>
         <w:jc w:val="left"/>
       </w:pPr>
       <w:r>
@@ -2509,21 +2529,21 @@
           <w:b/>
           <w:i/>
           <w:color w:val="000000"/>
-          <w:sz w:val="18"/>
+          <w:sz w:val="19"/>
         </w:rPr>
         <w:t>C. Usability Evaluation (SUS)</w:t>
       </w:r>
     </w:p>
     <w:p>
       <w:pPr>
-        <w:spacing w:after="40" w:line="247" w:lineRule="auto"/>
+        <w:spacing w:after="60" w:line="252" w:lineRule="auto"/>
         <w:jc w:val="both"/>
       </w:pPr>
       <w:r>
         <w:rPr>
           <w:rFonts w:ascii="Times New Roman" w:hAnsi="Times New Roman"/>
           <w:color w:val="000000"/>
-          <w:sz w:val="18"/>
+          <w:sz w:val="19"/>
         </w:rPr>
         <w:t>Each participant rated the workflow using Brooke's 10-question SUS survey [9], producing an average score of 82.4 out of 100—well above the 70.0 benchmark for usable systems.</w:t>
       </w:r>
@@ -2531,7 +2551,7 @@
     <w:p>
       <w:pPr>
         <w:keepNext/>
-        <w:spacing w:before="80" w:after="20"/>
+        <w:spacing w:before="100" w:after="30"/>
         <w:jc w:val="left"/>
       </w:pPr>
       <w:r>
@@ -2540,21 +2560,21 @@
           <w:b/>
           <w:i/>
           <w:color w:val="000000"/>
-          <w:sz w:val="18"/>
+          <w:sz w:val="19"/>
         </w:rPr>
         <w:t>D. Comparative Summary</w:t>
       </w:r>
     </w:p>
     <w:p>
       <w:pPr>
-        <w:spacing w:after="40" w:line="247" w:lineRule="auto"/>
+        <w:spacing w:after="60" w:line="252" w:lineRule="auto"/>
         <w:jc w:val="both"/>
       </w:pPr>
       <w:r>
         <w:rPr>
           <w:rFonts w:ascii="Times New Roman" w:hAnsi="Times New Roman"/>
           <w:color w:val="000000"/>
-          <w:sz w:val="18"/>
+          <w:sz w:val="19"/>
         </w:rPr>
         <w:t>Table III summarizes the operational advantages of SafeCity over traditional commercial navigation platforms and standalone reactive panic alarms.</w:t>
       </w:r>
@@ -2562,7 +2582,7 @@
     <w:p>
       <w:pPr>
         <w:keepNext/>
-        <w:spacing w:before="80" w:after="30"/>
+        <w:spacing w:before="100" w:after="40"/>
         <w:jc w:val="center"/>
       </w:pPr>
       <w:r>
@@ -2581,9 +2601,9 @@
         <w:tblLook w:firstColumn="1" w:firstRow="1" w:lastColumn="0" w:lastRow="0" w:noHBand="0" w:noVBand="1" w:val="04A0"/>
       </w:tblPr>
       <w:tblGrid>
-        <w:gridCol w:w="3427"/>
-        <w:gridCol w:w="3427"/>
-        <w:gridCol w:w="3427"/>
+        <w:gridCol w:w="3408"/>
+        <w:gridCol w:w="3408"/>
+        <w:gridCol w:w="3408"/>
       </w:tblGrid>
       <w:tr>
         <w:trPr>
@@ -2593,6 +2613,92 @@
           <w:tcPr>
             <w:tcW w:type="dxa" w:w="1512"/>
             <w:shd w:fill="1E293B"/>
+            <w:tcMar>
+              <w:top w:w="35" w:type="dxa"/>
+              <w:bottom w:w="35" w:type="dxa"/>
+              <w:left w:w="45" w:type="dxa"/>
+              <w:right w:w="45" w:type="dxa"/>
+            </w:tcMar>
+          </w:tcPr>
+          <w:p>
+            <w:pPr>
+              <w:keepNext/>
+              <w:jc w:val="center"/>
+            </w:pPr>
+            <w:r>
+              <w:rPr>
+                <w:rFonts w:ascii="Times New Roman" w:hAnsi="Times New Roman"/>
+                <w:b/>
+                <w:color w:val="FFFFFF"/>
+                <w:sz w:val="16"/>
+              </w:rPr>
+              <w:t>Evaluation Dimension</w:t>
+            </w:r>
+          </w:p>
+        </w:tc>
+        <w:tc>
+          <w:tcPr>
+            <w:tcW w:type="dxa" w:w="1584"/>
+            <w:shd w:fill="1E293B"/>
+            <w:tcMar>
+              <w:top w:w="35" w:type="dxa"/>
+              <w:bottom w:w="35" w:type="dxa"/>
+              <w:left w:w="45" w:type="dxa"/>
+              <w:right w:w="45" w:type="dxa"/>
+            </w:tcMar>
+          </w:tcPr>
+          <w:p>
+            <w:pPr>
+              <w:keepNext/>
+              <w:jc w:val="center"/>
+            </w:pPr>
+            <w:r>
+              <w:rPr>
+                <w:rFonts w:ascii="Times New Roman" w:hAnsi="Times New Roman"/>
+                <w:b/>
+                <w:color w:val="FFFFFF"/>
+                <w:sz w:val="16"/>
+              </w:rPr>
+              <w:t>Traditional Systems</w:t>
+            </w:r>
+          </w:p>
+        </w:tc>
+        <w:tc>
+          <w:tcPr>
+            <w:tcW w:type="dxa" w:w="1800"/>
+            <w:shd w:fill="1E293B"/>
+            <w:tcMar>
+              <w:top w:w="35" w:type="dxa"/>
+              <w:bottom w:w="35" w:type="dxa"/>
+              <w:left w:w="45" w:type="dxa"/>
+              <w:right w:w="45" w:type="dxa"/>
+            </w:tcMar>
+          </w:tcPr>
+          <w:p>
+            <w:pPr>
+              <w:keepNext/>
+              <w:jc w:val="center"/>
+            </w:pPr>
+            <w:r>
+              <w:rPr>
+                <w:rFonts w:ascii="Times New Roman" w:hAnsi="Times New Roman"/>
+                <w:b/>
+                <w:color w:val="FFFFFF"/>
+                <w:sz w:val="16"/>
+              </w:rPr>
+              <w:t>SafeCity Platform</w:t>
+            </w:r>
+          </w:p>
+        </w:tc>
+      </w:tr>
+      <w:tr>
+        <w:trPr>
+          <w:cantSplit/>
+        </w:trPr>
+        <w:tc>
+          <w:tcPr>
+            <w:tcW w:type="dxa" w:w="1512"/>
+            <w:shd w:fill="FFFFFF"/>
             <w:tcMar>
               <w:top w:w="28" w:type="dxa"/>
               <w:bottom w:w="28" w:type="dxa"/>
@@ -2608,18 +2714,74 @@
             <w:r>
               <w:rPr>
                 <w:rFonts w:ascii="Times New Roman" w:hAnsi="Times New Roman"/>
-                <w:b/>
-                <w:color w:val="FFFFFF"/>
+                <w:color w:val="0F172A"/>
                 <w:sz w:val="15"/>
               </w:rPr>
-              <w:t>Evaluation Dimension</w:t>
+              <w:t>Routing Objective</w:t>
             </w:r>
           </w:p>
         </w:tc>
         <w:tc>
           <w:tcPr>
             <w:tcW w:type="dxa" w:w="1584"/>
-            <w:shd w:fill="1E293B"/>
+            <w:shd w:fill="FFFFFF"/>
+            <w:tcMar>
+              <w:top w:w="28" w:type="dxa"/>
+              <w:bottom w:w="28" w:type="dxa"/>
+              <w:left w:w="40" w:type="dxa"/>
+              <w:right w:w="40" w:type="dxa"/>
+            </w:tcMar>
+          </w:tcPr>
+          <w:p>
+            <w:pPr>
+              <w:keepNext/>
+              <w:jc w:val="left"/>
+            </w:pPr>
+            <w:r>
+              <w:rPr>
+                <w:rFonts w:ascii="Times New Roman" w:hAnsi="Times New Roman"/>
+                <w:color w:val="0F172A"/>
+                <w:sz w:val="15"/>
+              </w:rPr>
+              <w:t>Shortest Distance / Time</w:t>
+            </w:r>
+          </w:p>
+        </w:tc>
+        <w:tc>
+          <w:tcPr>
+            <w:tcW w:type="dxa" w:w="1800"/>
+            <w:shd w:fill="FFFFFF"/>
+            <w:tcMar>
+              <w:top w:w="28" w:type="dxa"/>
+              <w:bottom w:w="28" w:type="dxa"/>
+              <w:left w:w="40" w:type="dxa"/>
+              <w:right w:w="40" w:type="dxa"/>
+            </w:tcMar>
+          </w:tcPr>
+          <w:p>
+            <w:pPr>
+              <w:keepNext/>
+              <w:jc w:val="left"/>
+            </w:pPr>
+            <w:r>
+              <w:rPr>
+                <w:rFonts w:ascii="Times New Roman" w:hAnsi="Times New Roman"/>
+                <w:color w:val="0F172A"/>
+                <w:sz w:val="15"/>
+              </w:rPr>
+              <w:t>Safety-Distance Multi-Objective</w:t>
+            </w:r>
+          </w:p>
+        </w:tc>
+      </w:tr>
+      <w:tr>
+        <w:trPr>
+          <w:cantSplit/>
+        </w:trPr>
+        <w:tc>
+          <w:tcPr>
+            <w:tcW w:type="dxa" w:w="1512"/>
+            <w:shd w:fill="F8FAFC"/>
             <w:tcMar>
               <w:top w:w="28" w:type="dxa"/>
               <w:bottom w:w="28" w:type="dxa"/>
@@ -2635,18 +2797,74 @@
             <w:r>
               <w:rPr>
                 <w:rFonts w:ascii="Times New Roman" w:hAnsi="Times New Roman"/>
-                <w:b/>
-                <w:color w:val="FFFFFF"/>
+                <w:color w:val="0F172A"/>
                 <w:sz w:val="15"/>
               </w:rPr>
-              <w:t>Traditional Systems</w:t>
+              <w:t>Hazard Consideration</w:t>
+            </w:r>
+          </w:p>
+        </w:tc>
+        <w:tc>
+          <w:tcPr>
+            <w:tcW w:type="dxa" w:w="1584"/>
+            <w:shd w:fill="F8FAFC"/>
+            <w:tcMar>
+              <w:top w:w="28" w:type="dxa"/>
+              <w:bottom w:w="28" w:type="dxa"/>
+              <w:left w:w="40" w:type="dxa"/>
+              <w:right w:w="40" w:type="dxa"/>
+            </w:tcMar>
+          </w:tcPr>
+          <w:p>
+            <w:pPr>
+              <w:keepNext/>
+              <w:jc w:val="left"/>
+            </w:pPr>
+            <w:r>
+              <w:rPr>
+                <w:rFonts w:ascii="Times New Roman" w:hAnsi="Times New Roman"/>
+                <w:color w:val="0F172A"/>
+                <w:sz w:val="15"/>
+              </w:rPr>
+              <w:t>Traffic Flow Only</w:t>
             </w:r>
           </w:p>
         </w:tc>
         <w:tc>
           <w:tcPr>
             <w:tcW w:type="dxa" w:w="1800"/>
-            <w:shd w:fill="1E293B"/>
+            <w:shd w:fill="F8FAFC"/>
+            <w:tcMar>
+              <w:top w:w="28" w:type="dxa"/>
+              <w:bottom w:w="28" w:type="dxa"/>
+              <w:left w:w="40" w:type="dxa"/>
+              <w:right w:w="40" w:type="dxa"/>
+            </w:tcMar>
+          </w:tcPr>
+          <w:p>
+            <w:pPr>
+              <w:keepNext/>
+              <w:jc w:val="left"/>
+            </w:pPr>
+            <w:r>
+              <w:rPr>
+                <w:rFonts w:ascii="Times New Roman" w:hAnsi="Times New Roman"/>
+                <w:color w:val="0F172A"/>
+                <w:sz w:val="15"/>
+              </w:rPr>
+              <w:t>Street Harassment, Lighting, Havens</w:t>
+            </w:r>
+          </w:p>
+        </w:tc>
+      </w:tr>
+      <w:tr>
+        <w:trPr>
+          <w:cantSplit/>
+        </w:trPr>
+        <w:tc>
+          <w:tcPr>
+            <w:tcW w:type="dxa" w:w="1512"/>
+            <w:shd w:fill="FFFFFF"/>
             <w:tcMar>
               <w:top w:w="28" w:type="dxa"/>
               <w:bottom w:w="28" w:type="dxa"/>
@@ -2662,42 +2880,10 @@
             <w:r>
               <w:rPr>
                 <w:rFonts w:ascii="Times New Roman" w:hAnsi="Times New Roman"/>
-                <w:b/>
-                <w:color w:val="FFFFFF"/>
+                <w:color w:val="0F172A"/>
                 <w:sz w:val="15"/>
               </w:rPr>
-              <w:t>SafeCity Platform</w:t>
-            </w:r>
-          </w:p>
-        </w:tc>
-      </w:tr>
-      <w:tr>
-        <w:trPr>
-          <w:cantSplit/>
-        </w:trPr>
-        <w:tc>
-          <w:tcPr>
-            <w:tcW w:type="dxa" w:w="1512"/>
-            <w:shd w:fill="FFFFFF"/>
-            <w:tcMar>
-              <w:top w:w="22" w:type="dxa"/>
-              <w:bottom w:w="22" w:type="dxa"/>
-              <w:left w:w="35" w:type="dxa"/>
-              <w:right w:w="35" w:type="dxa"/>
-            </w:tcMar>
-          </w:tcPr>
-          <w:p>
-            <w:pPr>
-              <w:keepNext/>
-              <w:jc w:val="center"/>
-            </w:pPr>
-            <w:r>
-              <w:rPr>
-                <w:rFonts w:ascii="Times New Roman" w:hAnsi="Times New Roman"/>
-                <w:color w:val="0F172A"/>
-                <w:sz w:val="14"/>
-              </w:rPr>
-              <w:t>Routing Objective</w:t>
+              <w:t>User Cognitive Load</w:t>
             </w:r>
           </w:p>
         </w:tc>
@@ -2706,10 +2892,10 @@
             <w:tcW w:type="dxa" w:w="1584"/>
             <w:shd w:fill="FFFFFF"/>
             <w:tcMar>
-              <w:top w:w="22" w:type="dxa"/>
-              <w:bottom w:w="22" w:type="dxa"/>
-              <w:left w:w="35" w:type="dxa"/>
-              <w:right w:w="35" w:type="dxa"/>
+              <w:top w:w="28" w:type="dxa"/>
+              <w:bottom w:w="28" w:type="dxa"/>
+              <w:left w:w="40" w:type="dxa"/>
+              <w:right w:w="40" w:type="dxa"/>
             </w:tcMar>
           </w:tcPr>
           <w:p>
@@ -2721,9 +2907,9 @@
               <w:rPr>
                 <w:rFonts w:ascii="Times New Roman" w:hAnsi="Times New Roman"/>
                 <w:color w:val="0F172A"/>
-                <w:sz w:val="14"/>
+                <w:sz w:val="15"/>
               </w:rPr>
-              <w:t>Shortest Distance / Time</w:t>
+              <w:t>High (Manual SOS Under Attack)</w:t>
             </w:r>
           </w:p>
         </w:tc>
@@ -2732,10 +2918,10 @@
             <w:tcW w:type="dxa" w:w="1800"/>
             <w:shd w:fill="FFFFFF"/>
             <w:tcMar>
-              <w:top w:w="22" w:type="dxa"/>
-              <w:bottom w:w="22" w:type="dxa"/>
-              <w:left w:w="35" w:type="dxa"/>
-              <w:right w:w="35" w:type="dxa"/>
+              <w:top w:w="28" w:type="dxa"/>
+              <w:bottom w:w="28" w:type="dxa"/>
+              <w:left w:w="40" w:type="dxa"/>
+              <w:right w:w="40" w:type="dxa"/>
             </w:tcMar>
           </w:tcPr>
           <w:p>
@@ -2747,173 +2933,7 @@
               <w:rPr>
                 <w:rFonts w:ascii="Times New Roman" w:hAnsi="Times New Roman"/>
                 <w:color w:val="0F172A"/>
-                <w:sz w:val="14"/>
-              </w:rPr>
-              <w:t>Safety-Distance Multi-Objective</w:t>
-            </w:r>
-          </w:p>
-        </w:tc>
-      </w:tr>
-      <w:tr>
-        <w:trPr>
-          <w:cantSplit/>
-        </w:trPr>
-        <w:tc>
-          <w:tcPr>
-            <w:tcW w:type="dxa" w:w="1512"/>
-            <w:shd w:fill="F8FAFC"/>
-            <w:tcMar>
-              <w:top w:w="22" w:type="dxa"/>
-              <w:bottom w:w="22" w:type="dxa"/>
-              <w:left w:w="35" w:type="dxa"/>
-              <w:right w:w="35" w:type="dxa"/>
-            </w:tcMar>
-          </w:tcPr>
-          <w:p>
-            <w:pPr>
-              <w:keepNext/>
-              <w:jc w:val="center"/>
-            </w:pPr>
-            <w:r>
-              <w:rPr>
-                <w:rFonts w:ascii="Times New Roman" w:hAnsi="Times New Roman"/>
-                <w:color w:val="0F172A"/>
-                <w:sz w:val="14"/>
-              </w:rPr>
-              <w:t>Hazard Consideration</w:t>
-            </w:r>
-          </w:p>
-        </w:tc>
-        <w:tc>
-          <w:tcPr>
-            <w:tcW w:type="dxa" w:w="1584"/>
-            <w:shd w:fill="F8FAFC"/>
-            <w:tcMar>
-              <w:top w:w="22" w:type="dxa"/>
-              <w:bottom w:w="22" w:type="dxa"/>
-              <w:left w:w="35" w:type="dxa"/>
-              <w:right w:w="35" w:type="dxa"/>
-            </w:tcMar>
-          </w:tcPr>
-          <w:p>
-            <w:pPr>
-              <w:keepNext/>
-              <w:jc w:val="left"/>
-            </w:pPr>
-            <w:r>
-              <w:rPr>
-                <w:rFonts w:ascii="Times New Roman" w:hAnsi="Times New Roman"/>
-                <w:color w:val="0F172A"/>
-                <w:sz w:val="14"/>
-              </w:rPr>
-              <w:t>Traffic Flow Only</w:t>
-            </w:r>
-          </w:p>
-        </w:tc>
-        <w:tc>
-          <w:tcPr>
-            <w:tcW w:type="dxa" w:w="1800"/>
-            <w:shd w:fill="F8FAFC"/>
-            <w:tcMar>
-              <w:top w:w="22" w:type="dxa"/>
-              <w:bottom w:w="22" w:type="dxa"/>
-              <w:left w:w="35" w:type="dxa"/>
-              <w:right w:w="35" w:type="dxa"/>
-            </w:tcMar>
-          </w:tcPr>
-          <w:p>
-            <w:pPr>
-              <w:keepNext/>
-              <w:jc w:val="left"/>
-            </w:pPr>
-            <w:r>
-              <w:rPr>
-                <w:rFonts w:ascii="Times New Roman" w:hAnsi="Times New Roman"/>
-                <w:color w:val="0F172A"/>
-                <w:sz w:val="14"/>
-              </w:rPr>
-              <w:t>Street Harassment, Lighting, Havens</w:t>
-            </w:r>
-          </w:p>
-        </w:tc>
-      </w:tr>
-      <w:tr>
-        <w:trPr>
-          <w:cantSplit/>
-        </w:trPr>
-        <w:tc>
-          <w:tcPr>
-            <w:tcW w:type="dxa" w:w="1512"/>
-            <w:shd w:fill="FFFFFF"/>
-            <w:tcMar>
-              <w:top w:w="22" w:type="dxa"/>
-              <w:bottom w:w="22" w:type="dxa"/>
-              <w:left w:w="35" w:type="dxa"/>
-              <w:right w:w="35" w:type="dxa"/>
-            </w:tcMar>
-          </w:tcPr>
-          <w:p>
-            <w:pPr>
-              <w:keepNext/>
-              <w:jc w:val="center"/>
-            </w:pPr>
-            <w:r>
-              <w:rPr>
-                <w:rFonts w:ascii="Times New Roman" w:hAnsi="Times New Roman"/>
-                <w:color w:val="0F172A"/>
-                <w:sz w:val="14"/>
-              </w:rPr>
-              <w:t>User Cognitive Load</w:t>
-            </w:r>
-          </w:p>
-        </w:tc>
-        <w:tc>
-          <w:tcPr>
-            <w:tcW w:type="dxa" w:w="1584"/>
-            <w:shd w:fill="FFFFFF"/>
-            <w:tcMar>
-              <w:top w:w="22" w:type="dxa"/>
-              <w:bottom w:w="22" w:type="dxa"/>
-              <w:left w:w="35" w:type="dxa"/>
-              <w:right w:w="35" w:type="dxa"/>
-            </w:tcMar>
-          </w:tcPr>
-          <w:p>
-            <w:pPr>
-              <w:keepNext/>
-              <w:jc w:val="left"/>
-            </w:pPr>
-            <w:r>
-              <w:rPr>
-                <w:rFonts w:ascii="Times New Roman" w:hAnsi="Times New Roman"/>
-                <w:color w:val="0F172A"/>
-                <w:sz w:val="14"/>
-              </w:rPr>
-              <w:t>High (Manual SOS Under Attack)</w:t>
-            </w:r>
-          </w:p>
-        </w:tc>
-        <w:tc>
-          <w:tcPr>
-            <w:tcW w:type="dxa" w:w="1800"/>
-            <w:shd w:fill="FFFFFF"/>
-            <w:tcMar>
-              <w:top w:w="22" w:type="dxa"/>
-              <w:bottom w:w="22" w:type="dxa"/>
-              <w:left w:w="35" w:type="dxa"/>
-              <w:right w:w="35" w:type="dxa"/>
-            </w:tcMar>
-          </w:tcPr>
-          <w:p>
-            <w:pPr>
-              <w:keepNext/>
-              <w:jc w:val="left"/>
-            </w:pPr>
-            <w:r>
-              <w:rPr>
-                <w:rFonts w:ascii="Times New Roman" w:hAnsi="Times New Roman"/>
-                <w:color w:val="0F172A"/>
-                <w:sz w:val="14"/>
+                <w:sz w:val="15"/>
               </w:rPr>
               <w:t>Zero (Autonomous Watchdog)</w:t>
             </w:r>
@@ -2929,10 +2949,10 @@
             <w:tcW w:type="dxa" w:w="1512"/>
             <w:shd w:fill="F8FAFC"/>
             <w:tcMar>
-              <w:top w:w="22" w:type="dxa"/>
-              <w:bottom w:w="22" w:type="dxa"/>
-              <w:left w:w="35" w:type="dxa"/>
-              <w:right w:w="35" w:type="dxa"/>
+              <w:top w:w="28" w:type="dxa"/>
+              <w:bottom w:w="28" w:type="dxa"/>
+              <w:left w:w="40" w:type="dxa"/>
+              <w:right w:w="40" w:type="dxa"/>
             </w:tcMar>
           </w:tcPr>
           <w:p>
@@ -2944,7 +2964,7 @@
               <w:rPr>
                 <w:rFonts w:ascii="Times New Roman" w:hAnsi="Times New Roman"/>
                 <w:color w:val="0F172A"/>
-                <w:sz w:val="14"/>
+                <w:sz w:val="15"/>
               </w:rPr>
               <w:t>Reporting Mechanism</w:t>
             </w:r>
@@ -2955,10 +2975,10 @@
             <w:tcW w:type="dxa" w:w="1584"/>
             <w:shd w:fill="F8FAFC"/>
             <w:tcMar>
-              <w:top w:w="22" w:type="dxa"/>
-              <w:bottom w:w="22" w:type="dxa"/>
-              <w:left w:w="35" w:type="dxa"/>
-              <w:right w:w="35" w:type="dxa"/>
+              <w:top w:w="28" w:type="dxa"/>
+              <w:bottom w:w="28" w:type="dxa"/>
+              <w:left w:w="40" w:type="dxa"/>
+              <w:right w:w="40" w:type="dxa"/>
             </w:tcMar>
           </w:tcPr>
           <w:p>
@@ -2970,7 +2990,7 @@
               <w:rPr>
                 <w:rFonts w:ascii="Times New Roman" w:hAnsi="Times New Roman"/>
                 <w:color w:val="0F172A"/>
-                <w:sz w:val="14"/>
+                <w:sz w:val="15"/>
               </w:rPr>
               <w:t>Formal Police Report / SMS</w:t>
             </w:r>
@@ -2981,10 +3001,10 @@
             <w:tcW w:type="dxa" w:w="1800"/>
             <w:shd w:fill="F8FAFC"/>
             <w:tcMar>
-              <w:top w:w="22" w:type="dxa"/>
-              <w:bottom w:w="22" w:type="dxa"/>
-              <w:left w:w="35" w:type="dxa"/>
-              <w:right w:w="35" w:type="dxa"/>
+              <w:top w:w="28" w:type="dxa"/>
+              <w:bottom w:w="28" w:type="dxa"/>
+              <w:left w:w="40" w:type="dxa"/>
+              <w:right w:w="40" w:type="dxa"/>
             </w:tcMar>
           </w:tcPr>
           <w:p>
@@ -2996,7 +3016,7 @@
               <w:rPr>
                 <w:rFonts w:ascii="Times New Roman" w:hAnsi="Times New Roman"/>
                 <w:color w:val="0F172A"/>
-                <w:sz w:val="14"/>
+                <w:sz w:val="15"/>
               </w:rPr>
               <w:t>Anonymous Micro-Spatial Grid (~110m)</w:t>
             </w:r>
@@ -3012,10 +3032,10 @@
             <w:tcW w:type="dxa" w:w="1512"/>
             <w:shd w:fill="FFFFFF"/>
             <w:tcMar>
-              <w:top w:w="22" w:type="dxa"/>
-              <w:bottom w:w="22" w:type="dxa"/>
-              <w:left w:w="35" w:type="dxa"/>
-              <w:right w:w="35" w:type="dxa"/>
+              <w:top w:w="28" w:type="dxa"/>
+              <w:bottom w:w="28" w:type="dxa"/>
+              <w:left w:w="40" w:type="dxa"/>
+              <w:right w:w="40" w:type="dxa"/>
             </w:tcMar>
           </w:tcPr>
           <w:p>
@@ -3027,7 +3047,7 @@
               <w:rPr>
                 <w:rFonts w:ascii="Times New Roman" w:hAnsi="Times New Roman"/>
                 <w:color w:val="0F172A"/>
-                <w:sz w:val="14"/>
+                <w:sz w:val="15"/>
               </w:rPr>
               <w:t>Pre-Trip Intelligence</w:t>
             </w:r>
@@ -3038,10 +3058,10 @@
             <w:tcW w:type="dxa" w:w="1584"/>
             <w:shd w:fill="FFFFFF"/>
             <w:tcMar>
-              <w:top w:w="22" w:type="dxa"/>
-              <w:bottom w:w="22" w:type="dxa"/>
-              <w:left w:w="35" w:type="dxa"/>
-              <w:right w:w="35" w:type="dxa"/>
+              <w:top w:w="28" w:type="dxa"/>
+              <w:bottom w:w="28" w:type="dxa"/>
+              <w:left w:w="40" w:type="dxa"/>
+              <w:right w:w="40" w:type="dxa"/>
             </w:tcMar>
           </w:tcPr>
           <w:p>
@@ -3053,7 +3073,7 @@
               <w:rPr>
                 <w:rFonts w:ascii="Times New Roman" w:hAnsi="Times New Roman"/>
                 <w:color w:val="0F172A"/>
-                <w:sz w:val="14"/>
+                <w:sz w:val="15"/>
               </w:rPr>
               <w:t>None (Kinematic Only)</w:t>
             </w:r>
@@ -3064,10 +3084,10 @@
             <w:tcW w:type="dxa" w:w="1800"/>
             <w:shd w:fill="FFFFFF"/>
             <w:tcMar>
-              <w:top w:w="22" w:type="dxa"/>
-              <w:bottom w:w="22" w:type="dxa"/>
-              <w:left w:w="35" w:type="dxa"/>
-              <w:right w:w="35" w:type="dxa"/>
+              <w:top w:w="28" w:type="dxa"/>
+              <w:bottom w:w="28" w:type="dxa"/>
+              <w:left w:w="40" w:type="dxa"/>
+              <w:right w:w="40" w:type="dxa"/>
             </w:tcMar>
           </w:tcPr>
           <w:p>
@@ -3079,7 +3099,7 @@
               <w:rPr>
                 <w:rFonts w:ascii="Times New Roman" w:hAnsi="Times New Roman"/>
                 <w:color w:val="0F172A"/>
-                <w:sz w:val="14"/>
+                <w:sz w:val="15"/>
               </w:rPr>
               <w:t>Dynamic Corridor Scoring (0-100)</w:t>
             </w:r>
@@ -3095,10 +3115,10 @@
             <w:tcW w:type="dxa" w:w="1512"/>
             <w:shd w:fill="F8FAFC"/>
             <w:tcMar>
-              <w:top w:w="22" w:type="dxa"/>
-              <w:bottom w:w="22" w:type="dxa"/>
-              <w:left w:w="35" w:type="dxa"/>
-              <w:right w:w="35" w:type="dxa"/>
+              <w:top w:w="28" w:type="dxa"/>
+              <w:bottom w:w="28" w:type="dxa"/>
+              <w:left w:w="40" w:type="dxa"/>
+              <w:right w:w="40" w:type="dxa"/>
             </w:tcMar>
           </w:tcPr>
           <w:p>
@@ -3110,7 +3130,7 @@
               <w:rPr>
                 <w:rFonts w:ascii="Times New Roman" w:hAnsi="Times New Roman"/>
                 <w:color w:val="0F172A"/>
-                <w:sz w:val="14"/>
+                <w:sz w:val="15"/>
               </w:rPr>
               <w:t>Location Privacy</w:t>
             </w:r>
@@ -3121,10 +3141,10 @@
             <w:tcW w:type="dxa" w:w="1584"/>
             <w:shd w:fill="F8FAFC"/>
             <w:tcMar>
-              <w:top w:w="22" w:type="dxa"/>
-              <w:bottom w:w="22" w:type="dxa"/>
-              <w:left w:w="35" w:type="dxa"/>
-              <w:right w:w="35" w:type="dxa"/>
+              <w:top w:w="28" w:type="dxa"/>
+              <w:bottom w:w="28" w:type="dxa"/>
+              <w:left w:w="40" w:type="dxa"/>
+              <w:right w:w="40" w:type="dxa"/>
             </w:tcMar>
           </w:tcPr>
           <w:p>
@@ -3136,7 +3156,7 @@
               <w:rPr>
                 <w:rFonts w:ascii="Times New Roman" w:hAnsi="Times New Roman"/>
                 <w:color w:val="0F172A"/>
-                <w:sz w:val="14"/>
+                <w:sz w:val="15"/>
               </w:rPr>
               <w:t>Commercial Ad Tracking</w:t>
             </w:r>
@@ -3147,10 +3167,10 @@
             <w:tcW w:type="dxa" w:w="1800"/>
             <w:shd w:fill="F8FAFC"/>
             <w:tcMar>
-              <w:top w:w="22" w:type="dxa"/>
-              <w:bottom w:w="22" w:type="dxa"/>
-              <w:left w:w="35" w:type="dxa"/>
-              <w:right w:w="35" w:type="dxa"/>
+              <w:top w:w="28" w:type="dxa"/>
+              <w:bottom w:w="28" w:type="dxa"/>
+              <w:left w:w="40" w:type="dxa"/>
+              <w:right w:w="40" w:type="dxa"/>
             </w:tcMar>
           </w:tcPr>
           <w:p>
@@ -3162,7 +3182,7 @@
               <w:rPr>
                 <w:rFonts w:ascii="Times New Roman" w:hAnsi="Times New Roman"/>
                 <w:color w:val="0F172A"/>
-                <w:sz w:val="14"/>
+                <w:sz w:val="15"/>
               </w:rPr>
               <w:t>Quantized 3-Decimal Coordinates</w:t>
             </w:r>
@@ -3178,10 +3198,10 @@
             <w:tcW w:type="dxa" w:w="1512"/>
             <w:shd w:fill="FFFFFF"/>
             <w:tcMar>
-              <w:top w:w="22" w:type="dxa"/>
-              <w:bottom w:w="22" w:type="dxa"/>
-              <w:left w:w="35" w:type="dxa"/>
-              <w:right w:w="35" w:type="dxa"/>
+              <w:top w:w="28" w:type="dxa"/>
+              <w:bottom w:w="28" w:type="dxa"/>
+              <w:left w:w="40" w:type="dxa"/>
+              <w:right w:w="40" w:type="dxa"/>
             </w:tcMar>
           </w:tcPr>
           <w:p>
@@ -3192,7 +3212,7 @@
               <w:rPr>
                 <w:rFonts w:ascii="Times New Roman" w:hAnsi="Times New Roman"/>
                 <w:color w:val="0F172A"/>
-                <w:sz w:val="14"/>
+                <w:sz w:val="15"/>
               </w:rPr>
               <w:t>Single Point of Failure</w:t>
             </w:r>
@@ -3203,10 +3223,10 @@
             <w:tcW w:type="dxa" w:w="1584"/>
             <w:shd w:fill="FFFFFF"/>
             <w:tcMar>
-              <w:top w:w="22" w:type="dxa"/>
-              <w:bottom w:w="22" w:type="dxa"/>
-              <w:left w:w="35" w:type="dxa"/>
-              <w:right w:w="35" w:type="dxa"/>
+              <w:top w:w="28" w:type="dxa"/>
+              <w:bottom w:w="28" w:type="dxa"/>
+              <w:left w:w="40" w:type="dxa"/>
+              <w:right w:w="40" w:type="dxa"/>
             </w:tcMar>
           </w:tcPr>
           <w:p>
@@ -3217,7 +3237,7 @@
               <w:rPr>
                 <w:rFonts w:ascii="Times New Roman" w:hAnsi="Times New Roman"/>
                 <w:color w:val="0F172A"/>
-                <w:sz w:val="14"/>
+                <w:sz w:val="15"/>
               </w:rPr>
               <w:t>Cloud / Cellular Outage</w:t>
             </w:r>
@@ -3228,10 +3248,10 @@
             <w:tcW w:type="dxa" w:w="1800"/>
             <w:shd w:fill="FFFFFF"/>
             <w:tcMar>
-              <w:top w:w="22" w:type="dxa"/>
-              <w:bottom w:w="22" w:type="dxa"/>
-              <w:left w:w="35" w:type="dxa"/>
-              <w:right w:w="35" w:type="dxa"/>
+              <w:top w:w="28" w:type="dxa"/>
+              <w:bottom w:w="28" w:type="dxa"/>
+              <w:left w:w="40" w:type="dxa"/>
+              <w:right w:w="40" w:type="dxa"/>
             </w:tcMar>
           </w:tcPr>
           <w:p>
@@ -3242,7 +3262,7 @@
               <w:rPr>
                 <w:rFonts w:ascii="Times New Roman" w:hAnsi="Times New Roman"/>
                 <w:color w:val="0F172A"/>
-                <w:sz w:val="14"/>
+                <w:sz w:val="15"/>
               </w:rPr>
               <w:t>Offline PWA Shell + Local Caching</w:t>
             </w:r>
@@ -3253,7 +3273,7 @@
     <w:p>
       <w:pPr>
         <w:keepNext/>
-        <w:spacing w:before="80" w:after="20"/>
+        <w:spacing w:before="100" w:after="30"/>
         <w:jc w:val="left"/>
       </w:pPr>
       <w:r>
@@ -3262,21 +3282,21 @@
           <w:b/>
           <w:i/>
           <w:color w:val="000000"/>
-          <w:sz w:val="18"/>
+          <w:sz w:val="19"/>
         </w:rPr>
         <w:t>E. Limitations of the Evaluation Plan</w:t>
       </w:r>
     </w:p>
     <w:p>
       <w:pPr>
-        <w:spacing w:after="40" w:line="247" w:lineRule="auto"/>
+        <w:spacing w:after="60" w:line="252" w:lineRule="auto"/>
         <w:jc w:val="both"/>
       </w:pPr>
       <w:r>
         <w:rPr>
           <w:rFonts w:ascii="Times New Roman" w:hAnsi="Times New Roman"/>
           <w:color w:val="000000"/>
-          <w:sz w:val="18"/>
+          <w:sz w:val="19"/>
         </w:rPr>
         <w:t>The experimental evaluation was conducted within the Bengaluru metropolitan region using a curated repository of verified incident reports and safe havens. Generalization to smaller semi-urban towns with sparse street illumination data and fewer commercial safe havens requires further empirical calibration.</w:t>
       </w:r>
@@ -3284,7 +3304,7 @@
     <w:p>
       <w:pPr>
         <w:keepNext/>
-        <w:spacing w:before="120" w:after="40"/>
+        <w:spacing w:before="160" w:after="50"/>
         <w:jc w:val="center"/>
       </w:pPr>
       <w:r>
@@ -3292,35 +3312,35 @@
           <w:rFonts w:ascii="Times New Roman" w:hAnsi="Times New Roman"/>
           <w:b/>
           <w:color w:val="000000"/>
-          <w:sz w:val="19"/>
+          <w:sz w:val="20"/>
         </w:rPr>
         <w:t>VII. CONCLUSION AND FUTURE WORK</w:t>
       </w:r>
     </w:p>
     <w:p>
       <w:pPr>
-        <w:spacing w:after="40" w:line="247" w:lineRule="auto"/>
+        <w:spacing w:after="60" w:line="252" w:lineRule="auto"/>
         <w:jc w:val="both"/>
       </w:pPr>
       <w:r>
         <w:rPr>
           <w:rFonts w:ascii="Times New Roman" w:hAnsi="Times New Roman"/>
           <w:color w:val="000000"/>
-          <w:sz w:val="18"/>
+          <w:sz w:val="19"/>
         </w:rPr>
         <w:t>This paper presented SafeCity, a comprehensive community-based women protection and proactive incident reporting platform designed to eliminate the systemic shortcomings of reactive panic buttons and shortest-path navigation engines. By unifying privacy-preserving crowdsourced incident reporting, administrative moderation, multi-criteria risk-aware pathfinding, an autonomous 180-second stationary companion watchdog, and verified civic refuge havens, SafeCity empowers urban commuters to actively avoid environmental hazards. Empirical evaluations in Bengaluru confirm sub-second pathfinding latencies, accurate hazard discrimination, and high user acceptance (SUS score 82.4/100). The platform directly advances United Nations Sustainable Development Goals 5, 9, and 11 [10].</w:t>
       </w:r>
     </w:p>
     <w:p>
       <w:pPr>
-        <w:spacing w:after="40" w:line="247" w:lineRule="auto"/>
+        <w:spacing w:after="60" w:line="252" w:lineRule="auto"/>
         <w:jc w:val="both"/>
       </w:pPr>
       <w:r>
         <w:rPr>
           <w:rFonts w:ascii="Times New Roman" w:hAnsi="Times New Roman"/>
           <w:color w:val="000000"/>
-          <w:sz w:val="18"/>
+          <w:sz w:val="19"/>
         </w:rPr>
         <w:t>Future work will explore four key extensions: (i) lightweight on-device acoustic machine learning models to detect vocal distress or screams in real time; (ii) ad-hoc peer-to-peer Bluetooth mesh networking to broadcast emergency beacons during total cellular blackouts; (iii) zero-knowledge proof cryptography to verify community credentials without revealing citizen identities; and (iv) automated integration with municipal smart-city lighting telemetry to continuously update real-time road illumination surfaces.</w:t>
       </w:r>
@@ -3328,7 +3348,7 @@
     <w:p>
       <w:pPr>
         <w:keepNext/>
-        <w:spacing w:before="120" w:after="40"/>
+        <w:spacing w:before="160" w:after="50"/>
         <w:jc w:val="center"/>
       </w:pPr>
       <w:r>
@@ -3336,21 +3356,21 @@
           <w:rFonts w:ascii="Times New Roman" w:hAnsi="Times New Roman"/>
           <w:b/>
           <w:color w:val="000000"/>
-          <w:sz w:val="19"/>
+          <w:sz w:val="20"/>
         </w:rPr>
         <w:t>ACKNOWLEDGMENT</w:t>
       </w:r>
     </w:p>
     <w:p>
       <w:pPr>
-        <w:spacing w:after="40" w:line="247" w:lineRule="auto"/>
+        <w:spacing w:after="60" w:line="252" w:lineRule="auto"/>
         <w:jc w:val="both"/>
       </w:pPr>
       <w:r>
         <w:rPr>
           <w:rFonts w:ascii="Times New Roman" w:hAnsi="Times New Roman"/>
           <w:color w:val="000000"/>
-          <w:sz w:val="18"/>
+          <w:sz w:val="19"/>
         </w:rPr>
         <w:t>The authors are deeply grateful to Mr. Muthuraju V. for his technical guidance and constructive feedback during the architecture and evaluation of SafeCity. We also thank the School of Computer Science and Engineering at Presidency University for supporting our work with testing facilities.</w:t>
       </w:r>
@@ -3358,7 +3378,7 @@
     <w:p>
       <w:pPr>
         <w:keepNext/>
-        <w:spacing w:before="120" w:after="40"/>
+        <w:spacing w:before="160" w:after="50"/>
         <w:jc w:val="center"/>
       </w:pPr>
       <w:r>
@@ -3366,7 +3386,7 @@
           <w:rFonts w:ascii="Times New Roman" w:hAnsi="Times New Roman"/>
           <w:b/>
           <w:color w:val="000000"/>
-          <w:sz w:val="19"/>
+          <w:sz w:val="20"/>
         </w:rPr>
         <w:t>REFERENCES</w:t>
       </w:r>
@@ -3374,15 +3394,15 @@
     <w:p>
       <w:pPr>
         <w:keepLines/>
-        <w:spacing w:after="40" w:line="245" w:lineRule="auto"/>
-        <w:ind w:left="317" w:hanging="317"/>
+        <w:spacing w:after="50" w:line="250" w:lineRule="auto"/>
+        <w:ind w:left="346" w:hanging="346"/>
         <w:jc w:val="both"/>
       </w:pPr>
       <w:r>
         <w:rPr>
           <w:rFonts w:ascii="Times New Roman" w:hAnsi="Times New Roman"/>
           <w:color w:val="000000"/>
-          <w:sz w:val="15"/>
+          <w:sz w:val="17"/>
         </w:rPr>
         <w:t>[1] E. Galbrun, K. Pelechrinis, and E. Terzi, "Urban navigation beyond shortest route: The case of safe paths," Information Systems, vol. 57, pp. 160–171, Apr. 2016. DOI: 10.1016/j.is.2015.10.005.</w:t>
       </w:r>
@@ -3390,15 +3410,15 @@
     <w:p>
       <w:pPr>
         <w:keepLines/>
-        <w:spacing w:after="40" w:line="245" w:lineRule="auto"/>
-        <w:ind w:left="317" w:hanging="317"/>
+        <w:spacing w:after="50" w:line="250" w:lineRule="auto"/>
+        <w:ind w:left="346" w:hanging="346"/>
         <w:jc w:val="both"/>
       </w:pPr>
       <w:r>
         <w:rPr>
           <w:rFonts w:ascii="Times New Roman" w:hAnsi="Times New Roman"/>
           <w:color w:val="000000"/>
-          <w:sz w:val="15"/>
+          <w:sz w:val="17"/>
         </w:rPr>
         <w:t>[2] S. G. Lea, E. D'Silva, and A. Asok, "Women's strategies addressing sexual harassment and assault on public buses: An analysis of crowdsourced data," Crime Prevention and Community Safety, vol. 19, no. 3–4, pp. 227–239, Nov. 2017. DOI: 10.1057/s41300-017-0028-1.</w:t>
       </w:r>
@@ -3406,15 +3426,15 @@
     <w:p>
       <w:pPr>
         <w:keepLines/>
-        <w:spacing w:after="40" w:line="245" w:lineRule="auto"/>
-        <w:ind w:left="317" w:hanging="317"/>
+        <w:spacing w:after="50" w:line="250" w:lineRule="auto"/>
+        <w:ind w:left="346" w:hanging="346"/>
         <w:jc w:val="both"/>
       </w:pPr>
       <w:r>
         <w:rPr>
           <w:rFonts w:ascii="Times New Roman" w:hAnsi="Times New Roman"/>
           <w:color w:val="000000"/>
-          <w:sz w:val="15"/>
+          <w:sz w:val="17"/>
         </w:rPr>
         <w:t>[3] P. S. S. Prasad, P. V. S. S. S. R. N. Murthy, and G. H. K. Rao, "Abhaya: An Android app for the safety of women," in Proc. 2015 Annual IEEE India Conf. (INDICON), New Delhi, India, 2015, pp. 1–5. DOI: 10.1109/INDICON.2015.7443652.</w:t>
       </w:r>
@@ -3422,15 +3442,15 @@
     <w:p>
       <w:pPr>
         <w:keepLines/>
-        <w:spacing w:after="40" w:line="245" w:lineRule="auto"/>
-        <w:ind w:left="317" w:hanging="317"/>
+        <w:spacing w:after="50" w:line="250" w:lineRule="auto"/>
+        <w:ind w:left="346" w:hanging="346"/>
         <w:jc w:val="both"/>
       </w:pPr>
       <w:r>
         <w:rPr>
           <w:rFonts w:ascii="Times New Roman" w:hAnsi="Times New Roman"/>
           <w:color w:val="000000"/>
-          <w:sz w:val="15"/>
+          <w:sz w:val="17"/>
         </w:rPr>
         <w:t>[4] R. Solymosi, D. Buil-Gil, L. Vozmediano, and I. S. Guedes, "Towards a place-based measure of fear of crime: A systematic review of app-based and crowdsourcing approaches," Environment and Behavior, vol. 53, no. 9, pp. 1013–1044, Nov. 2021. DOI: 10.1177/0013916520947114.</w:t>
       </w:r>
@@ -3438,15 +3458,15 @@
     <w:p>
       <w:pPr>
         <w:keepLines/>
-        <w:spacing w:after="40" w:line="245" w:lineRule="auto"/>
-        <w:ind w:left="317" w:hanging="317"/>
+        <w:spacing w:after="50" w:line="250" w:lineRule="auto"/>
+        <w:ind w:left="346" w:hanging="346"/>
         <w:jc w:val="both"/>
       </w:pPr>
       <w:r>
         <w:rPr>
           <w:rFonts w:ascii="Times New Roman" w:hAnsi="Times New Roman"/>
           <w:color w:val="000000"/>
-          <w:sz w:val="15"/>
+          <w:sz w:val="17"/>
         </w:rPr>
         <w:t>[5] D. Quercia, R. Schifanella, and L. M. Aiello, "The shortest path to happiness: Recommending beautiful, quiet, and happy routes in the city," in Proc. 25th ACM Conf. Hypertext Social Media (HT '14), Santiago, Chile, 2014, pp. 116–125. DOI: 10.1145/2631775.2631799.</w:t>
       </w:r>
@@ -3454,15 +3474,15 @@
     <w:p>
       <w:pPr>
         <w:keepLines/>
-        <w:spacing w:after="40" w:line="245" w:lineRule="auto"/>
-        <w:ind w:left="317" w:hanging="317"/>
+        <w:spacing w:after="50" w:line="250" w:lineRule="auto"/>
+        <w:ind w:left="346" w:hanging="346"/>
         <w:jc w:val="both"/>
       </w:pPr>
       <w:r>
         <w:rPr>
           <w:rFonts w:ascii="Times New Roman" w:hAnsi="Times New Roman"/>
           <w:color w:val="000000"/>
-          <w:sz w:val="15"/>
+          <w:sz w:val="17"/>
         </w:rPr>
         <w:t>[6] S. Levy, W. Xiong, E. Belding, and W. Y. Wang, "SafeRoute: Learning to navigate streets safely in an urban environment," ACM Transactions on Intelligent Systems and Technology (TIST), vol. 11, no. 6, art. 66, pp. 1–25, Sep. 2020. DOI: 10.1145/3402818.</w:t>
       </w:r>
@@ -3470,15 +3490,15 @@
     <w:p>
       <w:pPr>
         <w:keepLines/>
-        <w:spacing w:after="40" w:line="245" w:lineRule="auto"/>
-        <w:ind w:left="317" w:hanging="317"/>
+        <w:spacing w:after="50" w:line="250" w:lineRule="auto"/>
+        <w:ind w:left="346" w:hanging="346"/>
         <w:jc w:val="both"/>
       </w:pPr>
       <w:r>
         <w:rPr>
           <w:rFonts w:ascii="Times New Roman" w:hAnsi="Times New Roman"/>
           <w:color w:val="000000"/>
-          <w:sz w:val="15"/>
+          <w:sz w:val="17"/>
         </w:rPr>
         <w:t>[7] G. C. Harikiran, B. Menaka, et al., "Smart security solution for women based on Internet of Things (IOT)," in Proc. 2016 Int. Conf. Electr., Electron., Optim. Tech. (ICEEOT), Chennai, India, 2016, pp. 3541–3544. DOI: 10.1109/ICEEOT.2016.7755363.</w:t>
       </w:r>
@@ -3486,15 +3506,15 @@
     <w:p>
       <w:pPr>
         <w:keepLines/>
-        <w:spacing w:after="40" w:line="245" w:lineRule="auto"/>
-        <w:ind w:left="317" w:hanging="317"/>
+        <w:spacing w:after="50" w:line="250" w:lineRule="auto"/>
+        <w:ind w:left="346" w:hanging="346"/>
         <w:jc w:val="both"/>
       </w:pPr>
       <w:r>
         <w:rPr>
           <w:rFonts w:ascii="Times New Roman" w:hAnsi="Times New Roman"/>
           <w:color w:val="000000"/>
-          <w:sz w:val="15"/>
+          <w:sz w:val="17"/>
         </w:rPr>
         <w:t>[8] S. Majumdar, S. E. Kirkley, and M. Srivastava, "Voice command AI assistant for public safety," in Proc. 2022 Int. Conf. Innov. Intell. Informatics, Comput., Technol. (3ICT), Sakheer, Bahrain, 2022, pp. 627–632. DOI: 10.1109/3ICT56508.2022.9990716.</w:t>
       </w:r>
@@ -3502,15 +3522,15 @@
     <w:p>
       <w:pPr>
         <w:keepLines/>
-        <w:spacing w:after="40" w:line="245" w:lineRule="auto"/>
-        <w:ind w:left="317" w:hanging="317"/>
+        <w:spacing w:after="50" w:line="250" w:lineRule="auto"/>
+        <w:ind w:left="346" w:hanging="346"/>
         <w:jc w:val="both"/>
       </w:pPr>
       <w:r>
         <w:rPr>
           <w:rFonts w:ascii="Times New Roman" w:hAnsi="Times New Roman"/>
           <w:color w:val="000000"/>
-          <w:sz w:val="15"/>
+          <w:sz w:val="17"/>
         </w:rPr>
         <w:t>[9] J. Brooke, "SUS: A 'quick and dirty' usability scale," Usability Evaluation in Industry, P. W. Jordan, B. Thomas, I. L. McClelland, and B. Weerdmeester, Eds. London, UK: Taylor &amp; Francis, 1996, pp. 189–194.</w:t>
       </w:r>
@@ -3518,15 +3538,15 @@
     <w:p>
       <w:pPr>
         <w:keepLines/>
-        <w:spacing w:after="40" w:line="245" w:lineRule="auto"/>
-        <w:ind w:left="317" w:hanging="317"/>
+        <w:spacing w:after="50" w:line="250" w:lineRule="auto"/>
+        <w:ind w:left="346" w:hanging="346"/>
         <w:jc w:val="both"/>
       </w:pPr>
       <w:r>
         <w:rPr>
           <w:rFonts w:ascii="Times New Roman" w:hAnsi="Times New Roman"/>
           <w:color w:val="000000"/>
-          <w:sz w:val="15"/>
+          <w:sz w:val="17"/>
         </w:rPr>
         <w:t>[10] United Nations, "Transforming our world: the 2030 Agenda for Sustainable Development," UN General Assembly Resolution A/RES/70/1, Oct. 2015. [Online]. Available: https://sdgs.un.org/goals</w:t>
       </w:r>
@@ -3534,15 +3554,15 @@
     <w:p>
       <w:pPr>
         <w:keepLines/>
-        <w:spacing w:after="40" w:line="245" w:lineRule="auto"/>
-        <w:ind w:left="317" w:hanging="317"/>
+        <w:spacing w:after="50" w:line="250" w:lineRule="auto"/>
+        <w:ind w:left="346" w:hanging="346"/>
         <w:jc w:val="both"/>
       </w:pPr>
       <w:r>
         <w:rPr>
           <w:rFonts w:ascii="Times New Roman" w:hAnsi="Times New Roman"/>
           <w:color w:val="000000"/>
-          <w:sz w:val="15"/>
+          <w:sz w:val="17"/>
         </w:rPr>
         <w:t>[11] Ministry of Law and Justice (Govt. of India), "The Digital Personal Data Protection Act, 2023," The Gazette of India, Act No. 22 of 2023, Aug. 2023.</w:t>
       </w:r>
@@ -3552,7 +3572,7 @@
         <w:sectPr>
           <w:type w:val="continuous"/>
           <w:pgSz w:w="12240" w:h="15840"/>
-          <w:pgMar w:top="979" w:right="979" w:bottom="979" w:left="979" w:header="720" w:footer="720" w:gutter="0"/>
+          <w:pgMar w:top="1080" w:right="1008" w:bottom="1080" w:left="1008" w:header="720" w:footer="720" w:gutter="0"/>
           <w:cols w:space="360" w:num="2" w:equalWidth="1"/>
           <w:docGrid w:linePitch="360"/>
         </w:sectPr>
@@ -3561,7 +3581,7 @@
     <w:sectPr>
       <w:type w:val="continuous"/>
       <w:pgSz w:w="12240" w:h="15840"/>
-      <w:pgMar w:top="979" w:right="979" w:bottom="979" w:left="979" w:header="720" w:footer="720" w:gutter="0"/>
+      <w:pgMar w:top="1080" w:right="1008" w:bottom="1080" w:left="1008" w:header="720" w:footer="720" w:gutter="0"/>
       <w:cols w:space="360" w:num="2" w:equalWidth="1"/>
       <w:docGrid w:linePitch="360"/>
     </w:sectPr>

</xml_diff>

<commit_message>
refactor(paper): incorporate IEEE peer-review audit improvements, standardize author block, correct technology stack to Capacitor/MySQL, and update Section VI to Experimental Evaluation
</commit_message>
<xml_diff>
--- a/SafeCity_Research_Paper.docx
+++ b/SafeCity_Research_Paper.docx
@@ -29,7 +29,7 @@
     </w:p>
     <w:p>
       <w:pPr>
-        <w:spacing w:before="40" w:after="60"/>
+        <w:spacing w:before="40" w:after="40"/>
         <w:jc w:val="center"/>
       </w:pPr>
       <w:r>
@@ -37,29 +37,14 @@
           <w:rFonts w:ascii="Times New Roman" w:hAnsi="Times New Roman"/>
           <w:b/>
           <w:color w:val="000000"/>
-          <w:sz w:val="22"/>
+          <w:sz w:val="21"/>
         </w:rPr>
-        <w:t>Akshat Singh, Mohammed Aahil Nouman, Siddiq</w:t>
+        <w:t>Akshat Singh, Mohammed Aahil Nouman, Siddiq, and Muthuraju V.</w:t>
       </w:r>
     </w:p>
     <w:p>
       <w:pPr>
-        <w:spacing w:before="40" w:after="20"/>
-        <w:jc w:val="center"/>
-      </w:pPr>
-      <w:r>
-        <w:rPr>
-          <w:rFonts w:ascii="Times New Roman" w:hAnsi="Times New Roman"/>
-          <w:b/>
-          <w:color w:val="000000"/>
-          <w:sz w:val="20"/>
-        </w:rPr>
-        <w:t>Under the Supervision of: Mr. Muthuraju V.</w:t>
-      </w:r>
-    </w:p>
-    <w:p>
-      <w:pPr>
-        <w:spacing w:before="0" w:after="200"/>
+        <w:spacing w:before="0" w:after="160"/>
         <w:jc w:val="center"/>
       </w:pPr>
       <w:r>
@@ -67,19 +52,13 @@
           <w:rFonts w:ascii="Times New Roman" w:hAnsi="Times New Roman"/>
           <w:i/>
           <w:color w:val="1E293B"/>
-          <w:sz w:val="19"/>
+          <w:sz w:val="17"/>
         </w:rPr>
-        <w:t>Assistant Professor, School of Computer Science and Engineering</w:t>
+        <w:t>Department of Computer Science and Engineering, School of Computer Science and Engineering</w:t>
         <w:br/>
-      </w:r>
-      <w:r>
-        <w:rPr>
-          <w:rFonts w:ascii="Times New Roman" w:hAnsi="Times New Roman"/>
-          <w:i/>
-          <w:color w:val="1E293B"/>
-          <w:sz w:val="19"/>
-        </w:rPr>
         <w:t>Presidency University, Bengaluru, India</w:t>
+        <w:br/>
+        <w:t>{akshat.singh, aahil.nouman, siddiq}@presidencyuniversity.in, muthuraju.v@presidencyuniversity.in</w:t>
       </w:r>
     </w:p>
     <w:p>
@@ -1858,7 +1837,7 @@
                 <w:color w:val="0F172A"/>
                 <w:sz w:val="15"/>
               </w:rPr>
-              <w:t>Next.js 14, React 18, Tailwind CSS, Lucide Icons</w:t>
+              <w:t>HTML5, ES6+, Tailwind CSS, Leaflet 1.9</w:t>
             </w:r>
           </w:p>
         </w:tc>
@@ -1889,7 +1868,7 @@
                 <w:color w:val="0F172A"/>
                 <w:sz w:val="15"/>
               </w:rPr>
-              <w:t>Mobile Client</w:t>
+              <w:t>Mobile Runtime</w:t>
             </w:r>
           </w:p>
         </w:tc>
@@ -1915,7 +1894,7 @@
                 <w:color w:val="0F172A"/>
                 <w:sz w:val="15"/>
               </w:rPr>
-              <w:t>React Native (Expo SDK 52), TypeScript</w:t>
+              <w:t>Capacitor 8.5 (@capacitor/android, @capacitor/geolocation)</w:t>
             </w:r>
           </w:p>
         </w:tc>
@@ -1972,7 +1951,7 @@
                 <w:color w:val="0F172A"/>
                 <w:sz w:val="15"/>
               </w:rPr>
-              <w:t>Leaflet, OpenStreetMap, Overpass API, Turf.js</w:t>
+              <w:t>Leaflet 1.9.4, OpenStreetMap, Turf.js</w:t>
             </w:r>
           </w:p>
         </w:tc>
@@ -2029,7 +2008,7 @@
                 <w:color w:val="0F172A"/>
                 <w:sz w:val="15"/>
               </w:rPr>
-              <w:t>Node.js, Express, Supabase (PostgreSQL + RLS)</w:t>
+              <w:t>Node.js 18+ LTS, Express 4.19, MySQL 8.0 (Spatial)</w:t>
             </w:r>
           </w:p>
         </w:tc>
@@ -2086,7 +2065,7 @@
                 <w:color w:val="0F172A"/>
                 <w:sz w:val="15"/>
               </w:rPr>
-              <w:t>W3C Geolocation API, Web Audio API, Web Workers</w:t>
+              <w:t>W3C Geolocation API, Web Audio API (105 dB Siren)</w:t>
             </w:r>
           </w:p>
         </w:tc>
@@ -2141,7 +2120,7 @@
                 <w:color w:val="0F172A"/>
                 <w:sz w:val="15"/>
               </w:rPr>
-              <w:t>Git, GitHub, Vitest, ESLint, VS Code</w:t>
+              <w:t>Git, GitHub, ESLint, VS Code</w:t>
             </w:r>
           </w:p>
         </w:tc>
@@ -2452,7 +2431,7 @@
           <w:color w:val="000000"/>
           <w:sz w:val="20"/>
         </w:rPr>
-        <w:t>VI. EXPECTED RESULTS AND EVALUATION PLAN</w:t>
+        <w:t>VI. EXPERIMENTAL EVALUATION AND DISCUSSION</w:t>
       </w:r>
     </w:p>
     <w:p>

</xml_diff>

<commit_message>
revert: rollback research paper to previous version
</commit_message>
<xml_diff>
--- a/SafeCity_Research_Paper.docx
+++ b/SafeCity_Research_Paper.docx
@@ -29,7 +29,7 @@
     </w:p>
     <w:p>
       <w:pPr>
-        <w:spacing w:before="40" w:after="40"/>
+        <w:spacing w:before="40" w:after="60"/>
         <w:jc w:val="center"/>
       </w:pPr>
       <w:r>
@@ -37,14 +37,29 @@
           <w:rFonts w:ascii="Times New Roman" w:hAnsi="Times New Roman"/>
           <w:b/>
           <w:color w:val="000000"/>
-          <w:sz w:val="21"/>
+          <w:sz w:val="22"/>
         </w:rPr>
-        <w:t>Akshat Singh, Mohammed Aahil Nouman, Siddiq, and Muthuraju V.</w:t>
+        <w:t>Akshat Singh, Mohammed Aahil Nouman, Siddiq</w:t>
       </w:r>
     </w:p>
     <w:p>
       <w:pPr>
-        <w:spacing w:before="0" w:after="160"/>
+        <w:spacing w:before="40" w:after="20"/>
+        <w:jc w:val="center"/>
+      </w:pPr>
+      <w:r>
+        <w:rPr>
+          <w:rFonts w:ascii="Times New Roman" w:hAnsi="Times New Roman"/>
+          <w:b/>
+          <w:color w:val="000000"/>
+          <w:sz w:val="20"/>
+        </w:rPr>
+        <w:t>Under the Supervision of: Mr. Muthuraju V.</w:t>
+      </w:r>
+    </w:p>
+    <w:p>
+      <w:pPr>
+        <w:spacing w:before="0" w:after="200"/>
         <w:jc w:val="center"/>
       </w:pPr>
       <w:r>
@@ -52,13 +67,19 @@
           <w:rFonts w:ascii="Times New Roman" w:hAnsi="Times New Roman"/>
           <w:i/>
           <w:color w:val="1E293B"/>
-          <w:sz w:val="17"/>
+          <w:sz w:val="19"/>
         </w:rPr>
-        <w:t>Department of Computer Science and Engineering, School of Computer Science and Engineering</w:t>
+        <w:t>Assistant Professor, School of Computer Science and Engineering</w:t>
         <w:br/>
+      </w:r>
+      <w:r>
+        <w:rPr>
+          <w:rFonts w:ascii="Times New Roman" w:hAnsi="Times New Roman"/>
+          <w:i/>
+          <w:color w:val="1E293B"/>
+          <w:sz w:val="19"/>
+        </w:rPr>
         <w:t>Presidency University, Bengaluru, India</w:t>
-        <w:br/>
-        <w:t>{akshat.singh, aahil.nouman, siddiq}@presidencyuniversity.in, muthuraju.v@presidencyuniversity.in</w:t>
       </w:r>
     </w:p>
     <w:p>
@@ -1837,7 +1858,7 @@
                 <w:color w:val="0F172A"/>
                 <w:sz w:val="15"/>
               </w:rPr>
-              <w:t>HTML5, ES6+, Tailwind CSS, Leaflet 1.9</w:t>
+              <w:t>Next.js 14, React 18, Tailwind CSS, Lucide Icons</w:t>
             </w:r>
           </w:p>
         </w:tc>
@@ -1868,7 +1889,7 @@
                 <w:color w:val="0F172A"/>
                 <w:sz w:val="15"/>
               </w:rPr>
-              <w:t>Mobile Runtime</w:t>
+              <w:t>Mobile Client</w:t>
             </w:r>
           </w:p>
         </w:tc>
@@ -1894,7 +1915,7 @@
                 <w:color w:val="0F172A"/>
                 <w:sz w:val="15"/>
               </w:rPr>
-              <w:t>Capacitor 8.5 (@capacitor/android, @capacitor/geolocation)</w:t>
+              <w:t>React Native (Expo SDK 52), TypeScript</w:t>
             </w:r>
           </w:p>
         </w:tc>
@@ -1951,7 +1972,7 @@
                 <w:color w:val="0F172A"/>
                 <w:sz w:val="15"/>
               </w:rPr>
-              <w:t>Leaflet 1.9.4, OpenStreetMap, Turf.js</w:t>
+              <w:t>Leaflet, OpenStreetMap, Overpass API, Turf.js</w:t>
             </w:r>
           </w:p>
         </w:tc>
@@ -2008,7 +2029,7 @@
                 <w:color w:val="0F172A"/>
                 <w:sz w:val="15"/>
               </w:rPr>
-              <w:t>Node.js 18+ LTS, Express 4.19, MySQL 8.0 (Spatial)</w:t>
+              <w:t>Node.js, Express, Supabase (PostgreSQL + RLS)</w:t>
             </w:r>
           </w:p>
         </w:tc>
@@ -2065,7 +2086,7 @@
                 <w:color w:val="0F172A"/>
                 <w:sz w:val="15"/>
               </w:rPr>
-              <w:t>W3C Geolocation API, Web Audio API (105 dB Siren)</w:t>
+              <w:t>W3C Geolocation API, Web Audio API, Web Workers</w:t>
             </w:r>
           </w:p>
         </w:tc>
@@ -2120,7 +2141,7 @@
                 <w:color w:val="0F172A"/>
                 <w:sz w:val="15"/>
               </w:rPr>
-              <w:t>Git, GitHub, ESLint, VS Code</w:t>
+              <w:t>Git, GitHub, Vitest, ESLint, VS Code</w:t>
             </w:r>
           </w:p>
         </w:tc>
@@ -2431,7 +2452,7 @@
           <w:color w:val="000000"/>
           <w:sz w:val="20"/>
         </w:rPr>
-        <w:t>VI. EXPERIMENTAL EVALUATION AND DISCUSSION</w:t>
+        <w:t>VI. EXPECTED RESULTS AND EVALUATION PLAN</w:t>
       </w:r>
     </w:p>
     <w:p>

</xml_diff>